<commit_message>
feat: group cases by phase in status flow order (UI + DOCX export)
Cases list group-by-status now sorts groups in case lifecycle order
(Signing Up → Closed). DOCX export reworked: index shows cases grouped
by phase with colored headers, detail pages have color-coded status
banners matching frontend Tailwind palette.

Co-Authored-By: Claude Opus 4.5 <noreply@anthropic.com>
</commit_message>
<xml_diff>
--- a/templates/exports/case_report_template.docx
+++ b/templates/exports/case_report_template.docx
@@ -66,17 +66,16 @@
         </w:tblBorders>
       </w:tblPr>
       <w:tblGrid>
-        <w:gridCol w:w="1728"/>
-        <w:gridCol w:w="1728"/>
-        <w:gridCol w:w="1728"/>
-        <w:gridCol w:w="1728"/>
-        <w:gridCol w:w="1728"/>
-        <w:gridCol w:w="1728"/>
+        <w:gridCol w:w="2074"/>
+        <w:gridCol w:w="2074"/>
+        <w:gridCol w:w="2074"/>
+        <w:gridCol w:w="2074"/>
+        <w:gridCol w:w="2074"/>
       </w:tblGrid>
       <w:tr>
         <w:tc>
           <w:tcPr>
-            <w:tcW w:type="dxa" w:w="1728"/>
+            <w:tcW w:type="dxa" w:w="2074"/>
             <w:shd w:fill="0F172A"/>
             <w:tcMar>
               <w:top w:w="30" w:type="dxa"/>
@@ -84,7 +83,7 @@
               <w:start w:w="50" w:type="dxa"/>
               <w:end w:w="50" w:type="dxa"/>
             </w:tcMar>
-            <w:tcW w:w="2304" w:type="dxa"/>
+            <w:tcW w:w="2880" w:type="dxa"/>
           </w:tcPr>
           <w:p>
             <w:pPr>
@@ -103,7 +102,7 @@
         </w:tc>
         <w:tc>
           <w:tcPr>
-            <w:tcW w:type="dxa" w:w="1728"/>
+            <w:tcW w:type="dxa" w:w="2074"/>
             <w:shd w:fill="0F172A"/>
             <w:tcMar>
               <w:top w:w="30" w:type="dxa"/>
@@ -111,7 +110,7 @@
               <w:start w:w="50" w:type="dxa"/>
               <w:end w:w="50" w:type="dxa"/>
             </w:tcMar>
-            <w:tcW w:w="1007" w:type="dxa"/>
+            <w:tcW w:w="1728" w:type="dxa"/>
           </w:tcPr>
           <w:p>
             <w:pPr>
@@ -124,13 +123,13 @@
                 <w:color w:val="FFFFFF"/>
                 <w:sz w:val="14"/>
               </w:rPr>
-              <w:t>Status</w:t>
+              <w:t>Case No.</w:t>
             </w:r>
           </w:p>
         </w:tc>
         <w:tc>
           <w:tcPr>
-            <w:tcW w:type="dxa" w:w="1728"/>
+            <w:tcW w:type="dxa" w:w="2074"/>
             <w:shd w:fill="0F172A"/>
             <w:tcMar>
               <w:top w:w="30" w:type="dxa"/>
@@ -151,13 +150,13 @@
                 <w:color w:val="FFFFFF"/>
                 <w:sz w:val="14"/>
               </w:rPr>
-              <w:t>Case No.</w:t>
+              <w:t>Judge</w:t>
             </w:r>
           </w:p>
         </w:tc>
         <w:tc>
           <w:tcPr>
-            <w:tcW w:type="dxa" w:w="1728"/>
+            <w:tcW w:type="dxa" w:w="2074"/>
             <w:shd w:fill="0F172A"/>
             <w:tcMar>
               <w:top w:w="30" w:type="dxa"/>
@@ -165,34 +164,7 @@
               <w:start w:w="50" w:type="dxa"/>
               <w:end w:w="50" w:type="dxa"/>
             </w:tcMar>
-            <w:tcW w:w="1440" w:type="dxa"/>
-          </w:tcPr>
-          <w:p>
-            <w:pPr>
-              <w:spacing w:before="0" w:after="0"/>
-            </w:pPr>
-            <w:r>
-              <w:rPr>
-                <w:rFonts w:ascii="Calibri" w:hAnsi="Calibri"/>
-                <w:b/>
-                <w:color w:val="FFFFFF"/>
-                <w:sz w:val="14"/>
-              </w:rPr>
-              <w:t>Judge</w:t>
-            </w:r>
-          </w:p>
-        </w:tc>
-        <w:tc>
-          <w:tcPr>
-            <w:tcW w:type="dxa" w:w="1728"/>
-            <w:shd w:fill="0F172A"/>
-            <w:tcMar>
-              <w:top w:w="30" w:type="dxa"/>
-              <w:bottom w:w="30" w:type="dxa"/>
-              <w:start w:w="50" w:type="dxa"/>
-              <w:end w:w="50" w:type="dxa"/>
-            </w:tcMar>
-            <w:tcW w:w="1872" w:type="dxa"/>
+            <w:tcW w:w="2015" w:type="dxa"/>
           </w:tcPr>
           <w:p>
             <w:pPr>
@@ -211,7 +183,7 @@
         </w:tc>
         <w:tc>
           <w:tcPr>
-            <w:tcW w:type="dxa" w:w="1728"/>
+            <w:tcW w:type="dxa" w:w="2074"/>
             <w:shd w:fill="0F172A"/>
             <w:tcMar>
               <w:top w:w="30" w:type="dxa"/>
@@ -240,7 +212,7 @@
       <w:tr>
         <w:tc>
           <w:tcPr>
-            <w:tcW w:type="dxa" w:w="1728"/>
+            <w:tcW w:type="dxa" w:w="2074"/>
           </w:tcPr>
           <w:p>
             <w:pPr>
@@ -251,13 +223,13 @@
                 <w:rFonts w:ascii="Calibri" w:hAnsi="Calibri"/>
                 <w:sz w:val="16"/>
               </w:rPr>
-              <w:t>{%tr for case in cases %}</w:t>
+              <w:t>{%tr for phase in phases %}</w:t>
             </w:r>
           </w:p>
         </w:tc>
         <w:tc>
           <w:tcPr>
-            <w:tcW w:type="dxa" w:w="1728"/>
+            <w:tcW w:type="dxa" w:w="2074"/>
           </w:tcPr>
           <w:p>
             <w:pPr>
@@ -267,7 +239,7 @@
         </w:tc>
         <w:tc>
           <w:tcPr>
-            <w:tcW w:type="dxa" w:w="1728"/>
+            <w:tcW w:type="dxa" w:w="2074"/>
           </w:tcPr>
           <w:p>
             <w:pPr>
@@ -277,7 +249,7 @@
         </w:tc>
         <w:tc>
           <w:tcPr>
-            <w:tcW w:type="dxa" w:w="1728"/>
+            <w:tcW w:type="dxa" w:w="2074"/>
           </w:tcPr>
           <w:p>
             <w:pPr>
@@ -287,17 +259,7 @@
         </w:tc>
         <w:tc>
           <w:tcPr>
-            <w:tcW w:type="dxa" w:w="1728"/>
-          </w:tcPr>
-          <w:p>
-            <w:pPr>
-              <w:spacing w:before="0" w:after="0"/>
-            </w:pPr>
-          </w:p>
-        </w:tc>
-        <w:tc>
-          <w:tcPr>
-            <w:tcW w:type="dxa" w:w="1728"/>
+            <w:tcW w:type="dxa" w:w="2074"/>
           </w:tcPr>
           <w:p>
             <w:pPr>
@@ -309,14 +271,107 @@
       <w:tr>
         <w:tc>
           <w:tcPr>
-            <w:tcW w:type="dxa" w:w="1728"/>
+            <w:tcW w:type="dxa" w:w="10370"/>
+            <w:gridSpan w:val="5"/>
+            <w:tcMar>
+              <w:top w:w="30" w:type="dxa"/>
+              <w:bottom w:w="30" w:type="dxa"/>
+              <w:start w:w="50" w:type="dxa"/>
+              <w:end w:w="50" w:type="dxa"/>
+            </w:tcMar>
+          </w:tcPr>
+          <w:p>
+            <w:pPr>
+              <w:spacing w:before="0" w:after="0"/>
+            </w:pPr>
+            <w:r>
+              <w:rPr>
+                <w:rFonts w:ascii="Calibri" w:hAnsi="Calibri"/>
+                <w:color w:val="FFFFFF"/>
+                <w:sz w:val="2"/>
+              </w:rPr>
+              <w:t>{% cellbg phase.bg %}</w:t>
+            </w:r>
+            <w:r>
+              <w:rPr>
+                <w:rFonts w:ascii="Calibri" w:hAnsi="Calibri"/>
+                <w:sz w:val="20"/>
+              </w:rPr>
+              <w:t>{{r phase.header_rt }}</w:t>
+            </w:r>
+          </w:p>
+        </w:tc>
+      </w:tr>
+      <w:tr>
+        <w:tc>
+          <w:tcPr>
+            <w:tcW w:type="dxa" w:w="2074"/>
+          </w:tcPr>
+          <w:p>
+            <w:pPr>
+              <w:spacing w:before="0" w:after="0"/>
+            </w:pPr>
+            <w:r>
+              <w:rPr>
+                <w:rFonts w:ascii="Calibri" w:hAnsi="Calibri"/>
+                <w:sz w:val="16"/>
+              </w:rPr>
+              <w:t>{%tr for case in phase.cases %}</w:t>
+            </w:r>
+          </w:p>
+        </w:tc>
+        <w:tc>
+          <w:tcPr>
+            <w:tcW w:type="dxa" w:w="2074"/>
+          </w:tcPr>
+          <w:p>
+            <w:pPr>
+              <w:spacing w:before="0" w:after="0"/>
+            </w:pPr>
+          </w:p>
+        </w:tc>
+        <w:tc>
+          <w:tcPr>
+            <w:tcW w:type="dxa" w:w="2074"/>
+          </w:tcPr>
+          <w:p>
+            <w:pPr>
+              <w:spacing w:before="0" w:after="0"/>
+            </w:pPr>
+          </w:p>
+        </w:tc>
+        <w:tc>
+          <w:tcPr>
+            <w:tcW w:type="dxa" w:w="2074"/>
+          </w:tcPr>
+          <w:p>
+            <w:pPr>
+              <w:spacing w:before="0" w:after="0"/>
+            </w:pPr>
+          </w:p>
+        </w:tc>
+        <w:tc>
+          <w:tcPr>
+            <w:tcW w:type="dxa" w:w="2074"/>
+          </w:tcPr>
+          <w:p>
+            <w:pPr>
+              <w:spacing w:before="0" w:after="0"/>
+            </w:pPr>
+          </w:p>
+        </w:tc>
+      </w:tr>
+      <w:tr>
+        <w:tc>
+          <w:tcPr>
+            <w:tcW w:type="dxa" w:w="2074"/>
             <w:tcMar>
               <w:top w:w="20" w:type="dxa"/>
               <w:bottom w:w="20" w:type="dxa"/>
               <w:start w:w="50" w:type="dxa"/>
               <w:end w:w="50" w:type="dxa"/>
             </w:tcMar>
-            <w:tcW w:w="2304" w:type="dxa"/>
+            <w:tcW w:w="2880" w:type="dxa"/>
           </w:tcPr>
           <w:p>
             <w:pPr>
@@ -334,38 +389,14 @@
         </w:tc>
         <w:tc>
           <w:tcPr>
-            <w:tcW w:type="dxa" w:w="1728"/>
+            <w:tcW w:type="dxa" w:w="2074"/>
             <w:tcMar>
               <w:top w:w="20" w:type="dxa"/>
               <w:bottom w:w="20" w:type="dxa"/>
               <w:start w:w="50" w:type="dxa"/>
               <w:end w:w="50" w:type="dxa"/>
             </w:tcMar>
-            <w:tcW w:w="1007" w:type="dxa"/>
-          </w:tcPr>
-          <w:p>
-            <w:pPr>
-              <w:spacing w:before="0" w:after="0"/>
-            </w:pPr>
-            <w:r>
-              <w:rPr>
-                <w:rFonts w:ascii="Calibri" w:hAnsi="Calibri"/>
-                <w:sz w:val="16"/>
-              </w:rPr>
-              <w:t>{{ case.status }}</w:t>
-            </w:r>
-          </w:p>
-        </w:tc>
-        <w:tc>
-          <w:tcPr>
-            <w:tcW w:type="dxa" w:w="1728"/>
-            <w:tcMar>
-              <w:top w:w="20" w:type="dxa"/>
-              <w:bottom w:w="20" w:type="dxa"/>
-              <w:start w:w="50" w:type="dxa"/>
-              <w:end w:w="50" w:type="dxa"/>
-            </w:tcMar>
-            <w:tcW w:w="1584" w:type="dxa"/>
+            <w:tcW w:w="1728" w:type="dxa"/>
           </w:tcPr>
           <w:p>
             <w:pPr>
@@ -382,14 +413,14 @@
         </w:tc>
         <w:tc>
           <w:tcPr>
-            <w:tcW w:type="dxa" w:w="1728"/>
+            <w:tcW w:type="dxa" w:w="2074"/>
             <w:tcMar>
               <w:top w:w="20" w:type="dxa"/>
               <w:bottom w:w="20" w:type="dxa"/>
               <w:start w:w="50" w:type="dxa"/>
               <w:end w:w="50" w:type="dxa"/>
             </w:tcMar>
-            <w:tcW w:w="1440" w:type="dxa"/>
+            <w:tcW w:w="1584" w:type="dxa"/>
           </w:tcPr>
           <w:p>
             <w:pPr>
@@ -406,14 +437,14 @@
         </w:tc>
         <w:tc>
           <w:tcPr>
-            <w:tcW w:type="dxa" w:w="1728"/>
+            <w:tcW w:type="dxa" w:w="2074"/>
             <w:tcMar>
               <w:top w:w="20" w:type="dxa"/>
               <w:bottom w:w="20" w:type="dxa"/>
               <w:start w:w="50" w:type="dxa"/>
               <w:end w:w="50" w:type="dxa"/>
             </w:tcMar>
-            <w:tcW w:w="1872" w:type="dxa"/>
+            <w:tcW w:w="2015" w:type="dxa"/>
           </w:tcPr>
           <w:p>
             <w:pPr>
@@ -430,7 +461,7 @@
         </w:tc>
         <w:tc>
           <w:tcPr>
-            <w:tcW w:type="dxa" w:w="1728"/>
+            <w:tcW w:type="dxa" w:w="2074"/>
             <w:tcMar>
               <w:top w:w="20" w:type="dxa"/>
               <w:bottom w:w="20" w:type="dxa"/>
@@ -456,7 +487,7 @@
       <w:tr>
         <w:tc>
           <w:tcPr>
-            <w:tcW w:type="dxa" w:w="1728"/>
+            <w:tcW w:type="dxa" w:w="2074"/>
           </w:tcPr>
           <w:p>
             <w:pPr>
@@ -473,7 +504,7 @@
         </w:tc>
         <w:tc>
           <w:tcPr>
-            <w:tcW w:type="dxa" w:w="1728"/>
+            <w:tcW w:type="dxa" w:w="2074"/>
           </w:tcPr>
           <w:p>
             <w:pPr>
@@ -483,7 +514,7 @@
         </w:tc>
         <w:tc>
           <w:tcPr>
-            <w:tcW w:type="dxa" w:w="1728"/>
+            <w:tcW w:type="dxa" w:w="2074"/>
           </w:tcPr>
           <w:p>
             <w:pPr>
@@ -493,7 +524,7 @@
         </w:tc>
         <w:tc>
           <w:tcPr>
-            <w:tcW w:type="dxa" w:w="1728"/>
+            <w:tcW w:type="dxa" w:w="2074"/>
           </w:tcPr>
           <w:p>
             <w:pPr>
@@ -503,7 +534,36 @@
         </w:tc>
         <w:tc>
           <w:tcPr>
-            <w:tcW w:type="dxa" w:w="1728"/>
+            <w:tcW w:type="dxa" w:w="2074"/>
+          </w:tcPr>
+          <w:p>
+            <w:pPr>
+              <w:spacing w:before="0" w:after="0"/>
+            </w:pPr>
+          </w:p>
+        </w:tc>
+      </w:tr>
+      <w:tr>
+        <w:tc>
+          <w:tcPr>
+            <w:tcW w:type="dxa" w:w="2074"/>
+          </w:tcPr>
+          <w:p>
+            <w:pPr>
+              <w:spacing w:before="0" w:after="0"/>
+            </w:pPr>
+            <w:r>
+              <w:rPr>
+                <w:rFonts w:ascii="Calibri" w:hAnsi="Calibri"/>
+                <w:sz w:val="16"/>
+              </w:rPr>
+              <w:t>{%tr endfor %}</w:t>
+            </w:r>
+          </w:p>
+        </w:tc>
+        <w:tc>
+          <w:tcPr>
+            <w:tcW w:type="dxa" w:w="2074"/>
           </w:tcPr>
           <w:p>
             <w:pPr>
@@ -513,7 +573,27 @@
         </w:tc>
         <w:tc>
           <w:tcPr>
-            <w:tcW w:type="dxa" w:w="1728"/>
+            <w:tcW w:type="dxa" w:w="2074"/>
+          </w:tcPr>
+          <w:p>
+            <w:pPr>
+              <w:spacing w:before="0" w:after="0"/>
+            </w:pPr>
+          </w:p>
+        </w:tc>
+        <w:tc>
+          <w:tcPr>
+            <w:tcW w:type="dxa" w:w="2074"/>
+          </w:tcPr>
+          <w:p>
+            <w:pPr>
+              <w:spacing w:before="0" w:after="0"/>
+            </w:pPr>
+          </w:p>
+        </w:tc>
+        <w:tc>
+          <w:tcPr>
+            <w:tcW w:type="dxa" w:w="2074"/>
           </w:tcPr>
           <w:p>
             <w:pPr>
@@ -533,7 +613,7 @@
           <w:color w:val="FFFFFF"/>
           <w:sz w:val="2"/>
         </w:rPr>
-        <w:t>{% for case in cases %}</w:t>
+        <w:t>{% for phase in phases %}</w:t>
       </w:r>
     </w:p>
     <w:p>
@@ -546,7 +626,7 @@
           <w:color w:val="FFFFFF"/>
           <w:sz w:val="2"/>
         </w:rPr>
-        <w:t>{% if not loop.first %}</w:t>
+        <w:t>{% for case in phase.cases %}</w:t>
       </w:r>
     </w:p>
     <w:p>
@@ -560,12 +640,65 @@
           <w:color w:val="FFFFFF"/>
           <w:sz w:val="2"/>
         </w:rPr>
-        <w:t>{% endif %}</w:t>
+        <w:t xml:space="preserve"> </w:t>
       </w:r>
     </w:p>
+    <w:tbl>
+      <w:tblPr>
+        <w:tblW w:type="auto" w:w="0"/>
+        <w:jc w:val="center"/>
+        <w:tblLayout w:type="autofit"/>
+        <w:tblLook w:firstColumn="1" w:firstRow="1" w:lastColumn="0" w:lastRow="0" w:noHBand="0" w:noVBand="1" w:val="04A0"/>
+        <w:tblBorders>
+          <w:top w:val="none" w:sz="0" w:color="auto" w:space="0"/>
+          <w:left w:val="none" w:sz="0" w:color="auto" w:space="0"/>
+          <w:bottom w:val="none" w:sz="0" w:color="auto" w:space="0"/>
+          <w:right w:val="none" w:sz="0" w:color="auto" w:space="0"/>
+          <w:insideH w:val="none" w:sz="0" w:color="auto" w:space="0"/>
+          <w:insideV w:val="none" w:sz="0" w:color="auto" w:space="0"/>
+        </w:tblBorders>
+      </w:tblPr>
+      <w:tblGrid>
+        <w:gridCol w:w="10368"/>
+      </w:tblGrid>
+      <w:tr>
+        <w:tc>
+          <w:tcPr>
+            <w:tcW w:type="dxa" w:w="10368"/>
+            <w:tcMar>
+              <w:top w:w="40" w:type="dxa"/>
+              <w:bottom w:w="40" w:type="dxa"/>
+              <w:start w:w="80" w:type="dxa"/>
+              <w:end w:w="80" w:type="dxa"/>
+            </w:tcMar>
+            <w:tcW w:w="10368" w:type="dxa"/>
+          </w:tcPr>
+          <w:p>
+            <w:pPr>
+              <w:spacing w:before="0" w:after="0"/>
+            </w:pPr>
+            <w:r>
+              <w:rPr>
+                <w:rFonts w:ascii="Calibri" w:hAnsi="Calibri"/>
+                <w:color w:val="FFFFFF"/>
+                <w:sz w:val="2"/>
+              </w:rPr>
+              <w:t>{% cellbg case.status_bg %}</w:t>
+            </w:r>
+            <w:r>
+              <w:rPr>
+                <w:rFonts w:ascii="Calibri" w:hAnsi="Calibri"/>
+                <w:sz w:val="22"/>
+              </w:rPr>
+              <w:t>{{r case.status_rt }}</w:t>
+            </w:r>
+          </w:p>
+        </w:tc>
+      </w:tr>
+    </w:tbl>
     <w:p>
       <w:pPr>
-        <w:spacing w:before="40" w:after="80"/>
+        <w:spacing w:before="80" w:after="80"/>
         <w:pBorders>
           <w:bottom w:val="single" w:sz="6" w:color="0F172A" w:space="1"/>
         </w:pBorders>
@@ -1679,6 +1812,19 @@
         <w:t>{% endfor %}</w:t>
       </w:r>
     </w:p>
+    <w:p>
+      <w:pPr>
+        <w:spacing w:before="0" w:after="0"/>
+      </w:pPr>
+      <w:r>
+        <w:rPr>
+          <w:rFonts w:ascii="Calibri" w:hAnsi="Calibri"/>
+          <w:color w:val="FFFFFF"/>
+          <w:sz w:val="2"/>
+        </w:rPr>
+        <w:t>{% endfor %}</w:t>
+      </w:r>
+    </w:p>
     <w:sectPr>
       <w:headerReference w:type="default" r:id="rId9"/>
       <w:footerReference w:type="default" r:id="rId10"/>

</xml_diff>

<commit_message>
refine DOCX layout: status chip, side-by-side timeline, tighter spacing
- Status shown as compact colored chip instead of full-width cell
- Events and tasks displayed side-by-side with white divider column
- Urgency shown visually (colored dot + bold) instead of dedicated column
- Summary moved below metadata with blue accent left border
- Tighter spacing throughout: metadata, summary, timeline sections
- Softer palette: slate-800 headers, blue-500 accent rules and borders
- Chronological event ordering (starred events stay in date order)

Co-Authored-By: Claude Opus 4.5 <noreply@anthropic.com>
</commit_message>
<xml_diff>
--- a/templates/exports/case_report_template.docx
+++ b/templates/exports/case_report_template.docx
@@ -4,17 +4,30 @@
   <w:body>
     <w:p>
       <w:pPr>
-        <w:spacing w:before="0" w:after="40"/>
+        <w:spacing w:before="0" w:after="240"/>
+      </w:pPr>
+    </w:p>
+    <w:p>
+      <w:pPr>
+        <w:spacing w:before="0" w:after="60"/>
       </w:pPr>
       <w:r>
         <w:rPr>
           <w:rFonts w:ascii="Calibri" w:hAnsi="Calibri"/>
           <w:b/>
           <w:color w:val="0F172A"/>
-          <w:sz w:val="36"/>
+          <w:sz w:val="52"/>
         </w:rPr>
         <w:t>Active Case Portfolio</w:t>
       </w:r>
+    </w:p>
+    <w:p>
+      <w:pPr>
+        <w:spacing w:before="0" w:after="80"/>
+        <w:pBorders>
+          <w:bottom w:val="single" w:sz="10" w:color="3B82F6" w:space="1"/>
+        </w:pBorders>
+      </w:pPr>
     </w:p>
     <w:p>
       <w:pPr>
@@ -23,32 +36,40 @@
       <w:r>
         <w:rPr>
           <w:rFonts w:ascii="Calibri" w:hAnsi="Calibri"/>
+          <w:color w:val="0F172A"/>
+          <w:sz w:val="22"/>
+        </w:rPr>
+        <w:t>{{ attorney_name }}</w:t>
+      </w:r>
+      <w:r>
+        <w:rPr>
+          <w:rFonts w:ascii="Calibri" w:hAnsi="Calibri"/>
           <w:color w:val="94A3B8"/>
-          <w:sz w:val="18"/>
+          <w:sz w:val="22"/>
         </w:rPr>
-        <w:t>{{ attorney_name }} — {{ creation_date }}</w:t>
+        <w:t xml:space="preserve">  |  </w:t>
+      </w:r>
+      <w:r>
+        <w:rPr>
+          <w:rFonts w:ascii="Calibri" w:hAnsi="Calibri"/>
+          <w:color w:val="475569"/>
+          <w:sz w:val="22"/>
+        </w:rPr>
+        <w:t>{{ creation_date }}</w:t>
       </w:r>
     </w:p>
     <w:p>
       <w:pPr>
-        <w:spacing w:before="0" w:after="80"/>
+        <w:spacing w:before="0" w:after="200"/>
       </w:pPr>
       <w:r>
         <w:rPr>
           <w:rFonts w:ascii="Calibri" w:hAnsi="Calibri"/>
           <w:color w:val="94A3B8"/>
-          <w:sz w:val="16"/>
+          <w:sz w:val="18"/>
         </w:rPr>
         <w:t>{{ case_count }} active matters</w:t>
       </w:r>
-    </w:p>
-    <w:p>
-      <w:pPr>
-        <w:spacing w:before="0" w:after="120"/>
-        <w:pBorders>
-          <w:bottom w:val="single" w:sz="8" w:color="0F172A" w:space="1"/>
-        </w:pBorders>
-      </w:pPr>
     </w:p>
     <w:tbl>
       <w:tblPr>
@@ -57,12 +78,12 @@
         <w:tblLayout w:type="autofit"/>
         <w:tblLook w:firstColumn="1" w:firstRow="1" w:lastColumn="0" w:lastRow="0" w:noHBand="0" w:noVBand="1" w:val="04A0"/>
         <w:tblBorders>
-          <w:top w:val="single" w:sz="2" w:color="E2E8F0" w:space="0"/>
-          <w:left w:val="single" w:sz="2" w:color="E2E8F0" w:space="0"/>
-          <w:bottom w:val="single" w:sz="2" w:color="E2E8F0" w:space="0"/>
-          <w:right w:val="single" w:sz="2" w:color="E2E8F0" w:space="0"/>
-          <w:insideH w:val="single" w:sz="2" w:color="E2E8F0" w:space="0"/>
-          <w:insideV w:val="single" w:sz="2" w:color="E2E8F0" w:space="0"/>
+          <w:top w:val="single" w:sz="2" w:color="CBD5E1" w:space="0"/>
+          <w:left w:val="single" w:sz="2" w:color="CBD5E1" w:space="0"/>
+          <w:bottom w:val="single" w:sz="2" w:color="CBD5E1" w:space="0"/>
+          <w:right w:val="single" w:sz="2" w:color="CBD5E1" w:space="0"/>
+          <w:insideH w:val="single" w:sz="2" w:color="CBD5E1" w:space="0"/>
+          <w:insideV w:val="single" w:sz="2" w:color="CBD5E1" w:space="0"/>
         </w:tblBorders>
       </w:tblPr>
       <w:tblGrid>
@@ -76,12 +97,12 @@
         <w:tc>
           <w:tcPr>
             <w:tcW w:type="dxa" w:w="2074"/>
-            <w:shd w:fill="0F172A"/>
+            <w:shd w:fill="1E293B"/>
             <w:tcMar>
-              <w:top w:w="30" w:type="dxa"/>
-              <w:bottom w:w="30" w:type="dxa"/>
-              <w:start w:w="50" w:type="dxa"/>
-              <w:end w:w="50" w:type="dxa"/>
+              <w:top w:w="35" w:type="dxa"/>
+              <w:bottom w:w="35" w:type="dxa"/>
+              <w:start w:w="55" w:type="dxa"/>
+              <w:end w:w="55" w:type="dxa"/>
             </w:tcMar>
             <w:tcW w:w="2880" w:type="dxa"/>
           </w:tcPr>
@@ -103,12 +124,12 @@
         <w:tc>
           <w:tcPr>
             <w:tcW w:type="dxa" w:w="2074"/>
-            <w:shd w:fill="0F172A"/>
+            <w:shd w:fill="1E293B"/>
             <w:tcMar>
-              <w:top w:w="30" w:type="dxa"/>
-              <w:bottom w:w="30" w:type="dxa"/>
-              <w:start w:w="50" w:type="dxa"/>
-              <w:end w:w="50" w:type="dxa"/>
+              <w:top w:w="35" w:type="dxa"/>
+              <w:bottom w:w="35" w:type="dxa"/>
+              <w:start w:w="55" w:type="dxa"/>
+              <w:end w:w="55" w:type="dxa"/>
             </w:tcMar>
             <w:tcW w:w="1728" w:type="dxa"/>
           </w:tcPr>
@@ -130,12 +151,12 @@
         <w:tc>
           <w:tcPr>
             <w:tcW w:type="dxa" w:w="2074"/>
-            <w:shd w:fill="0F172A"/>
+            <w:shd w:fill="1E293B"/>
             <w:tcMar>
-              <w:top w:w="30" w:type="dxa"/>
-              <w:bottom w:w="30" w:type="dxa"/>
-              <w:start w:w="50" w:type="dxa"/>
-              <w:end w:w="50" w:type="dxa"/>
+              <w:top w:w="35" w:type="dxa"/>
+              <w:bottom w:w="35" w:type="dxa"/>
+              <w:start w:w="55" w:type="dxa"/>
+              <w:end w:w="55" w:type="dxa"/>
             </w:tcMar>
             <w:tcW w:w="1584" w:type="dxa"/>
           </w:tcPr>
@@ -157,12 +178,12 @@
         <w:tc>
           <w:tcPr>
             <w:tcW w:type="dxa" w:w="2074"/>
-            <w:shd w:fill="0F172A"/>
+            <w:shd w:fill="1E293B"/>
             <w:tcMar>
-              <w:top w:w="30" w:type="dxa"/>
-              <w:bottom w:w="30" w:type="dxa"/>
-              <w:start w:w="50" w:type="dxa"/>
-              <w:end w:w="50" w:type="dxa"/>
+              <w:top w:w="35" w:type="dxa"/>
+              <w:bottom w:w="35" w:type="dxa"/>
+              <w:start w:w="55" w:type="dxa"/>
+              <w:end w:w="55" w:type="dxa"/>
             </w:tcMar>
             <w:tcW w:w="2015" w:type="dxa"/>
           </w:tcPr>
@@ -184,12 +205,12 @@
         <w:tc>
           <w:tcPr>
             <w:tcW w:type="dxa" w:w="2074"/>
-            <w:shd w:fill="0F172A"/>
+            <w:shd w:fill="1E293B"/>
             <w:tcMar>
-              <w:top w:w="30" w:type="dxa"/>
-              <w:bottom w:w="30" w:type="dxa"/>
-              <w:start w:w="50" w:type="dxa"/>
-              <w:end w:w="50" w:type="dxa"/>
+              <w:top w:w="35" w:type="dxa"/>
+              <w:bottom w:w="35" w:type="dxa"/>
+              <w:start w:w="55" w:type="dxa"/>
+              <w:end w:w="55" w:type="dxa"/>
             </w:tcMar>
             <w:tcW w:w="1296" w:type="dxa"/>
           </w:tcPr>
@@ -276,8 +297,8 @@
             <w:tcMar>
               <w:top w:w="30" w:type="dxa"/>
               <w:bottom w:w="30" w:type="dxa"/>
-              <w:start w:w="50" w:type="dxa"/>
-              <w:end w:w="50" w:type="dxa"/>
+              <w:start w:w="55" w:type="dxa"/>
+              <w:end w:w="55" w:type="dxa"/>
             </w:tcMar>
           </w:tcPr>
           <w:p>
@@ -366,10 +387,10 @@
           <w:tcPr>
             <w:tcW w:type="dxa" w:w="2074"/>
             <w:tcMar>
-              <w:top w:w="20" w:type="dxa"/>
-              <w:bottom w:w="20" w:type="dxa"/>
-              <w:start w:w="50" w:type="dxa"/>
-              <w:end w:w="50" w:type="dxa"/>
+              <w:top w:w="25" w:type="dxa"/>
+              <w:bottom w:w="25" w:type="dxa"/>
+              <w:start w:w="55" w:type="dxa"/>
+              <w:end w:w="55" w:type="dxa"/>
             </w:tcMar>
             <w:tcW w:w="2880" w:type="dxa"/>
           </w:tcPr>
@@ -391,10 +412,10 @@
           <w:tcPr>
             <w:tcW w:type="dxa" w:w="2074"/>
             <w:tcMar>
-              <w:top w:w="20" w:type="dxa"/>
-              <w:bottom w:w="20" w:type="dxa"/>
-              <w:start w:w="50" w:type="dxa"/>
-              <w:end w:w="50" w:type="dxa"/>
+              <w:top w:w="25" w:type="dxa"/>
+              <w:bottom w:w="25" w:type="dxa"/>
+              <w:start w:w="55" w:type="dxa"/>
+              <w:end w:w="55" w:type="dxa"/>
             </w:tcMar>
             <w:tcW w:w="1728" w:type="dxa"/>
           </w:tcPr>
@@ -415,10 +436,10 @@
           <w:tcPr>
             <w:tcW w:type="dxa" w:w="2074"/>
             <w:tcMar>
-              <w:top w:w="20" w:type="dxa"/>
-              <w:bottom w:w="20" w:type="dxa"/>
-              <w:start w:w="50" w:type="dxa"/>
-              <w:end w:w="50" w:type="dxa"/>
+              <w:top w:w="25" w:type="dxa"/>
+              <w:bottom w:w="25" w:type="dxa"/>
+              <w:start w:w="55" w:type="dxa"/>
+              <w:end w:w="55" w:type="dxa"/>
             </w:tcMar>
             <w:tcW w:w="1584" w:type="dxa"/>
           </w:tcPr>
@@ -439,10 +460,10 @@
           <w:tcPr>
             <w:tcW w:type="dxa" w:w="2074"/>
             <w:tcMar>
-              <w:top w:w="20" w:type="dxa"/>
-              <w:bottom w:w="20" w:type="dxa"/>
-              <w:start w:w="50" w:type="dxa"/>
-              <w:end w:w="50" w:type="dxa"/>
+              <w:top w:w="25" w:type="dxa"/>
+              <w:bottom w:w="25" w:type="dxa"/>
+              <w:start w:w="55" w:type="dxa"/>
+              <w:end w:w="55" w:type="dxa"/>
             </w:tcMar>
             <w:tcW w:w="2015" w:type="dxa"/>
           </w:tcPr>
@@ -463,10 +484,10 @@
           <w:tcPr>
             <w:tcW w:type="dxa" w:w="2074"/>
             <w:tcMar>
-              <w:top w:w="20" w:type="dxa"/>
-              <w:bottom w:w="20" w:type="dxa"/>
-              <w:start w:w="50" w:type="dxa"/>
-              <w:end w:w="50" w:type="dxa"/>
+              <w:top w:w="25" w:type="dxa"/>
+              <w:bottom w:w="25" w:type="dxa"/>
+              <w:start w:w="55" w:type="dxa"/>
+              <w:end w:w="55" w:type="dxa"/>
             </w:tcMar>
             <w:tcW w:w="1296" w:type="dxa"/>
           </w:tcPr>
@@ -659,23 +680,73 @@
         </w:tblBorders>
       </w:tblPr>
       <w:tblGrid>
-        <w:gridCol w:w="10368"/>
+        <w:gridCol w:w="3456"/>
+        <w:gridCol w:w="3456"/>
+        <w:gridCol w:w="3456"/>
       </w:tblGrid>
       <w:tr>
         <w:tc>
           <w:tcPr>
-            <w:tcW w:type="dxa" w:w="10368"/>
+            <w:tcW w:type="dxa" w:w="3456"/>
+            <w:tcW w:w="7488" w:type="dxa"/>
             <w:tcMar>
-              <w:top w:w="40" w:type="dxa"/>
-              <w:bottom w:w="40" w:type="dxa"/>
-              <w:start w:w="80" w:type="dxa"/>
-              <w:end w:w="80" w:type="dxa"/>
+              <w:top w:w="0" w:type="dxa"/>
+              <w:bottom w:w="8" w:type="dxa"/>
+              <w:start w:w="0" w:type="dxa"/>
+              <w:end w:w="0" w:type="dxa"/>
             </w:tcMar>
-            <w:tcW w:w="10368" w:type="dxa"/>
           </w:tcPr>
           <w:p>
             <w:pPr>
               <w:spacing w:before="0" w:after="0"/>
+            </w:pPr>
+            <w:r>
+              <w:rPr>
+                <w:rFonts w:ascii="Calibri" w:hAnsi="Calibri"/>
+                <w:sz w:val="28"/>
+              </w:rPr>
+              <w:t>{{r case.title_rt }}</w:t>
+            </w:r>
+          </w:p>
+        </w:tc>
+        <w:tc>
+          <w:tcPr>
+            <w:tcW w:type="dxa" w:w="3456"/>
+            <w:tcW w:w="576" w:type="dxa"/>
+            <w:tcMar>
+              <w:top w:w="0" w:type="dxa"/>
+              <w:bottom w:w="0" w:type="dxa"/>
+              <w:start w:w="0" w:type="dxa"/>
+              <w:end w:w="0" w:type="dxa"/>
+            </w:tcMar>
+          </w:tcPr>
+          <w:p>
+            <w:pPr>
+              <w:spacing w:before="0" w:after="0"/>
+            </w:pPr>
+          </w:p>
+        </w:tc>
+        <w:tc>
+          <w:tcPr>
+            <w:tcW w:type="dxa" w:w="3456"/>
+            <w:tcW w:w="2304" w:type="dxa"/>
+            <w:tcMar>
+              <w:top w:w="40" w:type="dxa"/>
+              <w:bottom w:w="10" w:type="dxa"/>
+              <w:start w:w="50" w:type="dxa"/>
+              <w:end w:w="50" w:type="dxa"/>
+            </w:tcMar>
+            <w:tcBorders>
+              <w:top w:val="single" w:sz="4" w:color="E2E8F0" w:space="0"/>
+              <w:bottom w:val="single" w:sz="4" w:color="E2E8F0" w:space="0"/>
+              <w:left w:val="single" w:sz="4" w:color="E2E8F0" w:space="0"/>
+              <w:right w:val="single" w:sz="4" w:color="E2E8F0" w:space="0"/>
+            </w:tcBorders>
+          </w:tcPr>
+          <w:p>
+            <w:pPr>
+              <w:spacing w:before="0" w:after="0"/>
+              <w:jc w:val="center"/>
             </w:pPr>
             <w:r>
               <w:rPr>
@@ -688,7 +759,7 @@
             <w:r>
               <w:rPr>
                 <w:rFonts w:ascii="Calibri" w:hAnsi="Calibri"/>
-                <w:sz w:val="22"/>
+                <w:sz w:val="20"/>
               </w:rPr>
               <w:t>{{r case.status_rt }}</w:t>
             </w:r>
@@ -698,18 +769,11 @@
     </w:tbl>
     <w:p>
       <w:pPr>
-        <w:spacing w:before="80" w:after="80"/>
+        <w:spacing w:before="0" w:after="0"/>
         <w:pBorders>
-          <w:bottom w:val="single" w:sz="6" w:color="0F172A" w:space="1"/>
+          <w:bottom w:val="single" w:sz="6" w:color="3B82F6" w:space="1"/>
         </w:pBorders>
       </w:pPr>
-      <w:r>
-        <w:rPr>
-          <w:rFonts w:ascii="Calibri" w:hAnsi="Calibri"/>
-          <w:sz w:val="28"/>
-        </w:rPr>
-        <w:t>{{r case.title_rt }}</w:t>
-      </w:r>
     </w:p>
     <w:tbl>
       <w:tblPr>
@@ -718,12 +782,12 @@
         <w:tblLayout w:type="autofit"/>
         <w:tblLook w:firstColumn="1" w:firstRow="1" w:lastColumn="0" w:lastRow="0" w:noHBand="0" w:noVBand="1" w:val="04A0"/>
         <w:tblBorders>
-          <w:top w:val="single" w:sz="2" w:color="E2E8F0" w:space="0"/>
-          <w:left w:val="single" w:sz="2" w:color="E2E8F0" w:space="0"/>
-          <w:bottom w:val="single" w:sz="2" w:color="E2E8F0" w:space="0"/>
-          <w:right w:val="single" w:sz="2" w:color="E2E8F0" w:space="0"/>
-          <w:insideH w:val="single" w:sz="2" w:color="E2E8F0" w:space="0"/>
-          <w:insideV w:val="single" w:sz="2" w:color="E2E8F0" w:space="0"/>
+          <w:top w:val="single" w:sz="2" w:color="CBD5E1" w:space="0"/>
+          <w:left w:val="single" w:sz="2" w:color="CBD5E1" w:space="0"/>
+          <w:bottom w:val="single" w:sz="2" w:color="CBD5E1" w:space="0"/>
+          <w:right w:val="single" w:sz="2" w:color="CBD5E1" w:space="0"/>
+          <w:insideH w:val="single" w:sz="2" w:color="CBD5E1" w:space="0"/>
+          <w:insideV w:val="single" w:sz="2" w:color="CBD5E1" w:space="0"/>
         </w:tblBorders>
       </w:tblPr>
       <w:tblGrid>
@@ -737,23 +801,23 @@
             <w:tcW w:type="dxa" w:w="3456"/>
             <w:shd w:fill="F8FAFC"/>
             <w:tcMar>
-              <w:top w:w="30" w:type="dxa"/>
-              <w:bottom w:w="30" w:type="dxa"/>
-              <w:start w:w="60" w:type="dxa"/>
-              <w:end w:w="60" w:type="dxa"/>
+              <w:top w:w="20" w:type="dxa"/>
+              <w:bottom w:w="20" w:type="dxa"/>
+              <w:start w:w="55" w:type="dxa"/>
+              <w:end w:w="55" w:type="dxa"/>
             </w:tcMar>
-            <w:tcW w:w="3211" w:type="dxa"/>
+            <w:tcW w:w="3456" w:type="dxa"/>
           </w:tcPr>
           <w:p>
             <w:pPr>
-              <w:spacing w:before="0" w:after="20"/>
+              <w:spacing w:before="0" w:after="0"/>
             </w:pPr>
             <w:r>
               <w:rPr>
                 <w:rFonts w:ascii="Calibri" w:hAnsi="Calibri"/>
                 <w:b/>
                 <w:color w:val="94A3B8"/>
-                <w:sz w:val="13"/>
+                <w:sz w:val="12"/>
               </w:rPr>
               <w:t>CASE NO.</w:t>
             </w:r>
@@ -765,7 +829,7 @@
             <w:r>
               <w:rPr>
                 <w:rFonts w:ascii="Consolas" w:hAnsi="Consolas"/>
-                <w:sz w:val="18"/>
+                <w:sz w:val="17"/>
               </w:rPr>
               <w:t>{{ case.case_number }}</w:t>
             </w:r>
@@ -776,23 +840,23 @@
             <w:tcW w:type="dxa" w:w="3456"/>
             <w:shd w:fill="F8FAFC"/>
             <w:tcMar>
-              <w:top w:w="30" w:type="dxa"/>
-              <w:bottom w:w="30" w:type="dxa"/>
-              <w:start w:w="60" w:type="dxa"/>
-              <w:end w:w="60" w:type="dxa"/>
+              <w:top w:w="20" w:type="dxa"/>
+              <w:bottom w:w="20" w:type="dxa"/>
+              <w:start w:w="55" w:type="dxa"/>
+              <w:end w:w="55" w:type="dxa"/>
             </w:tcMar>
-            <w:tcW w:w="3211" w:type="dxa"/>
+            <w:tcW w:w="3456" w:type="dxa"/>
           </w:tcPr>
           <w:p>
             <w:pPr>
-              <w:spacing w:before="0" w:after="20"/>
+              <w:spacing w:before="0" w:after="0"/>
             </w:pPr>
             <w:r>
               <w:rPr>
                 <w:rFonts w:ascii="Calibri" w:hAnsi="Calibri"/>
                 <w:b/>
                 <w:color w:val="94A3B8"/>
-                <w:sz w:val="13"/>
+                <w:sz w:val="12"/>
               </w:rPr>
               <w:t>JUDGE</w:t>
             </w:r>
@@ -804,7 +868,7 @@
             <w:r>
               <w:rPr>
                 <w:rFonts w:ascii="Calibri" w:hAnsi="Calibri"/>
-                <w:sz w:val="18"/>
+                <w:sz w:val="17"/>
               </w:rPr>
               <w:t>{{ case.judge }}</w:t>
             </w:r>
@@ -815,23 +879,23 @@
             <w:tcW w:type="dxa" w:w="3456"/>
             <w:shd w:fill="F8FAFC"/>
             <w:tcMar>
-              <w:top w:w="30" w:type="dxa"/>
-              <w:bottom w:w="30" w:type="dxa"/>
-              <w:start w:w="60" w:type="dxa"/>
-              <w:end w:w="60" w:type="dxa"/>
+              <w:top w:w="20" w:type="dxa"/>
+              <w:bottom w:w="20" w:type="dxa"/>
+              <w:start w:w="55" w:type="dxa"/>
+              <w:end w:w="55" w:type="dxa"/>
             </w:tcMar>
-            <w:tcW w:w="3211" w:type="dxa"/>
+            <w:tcW w:w="3456" w:type="dxa"/>
           </w:tcPr>
           <w:p>
             <w:pPr>
-              <w:spacing w:before="0" w:after="20"/>
+              <w:spacing w:before="0" w:after="0"/>
             </w:pPr>
             <w:r>
               <w:rPr>
                 <w:rFonts w:ascii="Calibri" w:hAnsi="Calibri"/>
                 <w:b/>
                 <w:color w:val="94A3B8"/>
-                <w:sz w:val="13"/>
+                <w:sz w:val="12"/>
               </w:rPr>
               <w:t>DATE OF INJURY</w:t>
             </w:r>
@@ -843,7 +907,7 @@
             <w:r>
               <w:rPr>
                 <w:rFonts w:ascii="Calibri" w:hAnsi="Calibri"/>
-                <w:sz w:val="18"/>
+                <w:sz w:val="17"/>
               </w:rPr>
               <w:t>{{ case.doi }}</w:t>
             </w:r>
@@ -856,23 +920,23 @@
             <w:tcW w:type="dxa" w:w="3456"/>
             <w:shd w:fill="F8FAFC"/>
             <w:tcMar>
-              <w:top w:w="30" w:type="dxa"/>
-              <w:bottom w:w="30" w:type="dxa"/>
-              <w:start w:w="60" w:type="dxa"/>
-              <w:end w:w="60" w:type="dxa"/>
+              <w:top w:w="20" w:type="dxa"/>
+              <w:bottom w:w="20" w:type="dxa"/>
+              <w:start w:w="55" w:type="dxa"/>
+              <w:end w:w="55" w:type="dxa"/>
             </w:tcMar>
-            <w:tcW w:w="3211" w:type="dxa"/>
+            <w:tcW w:w="3456" w:type="dxa"/>
           </w:tcPr>
           <w:p>
             <w:pPr>
-              <w:spacing w:before="0" w:after="20"/>
+              <w:spacing w:before="0" w:after="0"/>
             </w:pPr>
             <w:r>
               <w:rPr>
                 <w:rFonts w:ascii="Calibri" w:hAnsi="Calibri"/>
                 <w:b/>
                 <w:color w:val="94A3B8"/>
-                <w:sz w:val="13"/>
+                <w:sz w:val="12"/>
               </w:rPr>
               <w:t>JURISDICTION</w:t>
             </w:r>
@@ -884,7 +948,7 @@
             <w:r>
               <w:rPr>
                 <w:rFonts w:ascii="Calibri" w:hAnsi="Calibri"/>
-                <w:sz w:val="18"/>
+                <w:sz w:val="17"/>
               </w:rPr>
               <w:t>{{ case.jurisdiction }}</w:t>
             </w:r>
@@ -895,23 +959,23 @@
             <w:tcW w:type="dxa" w:w="3456"/>
             <w:shd w:fill="F8FAFC"/>
             <w:tcMar>
-              <w:top w:w="30" w:type="dxa"/>
-              <w:bottom w:w="30" w:type="dxa"/>
-              <w:start w:w="60" w:type="dxa"/>
-              <w:end w:w="60" w:type="dxa"/>
+              <w:top w:w="20" w:type="dxa"/>
+              <w:bottom w:w="20" w:type="dxa"/>
+              <w:start w:w="55" w:type="dxa"/>
+              <w:end w:w="55" w:type="dxa"/>
             </w:tcMar>
-            <w:tcW w:w="3211" w:type="dxa"/>
+            <w:tcW w:w="3456" w:type="dxa"/>
           </w:tcPr>
           <w:p>
             <w:pPr>
-              <w:spacing w:before="0" w:after="20"/>
+              <w:spacing w:before="0" w:after="0"/>
             </w:pPr>
             <w:r>
               <w:rPr>
                 <w:rFonts w:ascii="Calibri" w:hAnsi="Calibri"/>
                 <w:b/>
                 <w:color w:val="94A3B8"/>
-                <w:sz w:val="13"/>
+                <w:sz w:val="12"/>
               </w:rPr>
               <w:t>OPP. COUNSEL</w:t>
             </w:r>
@@ -923,7 +987,7 @@
             <w:r>
               <w:rPr>
                 <w:rFonts w:ascii="Calibri" w:hAnsi="Calibri"/>
-                <w:sz w:val="18"/>
+                <w:sz w:val="17"/>
               </w:rPr>
               <w:t>{{ case.opp_counsel }}</w:t>
             </w:r>
@@ -934,23 +998,23 @@
             <w:tcW w:type="dxa" w:w="3456"/>
             <w:shd w:fill="F8FAFC"/>
             <w:tcMar>
-              <w:top w:w="30" w:type="dxa"/>
-              <w:bottom w:w="30" w:type="dxa"/>
-              <w:start w:w="60" w:type="dxa"/>
-              <w:end w:w="60" w:type="dxa"/>
+              <w:top w:w="20" w:type="dxa"/>
+              <w:bottom w:w="20" w:type="dxa"/>
+              <w:start w:w="55" w:type="dxa"/>
+              <w:end w:w="55" w:type="dxa"/>
             </w:tcMar>
-            <w:tcW w:w="3211" w:type="dxa"/>
+            <w:tcW w:w="3456" w:type="dxa"/>
           </w:tcPr>
           <w:p>
             <w:pPr>
-              <w:spacing w:before="0" w:after="20"/>
+              <w:spacing w:before="0" w:after="0"/>
             </w:pPr>
             <w:r>
               <w:rPr>
                 <w:rFonts w:ascii="Calibri" w:hAnsi="Calibri"/>
                 <w:b/>
                 <w:color w:val="94A3B8"/>
-                <w:sz w:val="13"/>
+                <w:sz w:val="12"/>
               </w:rPr>
               <w:t>CLIENTS</w:t>
             </w:r>
@@ -962,7 +1026,7 @@
             <w:r>
               <w:rPr>
                 <w:rFonts w:ascii="Calibri" w:hAnsi="Calibri"/>
-                <w:sz w:val="18"/>
+                <w:sz w:val="17"/>
               </w:rPr>
               <w:t>{{ case.clients }}</w:t>
             </w:r>
@@ -970,53 +1034,6 @@
         </w:tc>
       </w:tr>
     </w:tbl>
-    <w:p>
-      <w:pPr>
-        <w:spacing w:before="80" w:after="40"/>
-      </w:pPr>
-      <w:r>
-        <w:rPr>
-          <w:rFonts w:ascii="Calibri" w:hAnsi="Calibri"/>
-          <w:color w:val="FFFFFF"/>
-          <w:sz w:val="2"/>
-        </w:rPr>
-        <w:t>{% if case.other_proceedings %}</w:t>
-      </w:r>
-    </w:p>
-    <w:p>
-      <w:pPr>
-        <w:spacing w:before="0" w:after="80"/>
-      </w:pPr>
-      <w:r>
-        <w:rPr>
-          <w:rFonts w:ascii="Calibri" w:hAnsi="Calibri"/>
-          <w:b/>
-          <w:color w:val="475569"/>
-          <w:sz w:val="16"/>
-        </w:rPr>
-        <w:t xml:space="preserve">Other Proceedings: </w:t>
-      </w:r>
-      <w:r>
-        <w:rPr>
-          <w:rFonts w:ascii="Consolas" w:hAnsi="Consolas"/>
-          <w:sz w:val="16"/>
-        </w:rPr>
-        <w:t>{{ case.other_proceedings }}</w:t>
-      </w:r>
-    </w:p>
-    <w:p>
-      <w:pPr>
-        <w:spacing w:before="0" w:after="0"/>
-      </w:pPr>
-      <w:r>
-        <w:rPr>
-          <w:rFonts w:ascii="Calibri" w:hAnsi="Calibri"/>
-          <w:color w:val="FFFFFF"/>
-          <w:sz w:val="2"/>
-        </w:rPr>
-        <w:t>{% endif %}</w:t>
-      </w:r>
-    </w:p>
     <w:p>
       <w:pPr>
         <w:spacing w:before="0" w:after="0"/>
@@ -1032,10 +1049,11 @@
     </w:p>
     <w:p>
       <w:pPr>
-        <w:spacing w:before="40" w:after="120"/>
+        <w:spacing w:before="40" w:after="60"/>
         <w:pBorders>
-          <w:left w:val="single" w:sz="12" w:color="4771FF" w:space="4"/>
+          <w:left w:val="single" w:sz="14" w:color="3B82F6" w:space="6"/>
         </w:pBorders>
+        <w:ind w:left="120"/>
       </w:pPr>
       <w:r>
         <w:rPr>
@@ -1070,24 +1088,55 @@
           <w:color w:val="FFFFFF"/>
           <w:sz w:val="2"/>
         </w:rPr>
-        <w:t>{% if case.has_events %}</w:t>
+        <w:t>{% if case.other_proceedings %}</w:t>
       </w:r>
     </w:p>
     <w:p>
       <w:pPr>
-        <w:spacing w:before="120" w:after="60"/>
-        <w:pBorders>
-          <w:bottom w:val="single" w:sz="2" w:color="E2E8F0" w:space="1"/>
-        </w:pBorders>
+        <w:spacing w:before="20" w:after="20"/>
       </w:pPr>
       <w:r>
         <w:rPr>
           <w:rFonts w:ascii="Calibri" w:hAnsi="Calibri"/>
           <w:b/>
+          <w:color w:val="0F172A"/>
+          <w:sz w:val="15"/>
+        </w:rPr>
+        <w:t xml:space="preserve">Other Proceedings: </w:t>
+      </w:r>
+      <w:r>
+        <w:rPr>
+          <w:rFonts w:ascii="Consolas" w:hAnsi="Consolas"/>
           <w:color w:val="475569"/>
-          <w:sz w:val="18"/>
+          <w:sz w:val="15"/>
         </w:rPr>
-        <w:t>KEY DATES &amp; EVENTS</w:t>
+        <w:t>{{ case.other_proceedings }}</w:t>
+      </w:r>
+    </w:p>
+    <w:p>
+      <w:pPr>
+        <w:spacing w:before="0" w:after="0"/>
+      </w:pPr>
+      <w:r>
+        <w:rPr>
+          <w:rFonts w:ascii="Calibri" w:hAnsi="Calibri"/>
+          <w:color w:val="FFFFFF"/>
+          <w:sz w:val="2"/>
+        </w:rPr>
+        <w:t>{% endif %}</w:t>
+      </w:r>
+    </w:p>
+    <w:p>
+      <w:pPr>
+        <w:spacing w:before="40" w:after="0"/>
+      </w:pPr>
+      <w:r>
+        <w:rPr>
+          <w:rFonts w:ascii="Calibri" w:hAnsi="Calibri"/>
+          <w:color w:val="FFFFFF"/>
+          <w:sz w:val="2"/>
+        </w:rPr>
+        <w:t>{% if case.has_timeline %}</w:t>
       </w:r>
     </w:p>
     <w:tbl>
@@ -1097,31 +1146,33 @@
         <w:tblLayout w:type="autofit"/>
         <w:tblLook w:firstColumn="1" w:firstRow="1" w:lastColumn="0" w:lastRow="0" w:noHBand="0" w:noVBand="1" w:val="04A0"/>
         <w:tblBorders>
-          <w:top w:val="single" w:sz="2" w:color="E2E8F0" w:space="0"/>
-          <w:left w:val="single" w:sz="2" w:color="E2E8F0" w:space="0"/>
-          <w:bottom w:val="single" w:sz="2" w:color="E2E8F0" w:space="0"/>
-          <w:right w:val="single" w:sz="2" w:color="E2E8F0" w:space="0"/>
-          <w:insideH w:val="single" w:sz="2" w:color="E2E8F0" w:space="0"/>
-          <w:insideV w:val="single" w:sz="2" w:color="E2E8F0" w:space="0"/>
+          <w:top w:val="single" w:sz="2" w:color="CBD5E1" w:space="0"/>
+          <w:left w:val="single" w:sz="2" w:color="CBD5E1" w:space="0"/>
+          <w:bottom w:val="single" w:sz="2" w:color="CBD5E1" w:space="0"/>
+          <w:right w:val="single" w:sz="2" w:color="CBD5E1" w:space="0"/>
+          <w:insideH w:val="single" w:sz="2" w:color="CBD5E1" w:space="0"/>
+          <w:insideV w:val="single" w:sz="2" w:color="CBD5E1" w:space="0"/>
         </w:tblBorders>
       </w:tblPr>
       <w:tblGrid>
-        <w:gridCol w:w="3456"/>
-        <w:gridCol w:w="3456"/>
-        <w:gridCol w:w="3456"/>
+        <w:gridCol w:w="2074"/>
+        <w:gridCol w:w="2074"/>
+        <w:gridCol w:w="2074"/>
+        <w:gridCol w:w="2074"/>
+        <w:gridCol w:w="2074"/>
       </w:tblGrid>
       <w:tr>
         <w:tc>
           <w:tcPr>
-            <w:tcW w:type="dxa" w:w="3456"/>
-            <w:shd w:fill="0F172A"/>
+            <w:tcW w:type="dxa" w:w="4148"/>
+            <w:gridSpan w:val="2"/>
+            <w:shd w:fill="1E293B"/>
             <w:tcMar>
-              <w:top w:w="25" w:type="dxa"/>
-              <w:bottom w:w="25" w:type="dxa"/>
+              <w:top w:w="22" w:type="dxa"/>
+              <w:bottom w:w="22" w:type="dxa"/>
               <w:start w:w="50" w:type="dxa"/>
               <w:end w:w="50" w:type="dxa"/>
             </w:tcMar>
-            <w:tcW w:w="2160" w:type="dxa"/>
           </w:tcPr>
           <w:p>
             <w:pPr>
@@ -1134,21 +1185,39 @@
                 <w:color w:val="FFFFFF"/>
                 <w:sz w:val="14"/>
               </w:rPr>
-              <w:t>Date</w:t>
+              <w:t>KEY DATES &amp; EVENTS</w:t>
             </w:r>
           </w:p>
         </w:tc>
         <w:tc>
           <w:tcPr>
-            <w:tcW w:type="dxa" w:w="3456"/>
-            <w:shd w:fill="0F172A"/>
+            <w:tcW w:type="dxa" w:w="2074"/>
+            <w:shd w:fill="FFFFFF"/>
+            <w:tcW w:w="144" w:type="dxa"/>
             <w:tcMar>
-              <w:top w:w="25" w:type="dxa"/>
-              <w:bottom w:w="25" w:type="dxa"/>
+              <w:top w:w="0" w:type="dxa"/>
+              <w:bottom w:w="0" w:type="dxa"/>
+              <w:start w:w="0" w:type="dxa"/>
+              <w:end w:w="0" w:type="dxa"/>
+            </w:tcMar>
+          </w:tcPr>
+          <w:p>
+            <w:pPr>
+              <w:spacing w:before="0" w:after="0"/>
+            </w:pPr>
+          </w:p>
+        </w:tc>
+        <w:tc>
+          <w:tcPr>
+            <w:tcW w:type="dxa" w:w="4148"/>
+            <w:gridSpan w:val="2"/>
+            <w:shd w:fill="1E293B"/>
+            <w:tcMar>
+              <w:top w:w="22" w:type="dxa"/>
+              <w:bottom w:w="22" w:type="dxa"/>
               <w:start w:w="50" w:type="dxa"/>
               <w:end w:w="50" w:type="dxa"/>
             </w:tcMar>
-            <w:tcW w:w="5040" w:type="dxa"/>
           </w:tcPr>
           <w:p>
             <w:pPr>
@@ -1161,21 +1230,23 @@
                 <w:color w:val="FFFFFF"/>
                 <w:sz w:val="14"/>
               </w:rPr>
-              <w:t>Description</w:t>
+              <w:t>OPEN TASKS</w:t>
             </w:r>
           </w:p>
         </w:tc>
+      </w:tr>
+      <w:tr>
         <w:tc>
           <w:tcPr>
-            <w:tcW w:type="dxa" w:w="3456"/>
-            <w:shd w:fill="0F172A"/>
+            <w:tcW w:type="dxa" w:w="2074"/>
+            <w:shd w:fill="F8FAFC"/>
             <w:tcMar>
-              <w:top w:w="25" w:type="dxa"/>
-              <w:bottom w:w="25" w:type="dxa"/>
+              <w:top w:w="16" w:type="dxa"/>
+              <w:bottom w:w="16" w:type="dxa"/>
               <w:start w:w="50" w:type="dxa"/>
               <w:end w:w="50" w:type="dxa"/>
             </w:tcMar>
-            <w:tcW w:w="2304" w:type="dxa"/>
+            <w:tcW w:w="1728" w:type="dxa"/>
           </w:tcPr>
           <w:p>
             <w:pPr>
@@ -1185,10 +1256,109 @@
               <w:rPr>
                 <w:rFonts w:ascii="Calibri" w:hAnsi="Calibri"/>
                 <w:b/>
-                <w:color w:val="FFFFFF"/>
-                <w:sz w:val="14"/>
+                <w:color w:val="94A3B8"/>
+                <w:sz w:val="12"/>
               </w:rPr>
-              <w:t>Location</w:t>
+              <w:t>Date</w:t>
+            </w:r>
+          </w:p>
+        </w:tc>
+        <w:tc>
+          <w:tcPr>
+            <w:tcW w:type="dxa" w:w="2074"/>
+            <w:shd w:fill="F8FAFC"/>
+            <w:tcMar>
+              <w:top w:w="16" w:type="dxa"/>
+              <w:bottom w:w="16" w:type="dxa"/>
+              <w:start w:w="50" w:type="dxa"/>
+              <w:end w:w="50" w:type="dxa"/>
+            </w:tcMar>
+            <w:tcW w:w="3384" w:type="dxa"/>
+          </w:tcPr>
+          <w:p>
+            <w:pPr>
+              <w:spacing w:before="0" w:after="0"/>
+            </w:pPr>
+            <w:r>
+              <w:rPr>
+                <w:rFonts w:ascii="Calibri" w:hAnsi="Calibri"/>
+                <w:b/>
+                <w:color w:val="94A3B8"/>
+                <w:sz w:val="12"/>
+              </w:rPr>
+              <w:t>Description</w:t>
+            </w:r>
+          </w:p>
+        </w:tc>
+        <w:tc>
+          <w:tcPr>
+            <w:tcW w:type="dxa" w:w="2074"/>
+            <w:shd w:fill="FFFFFF"/>
+            <w:tcW w:w="144" w:type="dxa"/>
+            <w:tcMar>
+              <w:top w:w="0" w:type="dxa"/>
+              <w:bottom w:w="0" w:type="dxa"/>
+              <w:start w:w="0" w:type="dxa"/>
+              <w:end w:w="0" w:type="dxa"/>
+            </w:tcMar>
+          </w:tcPr>
+          <w:p>
+            <w:pPr>
+              <w:spacing w:before="0" w:after="0"/>
+            </w:pPr>
+          </w:p>
+        </w:tc>
+        <w:tc>
+          <w:tcPr>
+            <w:tcW w:type="dxa" w:w="2074"/>
+            <w:shd w:fill="F8FAFC"/>
+            <w:tcMar>
+              <w:top w:w="16" w:type="dxa"/>
+              <w:bottom w:w="16" w:type="dxa"/>
+              <w:start w:w="50" w:type="dxa"/>
+              <w:end w:w="50" w:type="dxa"/>
+            </w:tcMar>
+            <w:tcW w:w="1440" w:type="dxa"/>
+          </w:tcPr>
+          <w:p>
+            <w:pPr>
+              <w:spacing w:before="0" w:after="0"/>
+            </w:pPr>
+            <w:r>
+              <w:rPr>
+                <w:rFonts w:ascii="Calibri" w:hAnsi="Calibri"/>
+                <w:b/>
+                <w:color w:val="94A3B8"/>
+                <w:sz w:val="12"/>
+              </w:rPr>
+              <w:t>Due</w:t>
+            </w:r>
+          </w:p>
+        </w:tc>
+        <w:tc>
+          <w:tcPr>
+            <w:tcW w:type="dxa" w:w="2074"/>
+            <w:shd w:fill="F8FAFC"/>
+            <w:tcMar>
+              <w:top w:w="16" w:type="dxa"/>
+              <w:bottom w:w="16" w:type="dxa"/>
+              <w:start w:w="50" w:type="dxa"/>
+              <w:end w:w="50" w:type="dxa"/>
+            </w:tcMar>
+            <w:tcW w:w="3671" w:type="dxa"/>
+          </w:tcPr>
+          <w:p>
+            <w:pPr>
+              <w:spacing w:before="0" w:after="0"/>
+            </w:pPr>
+            <w:r>
+              <w:rPr>
+                <w:rFonts w:ascii="Calibri" w:hAnsi="Calibri"/>
+                <w:b/>
+                <w:color w:val="94A3B8"/>
+                <w:sz w:val="12"/>
+              </w:rPr>
+              <w:t>Description</w:t>
             </w:r>
           </w:p>
         </w:tc>
@@ -1196,7 +1366,7 @@
       <w:tr>
         <w:tc>
           <w:tcPr>
-            <w:tcW w:type="dxa" w:w="3456"/>
+            <w:tcW w:type="dxa" w:w="2074"/>
           </w:tcPr>
           <w:p>
             <w:pPr>
@@ -1207,13 +1377,13 @@
                 <w:rFonts w:ascii="Calibri" w:hAnsi="Calibri"/>
                 <w:sz w:val="16"/>
               </w:rPr>
-              <w:t>{%tr for event in case.events %}</w:t>
+              <w:t>{%tr for item in case.timeline %}</w:t>
             </w:r>
           </w:p>
         </w:tc>
         <w:tc>
           <w:tcPr>
-            <w:tcW w:type="dxa" w:w="3456"/>
+            <w:tcW w:type="dxa" w:w="2074"/>
           </w:tcPr>
           <w:p>
             <w:pPr>
@@ -1223,7 +1393,27 @@
         </w:tc>
         <w:tc>
           <w:tcPr>
-            <w:tcW w:type="dxa" w:w="3456"/>
+            <w:tcW w:type="dxa" w:w="2074"/>
+          </w:tcPr>
+          <w:p>
+            <w:pPr>
+              <w:spacing w:before="0" w:after="0"/>
+            </w:pPr>
+          </w:p>
+        </w:tc>
+        <w:tc>
+          <w:tcPr>
+            <w:tcW w:type="dxa" w:w="2074"/>
+          </w:tcPr>
+          <w:p>
+            <w:pPr>
+              <w:spacing w:before="0" w:after="0"/>
+            </w:pPr>
+          </w:p>
+        </w:tc>
+        <w:tc>
+          <w:tcPr>
+            <w:tcW w:type="dxa" w:w="2074"/>
           </w:tcPr>
           <w:p>
             <w:pPr>
@@ -1235,14 +1425,14 @@
       <w:tr>
         <w:tc>
           <w:tcPr>
-            <w:tcW w:type="dxa" w:w="3456"/>
+            <w:tcW w:type="dxa" w:w="2074"/>
+            <w:tcW w:w="1728" w:type="dxa"/>
             <w:tcMar>
-              <w:top w:w="15" w:type="dxa"/>
-              <w:bottom w:w="15" w:type="dxa"/>
+              <w:top w:w="12" w:type="dxa"/>
+              <w:bottom w:w="12" w:type="dxa"/>
               <w:start w:w="50" w:type="dxa"/>
               <w:end w:w="50" w:type="dxa"/>
             </w:tcMar>
-            <w:tcW w:w="2160" w:type="dxa"/>
           </w:tcPr>
           <w:p>
             <w:pPr>
@@ -1251,29 +1441,30 @@
             <w:r>
               <w:rPr>
                 <w:rFonts w:ascii="Calibri" w:hAnsi="Calibri"/>
-                <w:sz w:val="16"/>
+                <w:color w:val="FFFFFF"/>
+                <w:sz w:val="2"/>
               </w:rPr>
-              <w:t>{% cellbg event.bg %}</w:t>
+              <w:t>{% cellbg item.bg %}</w:t>
             </w:r>
             <w:r>
               <w:rPr>
                 <w:rFonts w:ascii="Calibri" w:hAnsi="Calibri"/>
                 <w:sz w:val="16"/>
               </w:rPr>
-              <w:t>{{r event.date_rt }}</w:t>
+              <w:t>{{r item.ev_date }}</w:t>
             </w:r>
           </w:p>
         </w:tc>
         <w:tc>
           <w:tcPr>
-            <w:tcW w:type="dxa" w:w="3456"/>
+            <w:tcW w:type="dxa" w:w="2074"/>
+            <w:tcW w:w="3384" w:type="dxa"/>
             <w:tcMar>
-              <w:top w:w="15" w:type="dxa"/>
-              <w:bottom w:w="15" w:type="dxa"/>
+              <w:top w:w="12" w:type="dxa"/>
+              <w:bottom w:w="12" w:type="dxa"/>
               <w:start w:w="50" w:type="dxa"/>
               <w:end w:w="50" w:type="dxa"/>
             </w:tcMar>
-            <w:tcW w:w="5040" w:type="dxa"/>
           </w:tcPr>
           <w:p>
             <w:pPr>
@@ -1282,29 +1473,48 @@
             <w:r>
               <w:rPr>
                 <w:rFonts w:ascii="Calibri" w:hAnsi="Calibri"/>
-                <w:sz w:val="16"/>
+                <w:color w:val="FFFFFF"/>
+                <w:sz w:val="2"/>
               </w:rPr>
-              <w:t>{% cellbg event.bg %}</w:t>
+              <w:t>{% cellbg item.bg %}</w:t>
             </w:r>
             <w:r>
               <w:rPr>
                 <w:rFonts w:ascii="Calibri" w:hAnsi="Calibri"/>
                 <w:sz w:val="16"/>
               </w:rPr>
-              <w:t>{{r event.desc_rt }}</w:t>
+              <w:t>{{r item.ev_desc }}</w:t>
             </w:r>
           </w:p>
         </w:tc>
         <w:tc>
           <w:tcPr>
-            <w:tcW w:type="dxa" w:w="3456"/>
+            <w:tcW w:type="dxa" w:w="2074"/>
+            <w:tcW w:w="144" w:type="dxa"/>
             <w:tcMar>
-              <w:top w:w="15" w:type="dxa"/>
-              <w:bottom w:w="15" w:type="dxa"/>
+              <w:top w:w="0" w:type="dxa"/>
+              <w:bottom w:w="0" w:type="dxa"/>
+              <w:start w:w="0" w:type="dxa"/>
+              <w:end w:w="0" w:type="dxa"/>
+            </w:tcMar>
+            <w:shd w:fill="FFFFFF"/>
+          </w:tcPr>
+          <w:p>
+            <w:pPr>
+              <w:spacing w:before="0" w:after="0"/>
+            </w:pPr>
+          </w:p>
+        </w:tc>
+        <w:tc>
+          <w:tcPr>
+            <w:tcW w:type="dxa" w:w="2074"/>
+            <w:tcW w:w="1440" w:type="dxa"/>
+            <w:tcMar>
+              <w:top w:w="12" w:type="dxa"/>
+              <w:bottom w:w="12" w:type="dxa"/>
               <w:start w:w="50" w:type="dxa"/>
               <w:end w:w="50" w:type="dxa"/>
             </w:tcMar>
-            <w:tcW w:w="2304" w:type="dxa"/>
           </w:tcPr>
           <w:p>
             <w:pPr>
@@ -1313,16 +1523,49 @@
             <w:r>
               <w:rPr>
                 <w:rFonts w:ascii="Calibri" w:hAnsi="Calibri"/>
-                <w:sz w:val="16"/>
+                <w:color w:val="FFFFFF"/>
+                <w:sz w:val="2"/>
               </w:rPr>
-              <w:t>{% cellbg event.bg %}</w:t>
+              <w:t>{% cellbg item.bg %}</w:t>
             </w:r>
             <w:r>
               <w:rPr>
                 <w:rFonts w:ascii="Calibri" w:hAnsi="Calibri"/>
                 <w:sz w:val="16"/>
               </w:rPr>
-              <w:t>{{r event.loc_rt }}</w:t>
+              <w:t>{{r item.tk_date }}</w:t>
+            </w:r>
+          </w:p>
+        </w:tc>
+        <w:tc>
+          <w:tcPr>
+            <w:tcW w:type="dxa" w:w="2074"/>
+            <w:tcW w:w="3671" w:type="dxa"/>
+            <w:tcMar>
+              <w:top w:w="12" w:type="dxa"/>
+              <w:bottom w:w="12" w:type="dxa"/>
+              <w:start w:w="50" w:type="dxa"/>
+              <w:end w:w="50" w:type="dxa"/>
+            </w:tcMar>
+          </w:tcPr>
+          <w:p>
+            <w:pPr>
+              <w:spacing w:before="0" w:after="0"/>
+            </w:pPr>
+            <w:r>
+              <w:rPr>
+                <w:rFonts w:ascii="Calibri" w:hAnsi="Calibri"/>
+                <w:color w:val="FFFFFF"/>
+                <w:sz w:val="2"/>
+              </w:rPr>
+              <w:t>{% cellbg item.bg %}</w:t>
+            </w:r>
+            <w:r>
+              <w:rPr>
+                <w:rFonts w:ascii="Calibri" w:hAnsi="Calibri"/>
+                <w:sz w:val="16"/>
+              </w:rPr>
+              <w:t>{{r item.tk_desc }}</w:t>
             </w:r>
           </w:p>
         </w:tc>
@@ -1330,7 +1573,7 @@
       <w:tr>
         <w:tc>
           <w:tcPr>
-            <w:tcW w:type="dxa" w:w="3456"/>
+            <w:tcW w:type="dxa" w:w="2074"/>
           </w:tcPr>
           <w:p>
             <w:pPr>
@@ -1347,7 +1590,7 @@
         </w:tc>
         <w:tc>
           <w:tcPr>
-            <w:tcW w:type="dxa" w:w="3456"/>
+            <w:tcW w:type="dxa" w:w="2074"/>
           </w:tcPr>
           <w:p>
             <w:pPr>
@@ -1357,183 +1600,7 @@
         </w:tc>
         <w:tc>
           <w:tcPr>
-            <w:tcW w:type="dxa" w:w="3456"/>
-          </w:tcPr>
-          <w:p>
-            <w:pPr>
-              <w:spacing w:before="0" w:after="0"/>
-            </w:pPr>
-          </w:p>
-        </w:tc>
-      </w:tr>
-    </w:tbl>
-    <w:p>
-      <w:pPr>
-        <w:spacing w:before="0" w:after="0"/>
-      </w:pPr>
-      <w:r>
-        <w:rPr>
-          <w:rFonts w:ascii="Calibri" w:hAnsi="Calibri"/>
-          <w:color w:val="FFFFFF"/>
-          <w:sz w:val="2"/>
-        </w:rPr>
-        <w:t>{% endif %}</w:t>
-      </w:r>
-    </w:p>
-    <w:p>
-      <w:pPr>
-        <w:spacing w:before="0" w:after="0"/>
-      </w:pPr>
-      <w:r>
-        <w:rPr>
-          <w:rFonts w:ascii="Calibri" w:hAnsi="Calibri"/>
-          <w:color w:val="FFFFFF"/>
-          <w:sz w:val="2"/>
-        </w:rPr>
-        <w:t>{% if case.has_tasks %}</w:t>
-      </w:r>
-    </w:p>
-    <w:p>
-      <w:pPr>
-        <w:spacing w:before="120" w:after="60"/>
-        <w:pBorders>
-          <w:bottom w:val="single" w:sz="2" w:color="E2E8F0" w:space="1"/>
-        </w:pBorders>
-      </w:pPr>
-      <w:r>
-        <w:rPr>
-          <w:rFonts w:ascii="Calibri" w:hAnsi="Calibri"/>
-          <w:b/>
-          <w:color w:val="475569"/>
-          <w:sz w:val="18"/>
-        </w:rPr>
-        <w:t>OPEN TASKS</w:t>
-      </w:r>
-    </w:p>
-    <w:tbl>
-      <w:tblPr>
-        <w:tblW w:type="auto" w:w="0"/>
-        <w:jc w:val="center"/>
-        <w:tblLayout w:type="autofit"/>
-        <w:tblLook w:firstColumn="1" w:firstRow="1" w:lastColumn="0" w:lastRow="0" w:noHBand="0" w:noVBand="1" w:val="04A0"/>
-        <w:tblBorders>
-          <w:top w:val="single" w:sz="2" w:color="E2E8F0" w:space="0"/>
-          <w:left w:val="single" w:sz="2" w:color="E2E8F0" w:space="0"/>
-          <w:bottom w:val="single" w:sz="2" w:color="E2E8F0" w:space="0"/>
-          <w:right w:val="single" w:sz="2" w:color="E2E8F0" w:space="0"/>
-          <w:insideH w:val="single" w:sz="2" w:color="E2E8F0" w:space="0"/>
-          <w:insideV w:val="single" w:sz="2" w:color="E2E8F0" w:space="0"/>
-        </w:tblBorders>
-      </w:tblPr>
-      <w:tblGrid>
-        <w:gridCol w:w="3456"/>
-        <w:gridCol w:w="3456"/>
-        <w:gridCol w:w="3456"/>
-      </w:tblGrid>
-      <w:tr>
-        <w:tc>
-          <w:tcPr>
-            <w:tcW w:type="dxa" w:w="3456"/>
-            <w:shd w:fill="0F172A"/>
-            <w:tcMar>
-              <w:top w:w="25" w:type="dxa"/>
-              <w:bottom w:w="25" w:type="dxa"/>
-              <w:start w:w="50" w:type="dxa"/>
-              <w:end w:w="50" w:type="dxa"/>
-            </w:tcMar>
-            <w:tcW w:w="2160" w:type="dxa"/>
-          </w:tcPr>
-          <w:p>
-            <w:pPr>
-              <w:spacing w:before="0" w:after="0"/>
-            </w:pPr>
-            <w:r>
-              <w:rPr>
-                <w:rFonts w:ascii="Calibri" w:hAnsi="Calibri"/>
-                <w:b/>
-                <w:color w:val="FFFFFF"/>
-                <w:sz w:val="14"/>
-              </w:rPr>
-              <w:t>Due Date</w:t>
-            </w:r>
-          </w:p>
-        </w:tc>
-        <w:tc>
-          <w:tcPr>
-            <w:tcW w:type="dxa" w:w="3456"/>
-            <w:shd w:fill="0F172A"/>
-            <w:tcMar>
-              <w:top w:w="25" w:type="dxa"/>
-              <w:bottom w:w="25" w:type="dxa"/>
-              <w:start w:w="50" w:type="dxa"/>
-              <w:end w:w="50" w:type="dxa"/>
-            </w:tcMar>
-            <w:tcW w:w="5472" w:type="dxa"/>
-          </w:tcPr>
-          <w:p>
-            <w:pPr>
-              <w:spacing w:before="0" w:after="0"/>
-            </w:pPr>
-            <w:r>
-              <w:rPr>
-                <w:rFonts w:ascii="Calibri" w:hAnsi="Calibri"/>
-                <w:b/>
-                <w:color w:val="FFFFFF"/>
-                <w:sz w:val="14"/>
-              </w:rPr>
-              <w:t>Description</w:t>
-            </w:r>
-          </w:p>
-        </w:tc>
-        <w:tc>
-          <w:tcPr>
-            <w:tcW w:type="dxa" w:w="3456"/>
-            <w:shd w:fill="0F172A"/>
-            <w:tcMar>
-              <w:top w:w="25" w:type="dxa"/>
-              <w:bottom w:w="25" w:type="dxa"/>
-              <w:start w:w="50" w:type="dxa"/>
-              <w:end w:w="50" w:type="dxa"/>
-            </w:tcMar>
-            <w:tcW w:w="1872" w:type="dxa"/>
-          </w:tcPr>
-          <w:p>
-            <w:pPr>
-              <w:spacing w:before="0" w:after="0"/>
-            </w:pPr>
-            <w:r>
-              <w:rPr>
-                <w:rFonts w:ascii="Calibri" w:hAnsi="Calibri"/>
-                <w:b/>
-                <w:color w:val="FFFFFF"/>
-                <w:sz w:val="14"/>
-              </w:rPr>
-              <w:t>Urgency</w:t>
-            </w:r>
-          </w:p>
-        </w:tc>
-      </w:tr>
-      <w:tr>
-        <w:tc>
-          <w:tcPr>
-            <w:tcW w:type="dxa" w:w="3456"/>
-          </w:tcPr>
-          <w:p>
-            <w:pPr>
-              <w:spacing w:before="0" w:after="0"/>
-            </w:pPr>
-            <w:r>
-              <w:rPr>
-                <w:rFonts w:ascii="Calibri" w:hAnsi="Calibri"/>
-                <w:sz w:val="16"/>
-              </w:rPr>
-              <w:t>{%tr for task in case.tasks %}</w:t>
-            </w:r>
-          </w:p>
-        </w:tc>
-        <w:tc>
-          <w:tcPr>
-            <w:tcW w:type="dxa" w:w="3456"/>
+            <w:tcW w:type="dxa" w:w="2074"/>
           </w:tcPr>
           <w:p>
             <w:pPr>
@@ -1543,131 +1610,7 @@
         </w:tc>
         <w:tc>
           <w:tcPr>
-            <w:tcW w:type="dxa" w:w="3456"/>
-          </w:tcPr>
-          <w:p>
-            <w:pPr>
-              <w:spacing w:before="0" w:after="0"/>
-            </w:pPr>
-          </w:p>
-        </w:tc>
-      </w:tr>
-      <w:tr>
-        <w:tc>
-          <w:tcPr>
-            <w:tcW w:type="dxa" w:w="3456"/>
-            <w:tcMar>
-              <w:top w:w="15" w:type="dxa"/>
-              <w:bottom w:w="15" w:type="dxa"/>
-              <w:start w:w="50" w:type="dxa"/>
-              <w:end w:w="50" w:type="dxa"/>
-            </w:tcMar>
-            <w:tcW w:w="2160" w:type="dxa"/>
-          </w:tcPr>
-          <w:p>
-            <w:pPr>
-              <w:spacing w:before="0" w:after="0"/>
-            </w:pPr>
-            <w:r>
-              <w:rPr>
-                <w:rFonts w:ascii="Calibri" w:hAnsi="Calibri"/>
-                <w:sz w:val="16"/>
-              </w:rPr>
-              <w:t>{% cellbg task.bg %}</w:t>
-            </w:r>
-            <w:r>
-              <w:rPr>
-                <w:rFonts w:ascii="Calibri" w:hAnsi="Calibri"/>
-                <w:sz w:val="16"/>
-              </w:rPr>
-              <w:t>{{r task.date_rt }}</w:t>
-            </w:r>
-          </w:p>
-        </w:tc>
-        <w:tc>
-          <w:tcPr>
-            <w:tcW w:type="dxa" w:w="3456"/>
-            <w:tcMar>
-              <w:top w:w="15" w:type="dxa"/>
-              <w:bottom w:w="15" w:type="dxa"/>
-              <w:start w:w="50" w:type="dxa"/>
-              <w:end w:w="50" w:type="dxa"/>
-            </w:tcMar>
-            <w:tcW w:w="5472" w:type="dxa"/>
-          </w:tcPr>
-          <w:p>
-            <w:pPr>
-              <w:spacing w:before="0" w:after="0"/>
-            </w:pPr>
-            <w:r>
-              <w:rPr>
-                <w:rFonts w:ascii="Calibri" w:hAnsi="Calibri"/>
-                <w:sz w:val="16"/>
-              </w:rPr>
-              <w:t>{% cellbg task.bg %}</w:t>
-            </w:r>
-            <w:r>
-              <w:rPr>
-                <w:rFonts w:ascii="Calibri" w:hAnsi="Calibri"/>
-                <w:sz w:val="16"/>
-              </w:rPr>
-              <w:t>{{r task.desc_rt }}</w:t>
-            </w:r>
-          </w:p>
-        </w:tc>
-        <w:tc>
-          <w:tcPr>
-            <w:tcW w:type="dxa" w:w="3456"/>
-            <w:tcMar>
-              <w:top w:w="15" w:type="dxa"/>
-              <w:bottom w:w="15" w:type="dxa"/>
-              <w:start w:w="50" w:type="dxa"/>
-              <w:end w:w="50" w:type="dxa"/>
-            </w:tcMar>
-            <w:tcW w:w="1872" w:type="dxa"/>
-          </w:tcPr>
-          <w:p>
-            <w:pPr>
-              <w:spacing w:before="0" w:after="0"/>
-            </w:pPr>
-            <w:r>
-              <w:rPr>
-                <w:rFonts w:ascii="Calibri" w:hAnsi="Calibri"/>
-                <w:sz w:val="16"/>
-              </w:rPr>
-              <w:t>{% cellbg task.bg %}</w:t>
-            </w:r>
-            <w:r>
-              <w:rPr>
-                <w:rFonts w:ascii="Calibri" w:hAnsi="Calibri"/>
-                <w:sz w:val="16"/>
-              </w:rPr>
-              <w:t>{{r task.urgency_rt }}</w:t>
-            </w:r>
-          </w:p>
-        </w:tc>
-      </w:tr>
-      <w:tr>
-        <w:tc>
-          <w:tcPr>
-            <w:tcW w:type="dxa" w:w="3456"/>
-          </w:tcPr>
-          <w:p>
-            <w:pPr>
-              <w:spacing w:before="0" w:after="0"/>
-            </w:pPr>
-            <w:r>
-              <w:rPr>
-                <w:rFonts w:ascii="Calibri" w:hAnsi="Calibri"/>
-                <w:sz w:val="16"/>
-              </w:rPr>
-              <w:t>{%tr endfor %}</w:t>
-            </w:r>
-          </w:p>
-        </w:tc>
-        <w:tc>
-          <w:tcPr>
-            <w:tcW w:type="dxa" w:w="3456"/>
+            <w:tcW w:type="dxa" w:w="2074"/>
           </w:tcPr>
           <w:p>
             <w:pPr>
@@ -1677,7 +1620,7 @@
         </w:tc>
         <w:tc>
           <w:tcPr>
-            <w:tcW w:type="dxa" w:w="3456"/>
+            <w:tcW w:type="dxa" w:w="2074"/>
           </w:tcPr>
           <w:p>
             <w:pPr>
@@ -1715,16 +1658,16 @@
     </w:p>
     <w:p>
       <w:pPr>
-        <w:spacing w:before="120" w:after="60"/>
+        <w:spacing w:before="160" w:after="80"/>
         <w:pBorders>
-          <w:bottom w:val="single" w:sz="2" w:color="E2E8F0" w:space="1"/>
+          <w:bottom w:val="single" w:sz="4" w:color="3B82F6" w:space="1"/>
         </w:pBorders>
       </w:pPr>
       <w:r>
         <w:rPr>
           <w:rFonts w:ascii="Calibri" w:hAnsi="Calibri"/>
           <w:b/>
-          <w:color w:val="475569"/>
+          <w:color w:val="0F172A"/>
           <w:sz w:val="18"/>
         </w:rPr>
         <w:t>RECENT NOTES</w:t>
@@ -1745,7 +1688,7 @@
     </w:p>
     <w:p>
       <w:pPr>
-        <w:spacing w:before="40" w:after="20"/>
+        <w:spacing w:before="40" w:after="0"/>
       </w:pPr>
       <w:r>
         <w:rPr>
@@ -1759,9 +1702,9 @@
     </w:p>
     <w:p>
       <w:pPr>
-        <w:spacing w:before="0" w:after="60"/>
+        <w:spacing w:before="0" w:after="40"/>
         <w:pBorders>
-          <w:left w:val="single" w:sz="8" w:color="E2E8F0" w:space="4"/>
+          <w:left w:val="single" w:sz="10" w:color="3B82F6" w:space="6"/>
         </w:pBorders>
       </w:pPr>
       <w:r>
@@ -1868,10 +1811,27 @@
     <w:r>
       <w:rPr>
         <w:rFonts w:ascii="Calibri" w:hAnsi="Calibri"/>
+        <w:b/>
+        <w:color w:val="475569"/>
+        <w:sz w:val="15"/>
+      </w:rPr>
+      <w:t>{{ attorney_name }}</w:t>
+    </w:r>
+    <w:r>
+      <w:rPr>
+        <w:rFonts w:ascii="Calibri" w:hAnsi="Calibri"/>
         <w:color w:val="94A3B8"/>
-        <w:sz w:val="14"/>
-      </w:rPr>
-      <w:t>{{ creation_date }} — {{ attorney_name }}'s Case Portfolio</w:t>
+        <w:sz w:val="15"/>
+      </w:rPr>
+      <w:t xml:space="preserve">  |  </w:t>
+    </w:r>
+    <w:r>
+      <w:rPr>
+        <w:rFonts w:ascii="Calibri" w:hAnsi="Calibri"/>
+        <w:color w:val="94A3B8"/>
+        <w:sz w:val="15"/>
+      </w:rPr>
+      <w:t>{{ creation_date }}</w:t>
     </w:r>
   </w:p>
 </w:hdr>

</xml_diff>

<commit_message>
style: lighten DOCX template to match web UI aesthetic
Replace heavy dark table headers with light slate-50 backgrounds and dark
text, remove grey cell fills from metadata grid, use thinner slate-200
borders throughout, and eliminate phantom spacing from Jinja conditional
paragraphs with zero-height helper.

Co-Authored-By: Claude Opus 4.5 <noreply@anthropic.com>
</commit_message>
<xml_diff>
--- a/templates/exports/case_report_template.docx
+++ b/templates/exports/case_report_template.docx
@@ -78,12 +78,12 @@
         <w:tblLayout w:type="autofit"/>
         <w:tblLook w:firstColumn="1" w:firstRow="1" w:lastColumn="0" w:lastRow="0" w:noHBand="0" w:noVBand="1" w:val="04A0"/>
         <w:tblBorders>
-          <w:top w:val="single" w:sz="2" w:color="CBD5E1" w:space="0"/>
-          <w:left w:val="single" w:sz="2" w:color="CBD5E1" w:space="0"/>
-          <w:bottom w:val="single" w:sz="2" w:color="CBD5E1" w:space="0"/>
-          <w:right w:val="single" w:sz="2" w:color="CBD5E1" w:space="0"/>
-          <w:insideH w:val="single" w:sz="2" w:color="CBD5E1" w:space="0"/>
-          <w:insideV w:val="single" w:sz="2" w:color="CBD5E1" w:space="0"/>
+          <w:top w:val="single" w:sz="2" w:color="E2E8F0" w:space="0"/>
+          <w:left w:val="single" w:sz="2" w:color="E2E8F0" w:space="0"/>
+          <w:bottom w:val="single" w:sz="2" w:color="E2E8F0" w:space="0"/>
+          <w:right w:val="single" w:sz="2" w:color="E2E8F0" w:space="0"/>
+          <w:insideH w:val="single" w:sz="2" w:color="E2E8F0" w:space="0"/>
+          <w:insideV w:val="single" w:sz="2" w:color="E2E8F0" w:space="0"/>
         </w:tblBorders>
       </w:tblPr>
       <w:tblGrid>
@@ -97,14 +97,17 @@
         <w:tc>
           <w:tcPr>
             <w:tcW w:type="dxa" w:w="2074"/>
-            <w:shd w:fill="1E293B"/>
+            <w:shd w:fill="F8FAFC"/>
             <w:tcMar>
-              <w:top w:w="35" w:type="dxa"/>
-              <w:bottom w:w="35" w:type="dxa"/>
+              <w:top w:w="28" w:type="dxa"/>
+              <w:bottom w:w="28" w:type="dxa"/>
               <w:start w:w="55" w:type="dxa"/>
               <w:end w:w="55" w:type="dxa"/>
             </w:tcMar>
             <w:tcW w:w="2880" w:type="dxa"/>
+            <w:tcBorders>
+              <w:bottom w:val="single" w:sz="4" w:color="CBD5E1" w:space="0"/>
+            </w:tcBorders>
           </w:tcPr>
           <w:p>
             <w:pPr>
@@ -114,8 +117,8 @@
               <w:rPr>
                 <w:rFonts w:ascii="Calibri" w:hAnsi="Calibri"/>
                 <w:b/>
-                <w:color w:val="FFFFFF"/>
-                <w:sz w:val="14"/>
+                <w:color w:val="475569"/>
+                <w:sz w:val="13"/>
               </w:rPr>
               <w:t>Case</w:t>
             </w:r>
@@ -124,14 +127,17 @@
         <w:tc>
           <w:tcPr>
             <w:tcW w:type="dxa" w:w="2074"/>
-            <w:shd w:fill="1E293B"/>
+            <w:shd w:fill="F8FAFC"/>
             <w:tcMar>
-              <w:top w:w="35" w:type="dxa"/>
-              <w:bottom w:w="35" w:type="dxa"/>
+              <w:top w:w="28" w:type="dxa"/>
+              <w:bottom w:w="28" w:type="dxa"/>
               <w:start w:w="55" w:type="dxa"/>
               <w:end w:w="55" w:type="dxa"/>
             </w:tcMar>
             <w:tcW w:w="1728" w:type="dxa"/>
+            <w:tcBorders>
+              <w:bottom w:val="single" w:sz="4" w:color="CBD5E1" w:space="0"/>
+            </w:tcBorders>
           </w:tcPr>
           <w:p>
             <w:pPr>
@@ -141,8 +147,8 @@
               <w:rPr>
                 <w:rFonts w:ascii="Calibri" w:hAnsi="Calibri"/>
                 <w:b/>
-                <w:color w:val="FFFFFF"/>
-                <w:sz w:val="14"/>
+                <w:color w:val="475569"/>
+                <w:sz w:val="13"/>
               </w:rPr>
               <w:t>Case No.</w:t>
             </w:r>
@@ -151,14 +157,17 @@
         <w:tc>
           <w:tcPr>
             <w:tcW w:type="dxa" w:w="2074"/>
-            <w:shd w:fill="1E293B"/>
+            <w:shd w:fill="F8FAFC"/>
             <w:tcMar>
-              <w:top w:w="35" w:type="dxa"/>
-              <w:bottom w:w="35" w:type="dxa"/>
+              <w:top w:w="28" w:type="dxa"/>
+              <w:bottom w:w="28" w:type="dxa"/>
               <w:start w:w="55" w:type="dxa"/>
               <w:end w:w="55" w:type="dxa"/>
             </w:tcMar>
             <w:tcW w:w="1584" w:type="dxa"/>
+            <w:tcBorders>
+              <w:bottom w:val="single" w:sz="4" w:color="CBD5E1" w:space="0"/>
+            </w:tcBorders>
           </w:tcPr>
           <w:p>
             <w:pPr>
@@ -168,8 +177,8 @@
               <w:rPr>
                 <w:rFonts w:ascii="Calibri" w:hAnsi="Calibri"/>
                 <w:b/>
-                <w:color w:val="FFFFFF"/>
-                <w:sz w:val="14"/>
+                <w:color w:val="475569"/>
+                <w:sz w:val="13"/>
               </w:rPr>
               <w:t>Judge</w:t>
             </w:r>
@@ -178,14 +187,17 @@
         <w:tc>
           <w:tcPr>
             <w:tcW w:type="dxa" w:w="2074"/>
-            <w:shd w:fill="1E293B"/>
+            <w:shd w:fill="F8FAFC"/>
             <w:tcMar>
-              <w:top w:w="35" w:type="dxa"/>
-              <w:bottom w:w="35" w:type="dxa"/>
+              <w:top w:w="28" w:type="dxa"/>
+              <w:bottom w:w="28" w:type="dxa"/>
               <w:start w:w="55" w:type="dxa"/>
               <w:end w:w="55" w:type="dxa"/>
             </w:tcMar>
             <w:tcW w:w="2015" w:type="dxa"/>
+            <w:tcBorders>
+              <w:bottom w:val="single" w:sz="4" w:color="CBD5E1" w:space="0"/>
+            </w:tcBorders>
           </w:tcPr>
           <w:p>
             <w:pPr>
@@ -195,8 +207,8 @@
               <w:rPr>
                 <w:rFonts w:ascii="Calibri" w:hAnsi="Calibri"/>
                 <w:b/>
-                <w:color w:val="FFFFFF"/>
-                <w:sz w:val="14"/>
+                <w:color w:val="475569"/>
+                <w:sz w:val="13"/>
               </w:rPr>
               <w:t>Clients</w:t>
             </w:r>
@@ -205,14 +217,17 @@
         <w:tc>
           <w:tcPr>
             <w:tcW w:type="dxa" w:w="2074"/>
-            <w:shd w:fill="1E293B"/>
+            <w:shd w:fill="F8FAFC"/>
             <w:tcMar>
-              <w:top w:w="35" w:type="dxa"/>
-              <w:bottom w:w="35" w:type="dxa"/>
+              <w:top w:w="28" w:type="dxa"/>
+              <w:bottom w:w="28" w:type="dxa"/>
               <w:start w:w="55" w:type="dxa"/>
               <w:end w:w="55" w:type="dxa"/>
             </w:tcMar>
             <w:tcW w:w="1296" w:type="dxa"/>
+            <w:tcBorders>
+              <w:bottom w:val="single" w:sz="4" w:color="CBD5E1" w:space="0"/>
+            </w:tcBorders>
           </w:tcPr>
           <w:p>
             <w:pPr>
@@ -222,8 +237,8 @@
               <w:rPr>
                 <w:rFonts w:ascii="Calibri" w:hAnsi="Calibri"/>
                 <w:b/>
-                <w:color w:val="FFFFFF"/>
-                <w:sz w:val="14"/>
+                <w:color w:val="475569"/>
+                <w:sz w:val="13"/>
               </w:rPr>
               <w:t>DOI</w:t>
             </w:r>
@@ -626,7 +641,7 @@
     </w:tbl>
     <w:p>
       <w:pPr>
-        <w:spacing w:before="0" w:after="0"/>
+        <w:spacing w:before="0" w:after="0" w:line="1" w:lineRule="exact"/>
       </w:pPr>
       <w:r>
         <w:rPr>
@@ -639,7 +654,7 @@
     </w:p>
     <w:p>
       <w:pPr>
-        <w:spacing w:before="0" w:after="0"/>
+        <w:spacing w:before="0" w:after="0" w:line="1" w:lineRule="exact"/>
       </w:pPr>
       <w:r>
         <w:rPr>
@@ -771,7 +786,7 @@
       <w:pPr>
         <w:spacing w:before="0" w:after="0"/>
         <w:pBorders>
-          <w:bottom w:val="single" w:sz="6" w:color="3B82F6" w:space="1"/>
+          <w:bottom w:val="single" w:sz="4" w:color="E2E8F0" w:space="1"/>
         </w:pBorders>
       </w:pPr>
     </w:p>
@@ -782,12 +797,12 @@
         <w:tblLayout w:type="autofit"/>
         <w:tblLook w:firstColumn="1" w:firstRow="1" w:lastColumn="0" w:lastRow="0" w:noHBand="0" w:noVBand="1" w:val="04A0"/>
         <w:tblBorders>
-          <w:top w:val="single" w:sz="2" w:color="CBD5E1" w:space="0"/>
-          <w:left w:val="single" w:sz="2" w:color="CBD5E1" w:space="0"/>
-          <w:bottom w:val="single" w:sz="2" w:color="CBD5E1" w:space="0"/>
-          <w:right w:val="single" w:sz="2" w:color="CBD5E1" w:space="0"/>
-          <w:insideH w:val="single" w:sz="2" w:color="CBD5E1" w:space="0"/>
-          <w:insideV w:val="single" w:sz="2" w:color="CBD5E1" w:space="0"/>
+          <w:top w:val="single" w:sz="2" w:color="E2E8F0" w:space="0"/>
+          <w:left w:val="single" w:sz="2" w:color="E2E8F0" w:space="0"/>
+          <w:bottom w:val="single" w:sz="2" w:color="E2E8F0" w:space="0"/>
+          <w:right w:val="single" w:sz="2" w:color="E2E8F0" w:space="0"/>
+          <w:insideH w:val="single" w:sz="2" w:color="E2E8F0" w:space="0"/>
+          <w:insideV w:val="single" w:sz="2" w:color="E2E8F0" w:space="0"/>
         </w:tblBorders>
       </w:tblPr>
       <w:tblGrid>
@@ -799,12 +814,11 @@
         <w:tc>
           <w:tcPr>
             <w:tcW w:type="dxa" w:w="3456"/>
-            <w:shd w:fill="F8FAFC"/>
             <w:tcMar>
-              <w:top w:w="20" w:type="dxa"/>
-              <w:bottom w:w="20" w:type="dxa"/>
-              <w:start w:w="55" w:type="dxa"/>
-              <w:end w:w="55" w:type="dxa"/>
+              <w:top w:w="22" w:type="dxa"/>
+              <w:bottom w:w="22" w:type="dxa"/>
+              <w:start w:w="60" w:type="dxa"/>
+              <w:end w:w="60" w:type="dxa"/>
             </w:tcMar>
             <w:tcW w:w="3456" w:type="dxa"/>
           </w:tcPr>
@@ -815,11 +829,10 @@
             <w:r>
               <w:rPr>
                 <w:rFonts w:ascii="Calibri" w:hAnsi="Calibri"/>
-                <w:b/>
                 <w:color w:val="94A3B8"/>
-                <w:sz w:val="12"/>
+                <w:sz w:val="13"/>
               </w:rPr>
-              <w:t>CASE NO.</w:t>
+              <w:t>Case No.</w:t>
             </w:r>
           </w:p>
           <w:p>
@@ -838,12 +851,11 @@
         <w:tc>
           <w:tcPr>
             <w:tcW w:type="dxa" w:w="3456"/>
-            <w:shd w:fill="F8FAFC"/>
             <w:tcMar>
-              <w:top w:w="20" w:type="dxa"/>
-              <w:bottom w:w="20" w:type="dxa"/>
-              <w:start w:w="55" w:type="dxa"/>
-              <w:end w:w="55" w:type="dxa"/>
+              <w:top w:w="22" w:type="dxa"/>
+              <w:bottom w:w="22" w:type="dxa"/>
+              <w:start w:w="60" w:type="dxa"/>
+              <w:end w:w="60" w:type="dxa"/>
             </w:tcMar>
             <w:tcW w:w="3456" w:type="dxa"/>
           </w:tcPr>
@@ -854,11 +866,10 @@
             <w:r>
               <w:rPr>
                 <w:rFonts w:ascii="Calibri" w:hAnsi="Calibri"/>
-                <w:b/>
                 <w:color w:val="94A3B8"/>
-                <w:sz w:val="12"/>
+                <w:sz w:val="13"/>
               </w:rPr>
-              <w:t>JUDGE</w:t>
+              <w:t>Judge</w:t>
             </w:r>
           </w:p>
           <w:p>
@@ -877,12 +888,11 @@
         <w:tc>
           <w:tcPr>
             <w:tcW w:type="dxa" w:w="3456"/>
-            <w:shd w:fill="F8FAFC"/>
             <w:tcMar>
-              <w:top w:w="20" w:type="dxa"/>
-              <w:bottom w:w="20" w:type="dxa"/>
-              <w:start w:w="55" w:type="dxa"/>
-              <w:end w:w="55" w:type="dxa"/>
+              <w:top w:w="22" w:type="dxa"/>
+              <w:bottom w:w="22" w:type="dxa"/>
+              <w:start w:w="60" w:type="dxa"/>
+              <w:end w:w="60" w:type="dxa"/>
             </w:tcMar>
             <w:tcW w:w="3456" w:type="dxa"/>
           </w:tcPr>
@@ -893,11 +903,10 @@
             <w:r>
               <w:rPr>
                 <w:rFonts w:ascii="Calibri" w:hAnsi="Calibri"/>
-                <w:b/>
                 <w:color w:val="94A3B8"/>
-                <w:sz w:val="12"/>
+                <w:sz w:val="13"/>
               </w:rPr>
-              <w:t>DATE OF INJURY</w:t>
+              <w:t>Date of Injury</w:t>
             </w:r>
           </w:p>
           <w:p>
@@ -918,12 +927,11 @@
         <w:tc>
           <w:tcPr>
             <w:tcW w:type="dxa" w:w="3456"/>
-            <w:shd w:fill="F8FAFC"/>
             <w:tcMar>
-              <w:top w:w="20" w:type="dxa"/>
-              <w:bottom w:w="20" w:type="dxa"/>
-              <w:start w:w="55" w:type="dxa"/>
-              <w:end w:w="55" w:type="dxa"/>
+              <w:top w:w="22" w:type="dxa"/>
+              <w:bottom w:w="22" w:type="dxa"/>
+              <w:start w:w="60" w:type="dxa"/>
+              <w:end w:w="60" w:type="dxa"/>
             </w:tcMar>
             <w:tcW w:w="3456" w:type="dxa"/>
           </w:tcPr>
@@ -934,11 +942,10 @@
             <w:r>
               <w:rPr>
                 <w:rFonts w:ascii="Calibri" w:hAnsi="Calibri"/>
-                <w:b/>
                 <w:color w:val="94A3B8"/>
-                <w:sz w:val="12"/>
+                <w:sz w:val="13"/>
               </w:rPr>
-              <w:t>JURISDICTION</w:t>
+              <w:t>Jurisdiction</w:t>
             </w:r>
           </w:p>
           <w:p>
@@ -957,12 +964,11 @@
         <w:tc>
           <w:tcPr>
             <w:tcW w:type="dxa" w:w="3456"/>
-            <w:shd w:fill="F8FAFC"/>
             <w:tcMar>
-              <w:top w:w="20" w:type="dxa"/>
-              <w:bottom w:w="20" w:type="dxa"/>
-              <w:start w:w="55" w:type="dxa"/>
-              <w:end w:w="55" w:type="dxa"/>
+              <w:top w:w="22" w:type="dxa"/>
+              <w:bottom w:w="22" w:type="dxa"/>
+              <w:start w:w="60" w:type="dxa"/>
+              <w:end w:w="60" w:type="dxa"/>
             </w:tcMar>
             <w:tcW w:w="3456" w:type="dxa"/>
           </w:tcPr>
@@ -973,11 +979,10 @@
             <w:r>
               <w:rPr>
                 <w:rFonts w:ascii="Calibri" w:hAnsi="Calibri"/>
-                <w:b/>
                 <w:color w:val="94A3B8"/>
-                <w:sz w:val="12"/>
+                <w:sz w:val="13"/>
               </w:rPr>
-              <w:t>OPP. COUNSEL</w:t>
+              <w:t>Opp. Counsel</w:t>
             </w:r>
           </w:p>
           <w:p>
@@ -996,12 +1001,11 @@
         <w:tc>
           <w:tcPr>
             <w:tcW w:type="dxa" w:w="3456"/>
-            <w:shd w:fill="F8FAFC"/>
             <w:tcMar>
-              <w:top w:w="20" w:type="dxa"/>
-              <w:bottom w:w="20" w:type="dxa"/>
-              <w:start w:w="55" w:type="dxa"/>
-              <w:end w:w="55" w:type="dxa"/>
+              <w:top w:w="22" w:type="dxa"/>
+              <w:bottom w:w="22" w:type="dxa"/>
+              <w:start w:w="60" w:type="dxa"/>
+              <w:end w:w="60" w:type="dxa"/>
             </w:tcMar>
             <w:tcW w:w="3456" w:type="dxa"/>
           </w:tcPr>
@@ -1012,11 +1016,10 @@
             <w:r>
               <w:rPr>
                 <w:rFonts w:ascii="Calibri" w:hAnsi="Calibri"/>
-                <w:b/>
                 <w:color w:val="94A3B8"/>
-                <w:sz w:val="12"/>
+                <w:sz w:val="13"/>
               </w:rPr>
-              <w:t>CLIENTS</w:t>
+              <w:t>Clients</w:t>
             </w:r>
           </w:p>
           <w:p>
@@ -1036,7 +1039,7 @@
     </w:tbl>
     <w:p>
       <w:pPr>
-        <w:spacing w:before="0" w:after="0"/>
+        <w:spacing w:before="0" w:after="0" w:line="1" w:lineRule="exact"/>
       </w:pPr>
       <w:r>
         <w:rPr>
@@ -1049,7 +1052,7 @@
     </w:p>
     <w:p>
       <w:pPr>
-        <w:spacing w:before="40" w:after="60"/>
+        <w:spacing w:before="40" w:after="40"/>
         <w:pBorders>
           <w:left w:val="single" w:sz="14" w:color="3B82F6" w:space="6"/>
         </w:pBorders>
@@ -1067,7 +1070,7 @@
     </w:p>
     <w:p>
       <w:pPr>
-        <w:spacing w:before="0" w:after="0"/>
+        <w:spacing w:before="0" w:after="0" w:line="1" w:lineRule="exact"/>
       </w:pPr>
       <w:r>
         <w:rPr>
@@ -1080,7 +1083,7 @@
     </w:p>
     <w:p>
       <w:pPr>
-        <w:spacing w:before="0" w:after="0"/>
+        <w:spacing w:before="0" w:after="0" w:line="1" w:lineRule="exact"/>
       </w:pPr>
       <w:r>
         <w:rPr>
@@ -1115,7 +1118,7 @@
     </w:p>
     <w:p>
       <w:pPr>
-        <w:spacing w:before="0" w:after="0"/>
+        <w:spacing w:before="0" w:after="0" w:line="1" w:lineRule="exact"/>
       </w:pPr>
       <w:r>
         <w:rPr>
@@ -1128,7 +1131,7 @@
     </w:p>
     <w:p>
       <w:pPr>
-        <w:spacing w:before="40" w:after="0"/>
+        <w:spacing w:before="0" w:after="0" w:line="1" w:lineRule="exact"/>
       </w:pPr>
       <w:r>
         <w:rPr>
@@ -1146,12 +1149,12 @@
         <w:tblLayout w:type="autofit"/>
         <w:tblLook w:firstColumn="1" w:firstRow="1" w:lastColumn="0" w:lastRow="0" w:noHBand="0" w:noVBand="1" w:val="04A0"/>
         <w:tblBorders>
-          <w:top w:val="single" w:sz="2" w:color="CBD5E1" w:space="0"/>
-          <w:left w:val="single" w:sz="2" w:color="CBD5E1" w:space="0"/>
-          <w:bottom w:val="single" w:sz="2" w:color="CBD5E1" w:space="0"/>
-          <w:right w:val="single" w:sz="2" w:color="CBD5E1" w:space="0"/>
-          <w:insideH w:val="single" w:sz="2" w:color="CBD5E1" w:space="0"/>
-          <w:insideV w:val="single" w:sz="2" w:color="CBD5E1" w:space="0"/>
+          <w:top w:val="single" w:sz="2" w:color="E2E8F0" w:space="0"/>
+          <w:left w:val="single" w:sz="2" w:color="E2E8F0" w:space="0"/>
+          <w:bottom w:val="single" w:sz="2" w:color="E2E8F0" w:space="0"/>
+          <w:right w:val="single" w:sz="2" w:color="E2E8F0" w:space="0"/>
+          <w:insideH w:val="single" w:sz="2" w:color="E2E8F0" w:space="0"/>
+          <w:insideV w:val="single" w:sz="2" w:color="E2E8F0" w:space="0"/>
         </w:tblBorders>
       </w:tblPr>
       <w:tblGrid>
@@ -1166,13 +1169,16 @@
           <w:tcPr>
             <w:tcW w:type="dxa" w:w="4148"/>
             <w:gridSpan w:val="2"/>
-            <w:shd w:fill="1E293B"/>
+            <w:shd w:fill="F8FAFC"/>
             <w:tcMar>
-              <w:top w:w="22" w:type="dxa"/>
-              <w:bottom w:w="22" w:type="dxa"/>
-              <w:start w:w="50" w:type="dxa"/>
-              <w:end w:w="50" w:type="dxa"/>
+              <w:top w:w="20" w:type="dxa"/>
+              <w:bottom w:w="20" w:type="dxa"/>
+              <w:start w:w="55" w:type="dxa"/>
+              <w:end w:w="55" w:type="dxa"/>
             </w:tcMar>
+            <w:tcBorders>
+              <w:bottom w:val="single" w:sz="4" w:color="CBD5E1" w:space="0"/>
+            </w:tcBorders>
           </w:tcPr>
           <w:p>
             <w:pPr>
@@ -1182,10 +1188,10 @@
               <w:rPr>
                 <w:rFonts w:ascii="Calibri" w:hAnsi="Calibri"/>
                 <w:b/>
-                <w:color w:val="FFFFFF"/>
-                <w:sz w:val="14"/>
+                <w:color w:val="0F172A"/>
+                <w:sz w:val="16"/>
               </w:rPr>
-              <w:t>KEY DATES &amp; EVENTS</w:t>
+              <w:t>Events</w:t>
             </w:r>
           </w:p>
         </w:tc>
@@ -1211,13 +1217,16 @@
           <w:tcPr>
             <w:tcW w:type="dxa" w:w="4148"/>
             <w:gridSpan w:val="2"/>
-            <w:shd w:fill="1E293B"/>
+            <w:shd w:fill="F8FAFC"/>
             <w:tcMar>
-              <w:top w:w="22" w:type="dxa"/>
-              <w:bottom w:w="22" w:type="dxa"/>
-              <w:start w:w="50" w:type="dxa"/>
-              <w:end w:w="50" w:type="dxa"/>
+              <w:top w:w="20" w:type="dxa"/>
+              <w:bottom w:w="20" w:type="dxa"/>
+              <w:start w:w="55" w:type="dxa"/>
+              <w:end w:w="55" w:type="dxa"/>
             </w:tcMar>
+            <w:tcBorders>
+              <w:bottom w:val="single" w:sz="4" w:color="CBD5E1" w:space="0"/>
+            </w:tcBorders>
           </w:tcPr>
           <w:p>
             <w:pPr>
@@ -1227,10 +1236,10 @@
               <w:rPr>
                 <w:rFonts w:ascii="Calibri" w:hAnsi="Calibri"/>
                 <w:b/>
-                <w:color w:val="FFFFFF"/>
-                <w:sz w:val="14"/>
+                <w:color w:val="0F172A"/>
+                <w:sz w:val="16"/>
               </w:rPr>
-              <w:t>OPEN TASKS</w:t>
+              <w:t>Tasks</w:t>
             </w:r>
           </w:p>
         </w:tc>
@@ -1239,12 +1248,11 @@
         <w:tc>
           <w:tcPr>
             <w:tcW w:type="dxa" w:w="2074"/>
-            <w:shd w:fill="F8FAFC"/>
             <w:tcMar>
-              <w:top w:w="16" w:type="dxa"/>
-              <w:bottom w:w="16" w:type="dxa"/>
-              <w:start w:w="50" w:type="dxa"/>
-              <w:end w:w="50" w:type="dxa"/>
+              <w:top w:w="14" w:type="dxa"/>
+              <w:bottom w:w="14" w:type="dxa"/>
+              <w:start w:w="55" w:type="dxa"/>
+              <w:end w:w="55" w:type="dxa"/>
             </w:tcMar>
             <w:tcW w:w="1728" w:type="dxa"/>
           </w:tcPr>
@@ -1255,7 +1263,6 @@
             <w:r>
               <w:rPr>
                 <w:rFonts w:ascii="Calibri" w:hAnsi="Calibri"/>
-                <w:b/>
                 <w:color w:val="94A3B8"/>
                 <w:sz w:val="12"/>
               </w:rPr>
@@ -1266,12 +1273,11 @@
         <w:tc>
           <w:tcPr>
             <w:tcW w:type="dxa" w:w="2074"/>
-            <w:shd w:fill="F8FAFC"/>
             <w:tcMar>
-              <w:top w:w="16" w:type="dxa"/>
-              <w:bottom w:w="16" w:type="dxa"/>
-              <w:start w:w="50" w:type="dxa"/>
-              <w:end w:w="50" w:type="dxa"/>
+              <w:top w:w="14" w:type="dxa"/>
+              <w:bottom w:w="14" w:type="dxa"/>
+              <w:start w:w="55" w:type="dxa"/>
+              <w:end w:w="55" w:type="dxa"/>
             </w:tcMar>
             <w:tcW w:w="3384" w:type="dxa"/>
           </w:tcPr>
@@ -1282,7 +1288,6 @@
             <w:r>
               <w:rPr>
                 <w:rFonts w:ascii="Calibri" w:hAnsi="Calibri"/>
-                <w:b/>
                 <w:color w:val="94A3B8"/>
                 <w:sz w:val="12"/>
               </w:rPr>
@@ -1311,12 +1316,11 @@
         <w:tc>
           <w:tcPr>
             <w:tcW w:type="dxa" w:w="2074"/>
-            <w:shd w:fill="F8FAFC"/>
             <w:tcMar>
-              <w:top w:w="16" w:type="dxa"/>
-              <w:bottom w:w="16" w:type="dxa"/>
-              <w:start w:w="50" w:type="dxa"/>
-              <w:end w:w="50" w:type="dxa"/>
+              <w:top w:w="14" w:type="dxa"/>
+              <w:bottom w:w="14" w:type="dxa"/>
+              <w:start w:w="55" w:type="dxa"/>
+              <w:end w:w="55" w:type="dxa"/>
             </w:tcMar>
             <w:tcW w:w="1440" w:type="dxa"/>
           </w:tcPr>
@@ -1327,7 +1331,6 @@
             <w:r>
               <w:rPr>
                 <w:rFonts w:ascii="Calibri" w:hAnsi="Calibri"/>
-                <w:b/>
                 <w:color w:val="94A3B8"/>
                 <w:sz w:val="12"/>
               </w:rPr>
@@ -1338,12 +1341,11 @@
         <w:tc>
           <w:tcPr>
             <w:tcW w:type="dxa" w:w="2074"/>
-            <w:shd w:fill="F8FAFC"/>
             <w:tcMar>
-              <w:top w:w="16" w:type="dxa"/>
-              <w:bottom w:w="16" w:type="dxa"/>
-              <w:start w:w="50" w:type="dxa"/>
-              <w:end w:w="50" w:type="dxa"/>
+              <w:top w:w="14" w:type="dxa"/>
+              <w:bottom w:w="14" w:type="dxa"/>
+              <w:start w:w="55" w:type="dxa"/>
+              <w:end w:w="55" w:type="dxa"/>
             </w:tcMar>
             <w:tcW w:w="3671" w:type="dxa"/>
           </w:tcPr>
@@ -1354,7 +1356,6 @@
             <w:r>
               <w:rPr>
                 <w:rFonts w:ascii="Calibri" w:hAnsi="Calibri"/>
-                <w:b/>
                 <w:color w:val="94A3B8"/>
                 <w:sz w:val="12"/>
               </w:rPr>
@@ -1444,7 +1445,7 @@
                 <w:color w:val="FFFFFF"/>
                 <w:sz w:val="2"/>
               </w:rPr>
-              <w:t>{% cellbg item.bg %}</w:t>
+              <w:t>{% cellbg item.ev_bg %}</w:t>
             </w:r>
             <w:r>
               <w:rPr>
@@ -1476,7 +1477,7 @@
                 <w:color w:val="FFFFFF"/>
                 <w:sz w:val="2"/>
               </w:rPr>
-              <w:t>{% cellbg item.bg %}</w:t>
+              <w:t>{% cellbg item.ev_bg %}</w:t>
             </w:r>
             <w:r>
               <w:rPr>
@@ -1526,7 +1527,7 @@
                 <w:color w:val="FFFFFF"/>
                 <w:sz w:val="2"/>
               </w:rPr>
-              <w:t>{% cellbg item.bg %}</w:t>
+              <w:t>{% cellbg item.tk_bg %}</w:t>
             </w:r>
             <w:r>
               <w:rPr>
@@ -1558,7 +1559,7 @@
                 <w:color w:val="FFFFFF"/>
                 <w:sz w:val="2"/>
               </w:rPr>
-              <w:t>{% cellbg item.bg %}</w:t>
+              <w:t>{% cellbg item.tk_bg %}</w:t>
             </w:r>
             <w:r>
               <w:rPr>
@@ -1632,7 +1633,7 @@
     </w:tbl>
     <w:p>
       <w:pPr>
-        <w:spacing w:before="0" w:after="0"/>
+        <w:spacing w:before="0" w:after="0" w:line="1" w:lineRule="exact"/>
       </w:pPr>
       <w:r>
         <w:rPr>
@@ -1645,7 +1646,7 @@
     </w:p>
     <w:p>
       <w:pPr>
-        <w:spacing w:before="0" w:after="0"/>
+        <w:spacing w:before="0" w:after="0" w:line="1" w:lineRule="exact"/>
       </w:pPr>
       <w:r>
         <w:rPr>
@@ -1675,7 +1676,7 @@
     </w:p>
     <w:p>
       <w:pPr>
-        <w:spacing w:before="0" w:after="0"/>
+        <w:spacing w:before="0" w:after="0" w:line="1" w:lineRule="exact"/>
       </w:pPr>
       <w:r>
         <w:rPr>
@@ -1718,7 +1719,7 @@
     </w:p>
     <w:p>
       <w:pPr>
-        <w:spacing w:before="0" w:after="0"/>
+        <w:spacing w:before="0" w:after="0" w:line="1" w:lineRule="exact"/>
       </w:pPr>
       <w:r>
         <w:rPr>
@@ -1731,7 +1732,7 @@
     </w:p>
     <w:p>
       <w:pPr>
-        <w:spacing w:before="0" w:after="0"/>
+        <w:spacing w:before="0" w:after="0" w:line="1" w:lineRule="exact"/>
       </w:pPr>
       <w:r>
         <w:rPr>
@@ -1744,7 +1745,7 @@
     </w:p>
     <w:p>
       <w:pPr>
-        <w:spacing w:before="0" w:after="0"/>
+        <w:spacing w:before="0" w:after="0" w:line="1" w:lineRule="exact"/>
       </w:pPr>
       <w:r>
         <w:rPr>
@@ -1757,7 +1758,7 @@
     </w:p>
     <w:p>
       <w:pPr>
-        <w:spacing w:before="0" w:after="0"/>
+        <w:spacing w:before="0" w:after="0" w:line="1" w:lineRule="exact"/>
       </w:pPr>
       <w:r>
         <w:rPr>

</xml_diff>

<commit_message>
feat: replace metadata grid with compact case info paragraphs in DOCX
Combine case number, jurisdiction, and judge into a single styled line
(e.g. "2:25-cv-01537-CSK (E.D. Cal.), Judge Troy L. Nunley"). Add DOI
and client on a second line, and list all counsel grouped by side
(co-counsel, opposing counsel, etc.) on a third. Soften notes heading.

Co-Authored-By: Claude Opus 4.5 <noreply@anthropic.com>
</commit_message>
<xml_diff>
--- a/templates/exports/case_report_template.docx
+++ b/templates/exports/case_report_template.docx
@@ -790,253 +790,120 @@
         </w:pBorders>
       </w:pPr>
     </w:p>
-    <w:tbl>
-      <w:tblPr>
-        <w:tblW w:type="auto" w:w="0"/>
-        <w:jc w:val="center"/>
-        <w:tblLayout w:type="autofit"/>
-        <w:tblLook w:firstColumn="1" w:firstRow="1" w:lastColumn="0" w:lastRow="0" w:noHBand="0" w:noVBand="1" w:val="04A0"/>
-        <w:tblBorders>
-          <w:top w:val="single" w:sz="2" w:color="E2E8F0" w:space="0"/>
-          <w:left w:val="single" w:sz="2" w:color="E2E8F0" w:space="0"/>
-          <w:bottom w:val="single" w:sz="2" w:color="E2E8F0" w:space="0"/>
-          <w:right w:val="single" w:sz="2" w:color="E2E8F0" w:space="0"/>
-          <w:insideH w:val="single" w:sz="2" w:color="E2E8F0" w:space="0"/>
-          <w:insideV w:val="single" w:sz="2" w:color="E2E8F0" w:space="0"/>
-        </w:tblBorders>
-      </w:tblPr>
-      <w:tblGrid>
-        <w:gridCol w:w="3456"/>
-        <w:gridCol w:w="3456"/>
-        <w:gridCol w:w="3456"/>
-      </w:tblGrid>
-      <w:tr>
-        <w:tc>
-          <w:tcPr>
-            <w:tcW w:type="dxa" w:w="3456"/>
-            <w:tcMar>
-              <w:top w:w="22" w:type="dxa"/>
-              <w:bottom w:w="22" w:type="dxa"/>
-              <w:start w:w="60" w:type="dxa"/>
-              <w:end w:w="60" w:type="dxa"/>
-            </w:tcMar>
-            <w:tcW w:w="3456" w:type="dxa"/>
-          </w:tcPr>
-          <w:p>
-            <w:pPr>
-              <w:spacing w:before="0" w:after="0"/>
-            </w:pPr>
-            <w:r>
-              <w:rPr>
-                <w:rFonts w:ascii="Calibri" w:hAnsi="Calibri"/>
-                <w:color w:val="94A3B8"/>
-                <w:sz w:val="13"/>
-              </w:rPr>
-              <w:t>Case No.</w:t>
-            </w:r>
-          </w:p>
-          <w:p>
-            <w:pPr>
-              <w:spacing w:before="0" w:after="0"/>
-            </w:pPr>
-            <w:r>
-              <w:rPr>
-                <w:rFonts w:ascii="Consolas" w:hAnsi="Consolas"/>
-                <w:sz w:val="17"/>
-              </w:rPr>
-              <w:t>{{ case.case_number }}</w:t>
-            </w:r>
-          </w:p>
-        </w:tc>
-        <w:tc>
-          <w:tcPr>
-            <w:tcW w:type="dxa" w:w="3456"/>
-            <w:tcMar>
-              <w:top w:w="22" w:type="dxa"/>
-              <w:bottom w:w="22" w:type="dxa"/>
-              <w:start w:w="60" w:type="dxa"/>
-              <w:end w:w="60" w:type="dxa"/>
-            </w:tcMar>
-            <w:tcW w:w="3456" w:type="dxa"/>
-          </w:tcPr>
-          <w:p>
-            <w:pPr>
-              <w:spacing w:before="0" w:after="0"/>
-            </w:pPr>
-            <w:r>
-              <w:rPr>
-                <w:rFonts w:ascii="Calibri" w:hAnsi="Calibri"/>
-                <w:color w:val="94A3B8"/>
-                <w:sz w:val="13"/>
-              </w:rPr>
-              <w:t>Judge</w:t>
-            </w:r>
-          </w:p>
-          <w:p>
-            <w:pPr>
-              <w:spacing w:before="0" w:after="0"/>
-            </w:pPr>
-            <w:r>
-              <w:rPr>
-                <w:rFonts w:ascii="Calibri" w:hAnsi="Calibri"/>
-                <w:sz w:val="17"/>
-              </w:rPr>
-              <w:t>{{ case.judge }}</w:t>
-            </w:r>
-          </w:p>
-        </w:tc>
-        <w:tc>
-          <w:tcPr>
-            <w:tcW w:type="dxa" w:w="3456"/>
-            <w:tcMar>
-              <w:top w:w="22" w:type="dxa"/>
-              <w:bottom w:w="22" w:type="dxa"/>
-              <w:start w:w="60" w:type="dxa"/>
-              <w:end w:w="60" w:type="dxa"/>
-            </w:tcMar>
-            <w:tcW w:w="3456" w:type="dxa"/>
-          </w:tcPr>
-          <w:p>
-            <w:pPr>
-              <w:spacing w:before="0" w:after="0"/>
-            </w:pPr>
-            <w:r>
-              <w:rPr>
-                <w:rFonts w:ascii="Calibri" w:hAnsi="Calibri"/>
-                <w:color w:val="94A3B8"/>
-                <w:sz w:val="13"/>
-              </w:rPr>
-              <w:t>Date of Injury</w:t>
-            </w:r>
-          </w:p>
-          <w:p>
-            <w:pPr>
-              <w:spacing w:before="0" w:after="0"/>
-            </w:pPr>
-            <w:r>
-              <w:rPr>
-                <w:rFonts w:ascii="Calibri" w:hAnsi="Calibri"/>
-                <w:sz w:val="17"/>
-              </w:rPr>
-              <w:t>{{ case.doi }}</w:t>
-            </w:r>
-          </w:p>
-        </w:tc>
-      </w:tr>
-      <w:tr>
-        <w:tc>
-          <w:tcPr>
-            <w:tcW w:type="dxa" w:w="3456"/>
-            <w:tcMar>
-              <w:top w:w="22" w:type="dxa"/>
-              <w:bottom w:w="22" w:type="dxa"/>
-              <w:start w:w="60" w:type="dxa"/>
-              <w:end w:w="60" w:type="dxa"/>
-            </w:tcMar>
-            <w:tcW w:w="3456" w:type="dxa"/>
-          </w:tcPr>
-          <w:p>
-            <w:pPr>
-              <w:spacing w:before="0" w:after="0"/>
-            </w:pPr>
-            <w:r>
-              <w:rPr>
-                <w:rFonts w:ascii="Calibri" w:hAnsi="Calibri"/>
-                <w:color w:val="94A3B8"/>
-                <w:sz w:val="13"/>
-              </w:rPr>
-              <w:t>Jurisdiction</w:t>
-            </w:r>
-          </w:p>
-          <w:p>
-            <w:pPr>
-              <w:spacing w:before="0" w:after="0"/>
-            </w:pPr>
-            <w:r>
-              <w:rPr>
-                <w:rFonts w:ascii="Calibri" w:hAnsi="Calibri"/>
-                <w:sz w:val="17"/>
-              </w:rPr>
-              <w:t>{{ case.jurisdiction }}</w:t>
-            </w:r>
-          </w:p>
-        </w:tc>
-        <w:tc>
-          <w:tcPr>
-            <w:tcW w:type="dxa" w:w="3456"/>
-            <w:tcMar>
-              <w:top w:w="22" w:type="dxa"/>
-              <w:bottom w:w="22" w:type="dxa"/>
-              <w:start w:w="60" w:type="dxa"/>
-              <w:end w:w="60" w:type="dxa"/>
-            </w:tcMar>
-            <w:tcW w:w="3456" w:type="dxa"/>
-          </w:tcPr>
-          <w:p>
-            <w:pPr>
-              <w:spacing w:before="0" w:after="0"/>
-            </w:pPr>
-            <w:r>
-              <w:rPr>
-                <w:rFonts w:ascii="Calibri" w:hAnsi="Calibri"/>
-                <w:color w:val="94A3B8"/>
-                <w:sz w:val="13"/>
-              </w:rPr>
-              <w:t>Opp. Counsel</w:t>
-            </w:r>
-          </w:p>
-          <w:p>
-            <w:pPr>
-              <w:spacing w:before="0" w:after="0"/>
-            </w:pPr>
-            <w:r>
-              <w:rPr>
-                <w:rFonts w:ascii="Calibri" w:hAnsi="Calibri"/>
-                <w:sz w:val="17"/>
-              </w:rPr>
-              <w:t>{{ case.opp_counsel }}</w:t>
-            </w:r>
-          </w:p>
-        </w:tc>
-        <w:tc>
-          <w:tcPr>
-            <w:tcW w:type="dxa" w:w="3456"/>
-            <w:tcMar>
-              <w:top w:w="22" w:type="dxa"/>
-              <w:bottom w:w="22" w:type="dxa"/>
-              <w:start w:w="60" w:type="dxa"/>
-              <w:end w:w="60" w:type="dxa"/>
-            </w:tcMar>
-            <w:tcW w:w="3456" w:type="dxa"/>
-          </w:tcPr>
-          <w:p>
-            <w:pPr>
-              <w:spacing w:before="0" w:after="0"/>
-            </w:pPr>
-            <w:r>
-              <w:rPr>
-                <w:rFonts w:ascii="Calibri" w:hAnsi="Calibri"/>
-                <w:color w:val="94A3B8"/>
-                <w:sz w:val="13"/>
-              </w:rPr>
-              <w:t>Clients</w:t>
-            </w:r>
-          </w:p>
-          <w:p>
-            <w:pPr>
-              <w:spacing w:before="0" w:after="0"/>
-            </w:pPr>
-            <w:r>
-              <w:rPr>
-                <w:rFonts w:ascii="Calibri" w:hAnsi="Calibri"/>
-                <w:sz w:val="17"/>
-              </w:rPr>
-              <w:t>{{ case.clients }}</w:t>
-            </w:r>
-          </w:p>
-        </w:tc>
-      </w:tr>
-    </w:tbl>
+    <w:p>
+      <w:pPr>
+        <w:spacing w:before="0" w:after="0" w:line="1" w:lineRule="exact"/>
+      </w:pPr>
+      <w:r>
+        <w:rPr>
+          <w:rFonts w:ascii="Calibri" w:hAnsi="Calibri"/>
+          <w:color w:val="FFFFFF"/>
+          <w:sz w:val="2"/>
+        </w:rPr>
+        <w:t>{% if case.has_info %}</w:t>
+      </w:r>
+    </w:p>
+    <w:p>
+      <w:pPr>
+        <w:spacing w:before="40" w:after="0"/>
+      </w:pPr>
+      <w:r>
+        <w:rPr>
+          <w:rFonts w:ascii="Calibri" w:hAnsi="Calibri"/>
+          <w:sz w:val="18"/>
+        </w:rPr>
+        <w:t>{{r case.case_info_rt }}</w:t>
+      </w:r>
+    </w:p>
+    <w:p>
+      <w:pPr>
+        <w:spacing w:before="0" w:after="0" w:line="1" w:lineRule="exact"/>
+      </w:pPr>
+      <w:r>
+        <w:rPr>
+          <w:rFonts w:ascii="Calibri" w:hAnsi="Calibri"/>
+          <w:color w:val="FFFFFF"/>
+          <w:sz w:val="2"/>
+        </w:rPr>
+        <w:t>{% endif %}</w:t>
+      </w:r>
+    </w:p>
+    <w:p>
+      <w:pPr>
+        <w:spacing w:before="0" w:after="0" w:line="1" w:lineRule="exact"/>
+      </w:pPr>
+      <w:r>
+        <w:rPr>
+          <w:rFonts w:ascii="Calibri" w:hAnsi="Calibri"/>
+          <w:color w:val="FFFFFF"/>
+          <w:sz w:val="2"/>
+        </w:rPr>
+        <w:t>{% if case.has_detail %}</w:t>
+      </w:r>
+    </w:p>
+    <w:p>
+      <w:pPr>
+        <w:spacing w:before="0" w:after="0"/>
+      </w:pPr>
+      <w:r>
+        <w:rPr>
+          <w:rFonts w:ascii="Calibri" w:hAnsi="Calibri"/>
+          <w:sz w:val="16"/>
+        </w:rPr>
+        <w:t>{{r case.detail_rt }}</w:t>
+      </w:r>
+    </w:p>
+    <w:p>
+      <w:pPr>
+        <w:spacing w:before="0" w:after="0" w:line="1" w:lineRule="exact"/>
+      </w:pPr>
+      <w:r>
+        <w:rPr>
+          <w:rFonts w:ascii="Calibri" w:hAnsi="Calibri"/>
+          <w:color w:val="FFFFFF"/>
+          <w:sz w:val="2"/>
+        </w:rPr>
+        <w:t>{% endif %}</w:t>
+      </w:r>
+    </w:p>
+    <w:p>
+      <w:pPr>
+        <w:spacing w:before="0" w:after="0" w:line="1" w:lineRule="exact"/>
+      </w:pPr>
+      <w:r>
+        <w:rPr>
+          <w:rFonts w:ascii="Calibri" w:hAnsi="Calibri"/>
+          <w:color w:val="FFFFFF"/>
+          <w:sz w:val="2"/>
+        </w:rPr>
+        <w:t>{% if case.has_counsel %}</w:t>
+      </w:r>
+    </w:p>
+    <w:p>
+      <w:pPr>
+        <w:spacing w:before="0" w:after="0"/>
+      </w:pPr>
+      <w:r>
+        <w:rPr>
+          <w:rFonts w:ascii="Calibri" w:hAnsi="Calibri"/>
+          <w:sz w:val="16"/>
+        </w:rPr>
+        <w:t>{{r case.counsel_rt }}</w:t>
+      </w:r>
+    </w:p>
+    <w:p>
+      <w:pPr>
+        <w:spacing w:before="0" w:after="0" w:line="1" w:lineRule="exact"/>
+      </w:pPr>
+      <w:r>
+        <w:rPr>
+          <w:rFonts w:ascii="Calibri" w:hAnsi="Calibri"/>
+          <w:color w:val="FFFFFF"/>
+          <w:sz w:val="2"/>
+        </w:rPr>
+        <w:t>{% endif %}</w:t>
+      </w:r>
+    </w:p>
     <w:p>
       <w:pPr>
         <w:spacing w:before="0" w:after="0" w:line="1" w:lineRule="exact"/>
@@ -1141,6 +1008,11 @@
         </w:rPr>
         <w:t>{% if case.has_timeline %}</w:t>
       </w:r>
+    </w:p>
+    <w:p>
+      <w:pPr>
+        <w:spacing w:before="80" w:after="0"/>
+      </w:pPr>
     </w:p>
     <w:tbl>
       <w:tblPr>
@@ -1671,7 +1543,7 @@
           <w:color w:val="0F172A"/>
           <w:sz w:val="18"/>
         </w:rPr>
-        <w:t>RECENT NOTES</w:t>
+        <w:t>Notes</w:t>
       </w:r>
     </w:p>
     <w:p>

</xml_diff>

<commit_message>
refactor: split timeline into separate events/tasks tables, bump fonts to 12pt+
- Split single 5-column timeline table into two independent side-by-side
  tables (events always shown, tasks conditionally hidden via {% if %})
- Bump all RichText sizes to minimum 12pt (24 half-pts), important info 14pt
- Bump all static template font sizes to minimum 12pt
- Pass event_items and task_items separately instead of zipped timeline
- Remove build_docx_template.py — template is now edited directly in Word

Co-Authored-By: Claude Opus 4.6 <noreply@anthropic.com>
</commit_message>
<xml_diff>
--- a/templates/exports/case_report_template.docx
+++ b/templates/exports/case_report_template.docx
@@ -37,7 +37,7 @@
         <w:rPr>
           <w:rFonts w:ascii="Calibri" w:hAnsi="Calibri"/>
           <w:color w:val="0F172A"/>
-          <w:sz w:val="22"/>
+          <w:sz w:val="24"/>
         </w:rPr>
         <w:t>{{ attorney_name }}</w:t>
       </w:r>
@@ -45,7 +45,7 @@
         <w:rPr>
           <w:rFonts w:ascii="Calibri" w:hAnsi="Calibri"/>
           <w:color w:val="94A3B8"/>
-          <w:sz w:val="22"/>
+          <w:sz w:val="24"/>
         </w:rPr>
         <w:t xml:space="preserve">  |  </w:t>
       </w:r>
@@ -53,7 +53,7 @@
         <w:rPr>
           <w:rFonts w:ascii="Calibri" w:hAnsi="Calibri"/>
           <w:color w:val="475569"/>
-          <w:sz w:val="22"/>
+          <w:sz w:val="24"/>
         </w:rPr>
         <w:t>{{ creation_date }}</w:t>
       </w:r>
@@ -66,7 +66,7 @@
         <w:rPr>
           <w:rFonts w:ascii="Calibri" w:hAnsi="Calibri"/>
           <w:color w:val="94A3B8"/>
-          <w:sz w:val="18"/>
+          <w:sz w:val="24"/>
         </w:rPr>
         <w:t>{{ case_count }} active matters</w:t>
       </w:r>
@@ -118,7 +118,7 @@
                 <w:rFonts w:ascii="Calibri" w:hAnsi="Calibri"/>
                 <w:b/>
                 <w:color w:val="475569"/>
-                <w:sz w:val="13"/>
+                <w:sz w:val="24"/>
               </w:rPr>
               <w:t>Case</w:t>
             </w:r>
@@ -148,7 +148,7 @@
                 <w:rFonts w:ascii="Calibri" w:hAnsi="Calibri"/>
                 <w:b/>
                 <w:color w:val="475569"/>
-                <w:sz w:val="13"/>
+                <w:sz w:val="24"/>
               </w:rPr>
               <w:t>Case No.</w:t>
             </w:r>
@@ -178,7 +178,7 @@
                 <w:rFonts w:ascii="Calibri" w:hAnsi="Calibri"/>
                 <w:b/>
                 <w:color w:val="475569"/>
-                <w:sz w:val="13"/>
+                <w:sz w:val="24"/>
               </w:rPr>
               <w:t>Judge</w:t>
             </w:r>
@@ -208,7 +208,7 @@
                 <w:rFonts w:ascii="Calibri" w:hAnsi="Calibri"/>
                 <w:b/>
                 <w:color w:val="475569"/>
-                <w:sz w:val="13"/>
+                <w:sz w:val="24"/>
               </w:rPr>
               <w:t>Clients</w:t>
             </w:r>
@@ -238,7 +238,7 @@
                 <w:rFonts w:ascii="Calibri" w:hAnsi="Calibri"/>
                 <w:b/>
                 <w:color w:val="475569"/>
-                <w:sz w:val="13"/>
+                <w:sz w:val="24"/>
               </w:rPr>
               <w:t>DOI</w:t>
             </w:r>
@@ -257,7 +257,7 @@
             <w:r>
               <w:rPr>
                 <w:rFonts w:ascii="Calibri" w:hAnsi="Calibri"/>
-                <w:sz w:val="16"/>
+                <w:sz w:val="24"/>
               </w:rPr>
               <w:t>{%tr for phase in phases %}</w:t>
             </w:r>
@@ -324,14 +324,14 @@
               <w:rPr>
                 <w:rFonts w:ascii="Calibri" w:hAnsi="Calibri"/>
                 <w:color w:val="FFFFFF"/>
-                <w:sz w:val="2"/>
+                <w:sz w:val="24"/>
               </w:rPr>
               <w:t>{% cellbg phase.bg %}</w:t>
             </w:r>
             <w:r>
               <w:rPr>
                 <w:rFonts w:ascii="Calibri" w:hAnsi="Calibri"/>
-                <w:sz w:val="20"/>
+                <w:sz w:val="24"/>
               </w:rPr>
               <w:t>{{r phase.header_rt }}</w:t>
             </w:r>
@@ -350,7 +350,7 @@
             <w:r>
               <w:rPr>
                 <w:rFonts w:ascii="Calibri" w:hAnsi="Calibri"/>
-                <w:sz w:val="16"/>
+                <w:sz w:val="24"/>
               </w:rPr>
               <w:t>{%tr for case in phase.cases %}</w:t>
             </w:r>
@@ -417,7 +417,7 @@
               <w:rPr>
                 <w:rFonts w:ascii="Calibri" w:hAnsi="Calibri"/>
                 <w:b/>
-                <w:sz w:val="16"/>
+                <w:sz w:val="24"/>
               </w:rPr>
               <w:t>{{ case.short_name }}</w:t>
             </w:r>
@@ -441,7 +441,7 @@
             <w:r>
               <w:rPr>
                 <w:rFonts w:ascii="Consolas" w:hAnsi="Consolas"/>
-                <w:sz w:val="15"/>
+                <w:sz w:val="24"/>
               </w:rPr>
               <w:t>{{ case.case_number }}</w:t>
             </w:r>
@@ -465,7 +465,7 @@
             <w:r>
               <w:rPr>
                 <w:rFonts w:ascii="Calibri" w:hAnsi="Calibri"/>
-                <w:sz w:val="16"/>
+                <w:sz w:val="24"/>
               </w:rPr>
               <w:t>{{ case.judge }}</w:t>
             </w:r>
@@ -489,7 +489,7 @@
             <w:r>
               <w:rPr>
                 <w:rFonts w:ascii="Calibri" w:hAnsi="Calibri"/>
-                <w:sz w:val="16"/>
+                <w:sz w:val="24"/>
               </w:rPr>
               <w:t>{{ case.clients }}</w:t>
             </w:r>
@@ -513,7 +513,7 @@
             <w:r>
               <w:rPr>
                 <w:rFonts w:ascii="Calibri" w:hAnsi="Calibri"/>
-                <w:sz w:val="16"/>
+                <w:sz w:val="24"/>
               </w:rPr>
               <w:t>{{ case.doi }}</w:t>
             </w:r>
@@ -532,7 +532,7 @@
             <w:r>
               <w:rPr>
                 <w:rFonts w:ascii="Calibri" w:hAnsi="Calibri"/>
-                <w:sz w:val="16"/>
+                <w:sz w:val="24"/>
               </w:rPr>
               <w:t>{%tr endfor %}</w:t>
             </w:r>
@@ -591,7 +591,7 @@
             <w:r>
               <w:rPr>
                 <w:rFonts w:ascii="Calibri" w:hAnsi="Calibri"/>
-                <w:sz w:val="16"/>
+                <w:sz w:val="24"/>
               </w:rPr>
               <w:t>{%tr endfor %}</w:t>
             </w:r>
@@ -647,7 +647,7 @@
         <w:rPr>
           <w:rFonts w:ascii="Calibri" w:hAnsi="Calibri"/>
           <w:color w:val="FFFFFF"/>
-          <w:sz w:val="2"/>
+          <w:sz w:val="24"/>
         </w:rPr>
         <w:t>{% for phase in phases %}</w:t>
       </w:r>
@@ -660,7 +660,7 @@
         <w:rPr>
           <w:rFonts w:ascii="Calibri" w:hAnsi="Calibri"/>
           <w:color w:val="FFFFFF"/>
-          <w:sz w:val="2"/>
+          <w:sz w:val="24"/>
         </w:rPr>
         <w:t>{% for case in phase.cases %}</w:t>
       </w:r>
@@ -674,7 +674,7 @@
         <w:rPr>
           <w:rFonts w:ascii="Calibri" w:hAnsi="Calibri"/>
           <w:color w:val="FFFFFF"/>
-          <w:sz w:val="2"/>
+          <w:sz w:val="24"/>
         </w:rPr>
         <w:t xml:space="preserve"> </w:t>
       </w:r>
@@ -767,14 +767,14 @@
               <w:rPr>
                 <w:rFonts w:ascii="Calibri" w:hAnsi="Calibri"/>
                 <w:color w:val="FFFFFF"/>
-                <w:sz w:val="2"/>
+                <w:sz w:val="24"/>
               </w:rPr>
               <w:t>{% cellbg case.status_bg %}</w:t>
             </w:r>
             <w:r>
               <w:rPr>
                 <w:rFonts w:ascii="Calibri" w:hAnsi="Calibri"/>
-                <w:sz w:val="20"/>
+                <w:sz w:val="24"/>
               </w:rPr>
               <w:t>{{r case.status_rt }}</w:t>
             </w:r>
@@ -798,7 +798,7 @@
         <w:rPr>
           <w:rFonts w:ascii="Calibri" w:hAnsi="Calibri"/>
           <w:color w:val="FFFFFF"/>
-          <w:sz w:val="2"/>
+          <w:sz w:val="24"/>
         </w:rPr>
         <w:t>{% if case.has_info %}</w:t>
       </w:r>
@@ -810,7 +810,7 @@
       <w:r>
         <w:rPr>
           <w:rFonts w:ascii="Calibri" w:hAnsi="Calibri"/>
-          <w:sz w:val="18"/>
+          <w:sz w:val="24"/>
         </w:rPr>
         <w:t>{{r case.case_info_rt }}</w:t>
       </w:r>
@@ -823,7 +823,7 @@
         <w:rPr>
           <w:rFonts w:ascii="Calibri" w:hAnsi="Calibri"/>
           <w:color w:val="FFFFFF"/>
-          <w:sz w:val="2"/>
+          <w:sz w:val="24"/>
         </w:rPr>
         <w:t>{% endif %}</w:t>
       </w:r>
@@ -836,7 +836,7 @@
         <w:rPr>
           <w:rFonts w:ascii="Calibri" w:hAnsi="Calibri"/>
           <w:color w:val="FFFFFF"/>
-          <w:sz w:val="2"/>
+          <w:sz w:val="24"/>
         </w:rPr>
         <w:t>{% if case.has_detail %}</w:t>
       </w:r>
@@ -848,7 +848,7 @@
       <w:r>
         <w:rPr>
           <w:rFonts w:ascii="Calibri" w:hAnsi="Calibri"/>
-          <w:sz w:val="16"/>
+          <w:sz w:val="24"/>
         </w:rPr>
         <w:t>{{r case.detail_rt }}</w:t>
       </w:r>
@@ -861,7 +861,7 @@
         <w:rPr>
           <w:rFonts w:ascii="Calibri" w:hAnsi="Calibri"/>
           <w:color w:val="FFFFFF"/>
-          <w:sz w:val="2"/>
+          <w:sz w:val="24"/>
         </w:rPr>
         <w:t>{% endif %}</w:t>
       </w:r>
@@ -874,7 +874,7 @@
         <w:rPr>
           <w:rFonts w:ascii="Calibri" w:hAnsi="Calibri"/>
           <w:color w:val="FFFFFF"/>
-          <w:sz w:val="2"/>
+          <w:sz w:val="24"/>
         </w:rPr>
         <w:t>{% if case.has_counsel %}</w:t>
       </w:r>
@@ -886,7 +886,7 @@
       <w:r>
         <w:rPr>
           <w:rFonts w:ascii="Calibri" w:hAnsi="Calibri"/>
-          <w:sz w:val="16"/>
+          <w:sz w:val="24"/>
         </w:rPr>
         <w:t>{{r case.counsel_rt }}</w:t>
       </w:r>
@@ -899,7 +899,7 @@
         <w:rPr>
           <w:rFonts w:ascii="Calibri" w:hAnsi="Calibri"/>
           <w:color w:val="FFFFFF"/>
-          <w:sz w:val="2"/>
+          <w:sz w:val="24"/>
         </w:rPr>
         <w:t>{% endif %}</w:t>
       </w:r>
@@ -912,7 +912,7 @@
         <w:rPr>
           <w:rFonts w:ascii="Calibri" w:hAnsi="Calibri"/>
           <w:color w:val="FFFFFF"/>
-          <w:sz w:val="2"/>
+          <w:sz w:val="24"/>
         </w:rPr>
         <w:t>{% if case.summary %}</w:t>
       </w:r>
@@ -930,7 +930,7 @@
           <w:rFonts w:ascii="Calibri" w:hAnsi="Calibri"/>
           <w:i/>
           <w:color w:val="475569"/>
-          <w:sz w:val="16"/>
+          <w:sz w:val="24"/>
         </w:rPr>
         <w:t>{{ case.summary }}</w:t>
       </w:r>
@@ -943,7 +943,7 @@
         <w:rPr>
           <w:rFonts w:ascii="Calibri" w:hAnsi="Calibri"/>
           <w:color w:val="FFFFFF"/>
-          <w:sz w:val="2"/>
+          <w:sz w:val="24"/>
         </w:rPr>
         <w:t>{% endif %}</w:t>
       </w:r>
@@ -956,7 +956,7 @@
         <w:rPr>
           <w:rFonts w:ascii="Calibri" w:hAnsi="Calibri"/>
           <w:color w:val="FFFFFF"/>
-          <w:sz w:val="2"/>
+          <w:sz w:val="24"/>
         </w:rPr>
         <w:t>{% if case.other_proceedings %}</w:t>
       </w:r>
@@ -970,7 +970,7 @@
           <w:rFonts w:ascii="Calibri" w:hAnsi="Calibri"/>
           <w:b/>
           <w:color w:val="0F172A"/>
-          <w:sz w:val="15"/>
+          <w:sz w:val="24"/>
         </w:rPr>
         <w:t xml:space="preserve">Other Proceedings: </w:t>
       </w:r>
@@ -978,7 +978,7 @@
         <w:rPr>
           <w:rFonts w:ascii="Consolas" w:hAnsi="Consolas"/>
           <w:color w:val="475569"/>
-          <w:sz w:val="15"/>
+          <w:sz w:val="24"/>
         </w:rPr>
         <w:t>{{ case.other_proceedings }}</w:t>
       </w:r>
@@ -991,10 +991,15 @@
         <w:rPr>
           <w:rFonts w:ascii="Calibri" w:hAnsi="Calibri"/>
           <w:color w:val="FFFFFF"/>
-          <w:sz w:val="2"/>
+          <w:sz w:val="24"/>
         </w:rPr>
         <w:t>{% endif %}</w:t>
       </w:r>
+    </w:p>
+    <w:p>
+      <w:pPr>
+        <w:spacing w:before="80" w:after="0"/>
+      </w:pPr>
     </w:p>
     <w:p>
       <w:pPr>
@@ -1003,81 +1008,341 @@
       <w:r>
         <w:rPr>
           <w:rFonts w:ascii="Calibri" w:hAnsi="Calibri"/>
+          <w:sz w:val="2"/>
+          <w:szCs w:val="2"/>
           <w:color w:val="FFFFFF"/>
-          <w:sz w:val="2"/>
         </w:rPr>
-        <w:t>{% if case.has_timeline %}</w:t>
+        <w:t xml:space="preserve">{% if case.has_timeline %}</w:t>
       </w:r>
-    </w:p>
-    <w:p>
-      <w:pPr>
-        <w:spacing w:before="80" w:after="0"/>
-      </w:pPr>
     </w:p>
     <w:tbl>
       <w:tblPr>
-        <w:tblW w:type="auto" w:w="0"/>
-        <w:jc w:val="center"/>
-        <w:tblLayout w:type="autofit"/>
-        <w:tblLook w:firstColumn="1" w:firstRow="1" w:lastColumn="0" w:lastRow="0" w:noHBand="0" w:noVBand="1" w:val="04A0"/>
+        <w:tblLayout w:type="fixed"/>
+        <w:tblW w:w="10280" w:type="dxa"/>
         <w:tblBorders>
-          <w:top w:val="single" w:sz="2" w:color="E2E8F0" w:space="0"/>
-          <w:left w:val="single" w:sz="2" w:color="E2E8F0" w:space="0"/>
-          <w:bottom w:val="single" w:sz="2" w:color="E2E8F0" w:space="0"/>
-          <w:right w:val="single" w:sz="2" w:color="E2E8F0" w:space="0"/>
-          <w:insideH w:val="single" w:sz="2" w:color="E2E8F0" w:space="0"/>
-          <w:insideV w:val="single" w:sz="2" w:color="E2E8F0" w:space="0"/>
+          <w:top w:val="none" w:sz="0" w:space="0" w:color="auto"/>
+          <w:left w:val="none" w:sz="0" w:space="0" w:color="auto"/>
+          <w:bottom w:val="none" w:sz="0" w:space="0" w:color="auto"/>
+          <w:right w:val="none" w:sz="0" w:space="0" w:color="auto"/>
+          <w:insideH w:val="none" w:sz="0" w:space="0" w:color="auto"/>
+          <w:insideV w:val="none" w:sz="0" w:space="0" w:color="auto"/>
         </w:tblBorders>
+        <w:tblCellMar>
+          <w:top w:w="28" w:type="dxa"/>
+          <w:bottom w:w="28" w:type="dxa"/>
+          <w:start w:w="58" w:type="dxa"/>
+          <w:end w:w="58" w:type="dxa"/>
+        </w:tblCellMar>
       </w:tblPr>
       <w:tblGrid>
-        <w:gridCol w:w="2074"/>
-        <w:gridCol w:w="2074"/>
-        <w:gridCol w:w="2074"/>
-        <w:gridCol w:w="2074"/>
-        <w:gridCol w:w="2074"/>
+        <w:gridCol w:w="5040"/>
+        <w:gridCol w:w="200"/>
+        <w:gridCol w:w="5040"/>
       </w:tblGrid>
       <w:tr>
         <w:tc>
           <w:tcPr>
-            <w:tcW w:type="dxa" w:w="4148"/>
-            <w:gridSpan w:val="2"/>
-            <w:shd w:fill="F8FAFC"/>
-            <w:tcMar>
-              <w:top w:w="20" w:type="dxa"/>
-              <w:bottom w:w="20" w:type="dxa"/>
-              <w:start w:w="55" w:type="dxa"/>
-              <w:end w:w="55" w:type="dxa"/>
-            </w:tcMar>
+            <w:tcW w:w="5040" w:type="dxa"/>
             <w:tcBorders>
-              <w:bottom w:val="single" w:sz="4" w:color="CBD5E1" w:space="0"/>
+              <w:top w:val="none" w:sz="0" w:space="0" w:color="auto"/>
+              <w:left w:val="none" w:sz="0" w:space="0" w:color="auto"/>
+              <w:bottom w:val="none" w:sz="0" w:space="0" w:color="auto"/>
+              <w:right w:val="none" w:sz="0" w:space="0" w:color="auto"/>
             </w:tcBorders>
           </w:tcPr>
+          <w:tbl>
+            <w:tblPr>
+              <w:tblLayout w:type="fixed"/>
+              <w:tblW w:w="5040" w:type="dxa"/>
+              <w:tblBorders>
+                <w:top w:val="none" w:sz="0" w:space="0" w:color="auto"/>
+                <w:left w:val="none" w:sz="0" w:space="0" w:color="auto"/>
+                <w:bottom w:val="none" w:sz="0" w:space="0" w:color="auto"/>
+                <w:right w:val="none" w:sz="0" w:space="0" w:color="auto"/>
+                <w:insideH w:val="none" w:sz="0" w:space="0" w:color="auto"/>
+                <w:insideV w:val="none" w:sz="0" w:space="0" w:color="auto"/>
+              </w:tblBorders>
+              <w:tblCellMar>
+                <w:top w:w="28" w:type="dxa"/>
+                <w:bottom w:w="28" w:type="dxa"/>
+                <w:start w:w="58" w:type="dxa"/>
+                <w:end w:w="58" w:type="dxa"/>
+              </w:tblCellMar>
+            </w:tblPr>
+            <w:tblGrid>
+              <w:gridCol w:w="1800"/>
+              <w:gridCol w:w="3240"/>
+            </w:tblGrid>
+            <w:tr>
+              <w:tc>
+                <w:tcPr>
+                  <w:tcW w:w="5040" w:type="dxa"/>
+                  <w:gridSpan w:val="2"/>
+                  <w:shd w:val="clear" w:color="auto" w:fill="1E293B"/>
+                </w:tcPr>
+                <w:p>
+                  <w:pPr>
+                    <w:spacing w:before="30" w:after="30"/>
+                  </w:pPr>
+                  <w:r>
+                    <w:rPr>
+                      <w:rFonts w:ascii="Calibri" w:hAnsi="Calibri"/>
+                      <w:sz w:val="24"/>
+                      <w:szCs w:val="24"/>
+                      <w:b/>
+                      <w:color w:val="FFFFFF"/>
+                    </w:rPr>
+                    <w:t xml:space="preserve">Events</w:t>
+                  </w:r>
+                </w:p>
+              </w:tc>
+            </w:tr>
+            <w:tr>
+              <w:tc>
+                <w:tcPr>
+                  <w:tcW w:w="1800" w:type="dxa"/>
+                  <w:shd w:val="clear" w:color="auto" w:fill="F1F5F9"/>
+                  <w:tcBorders>
+                    <w:top w:val="none" w:sz="0" w:space="0" w:color="auto"/>
+                    <w:left w:val="none" w:sz="0" w:space="0" w:color="auto"/>
+                    <w:bottom w:val="none" w:sz="0" w:space="0" w:color="auto"/>
+                    <w:right w:val="none" w:sz="0" w:space="0" w:color="auto"/>
+                  </w:tcBorders>
+                </w:tcPr>
+                <w:p>
+                  <w:pPr>
+                    <w:spacing w:before="20" w:after="20"/>
+                  </w:pPr>
+                  <w:r>
+                    <w:rPr>
+                      <w:rFonts w:ascii="Calibri" w:hAnsi="Calibri"/>
+                      <w:sz w:val="24"/>
+                      <w:szCs w:val="24"/>
+                      <w:b/>
+                      <w:color w:val="64748B"/>
+                    </w:rPr>
+                    <w:t xml:space="preserve">Date</w:t>
+                  </w:r>
+                </w:p>
+              </w:tc>
+              <w:tc>
+                <w:tcPr>
+                  <w:tcW w:w="3240" w:type="dxa"/>
+                  <w:shd w:val="clear" w:color="auto" w:fill="F1F5F9"/>
+                  <w:tcBorders>
+                    <w:top w:val="none" w:sz="0" w:space="0" w:color="auto"/>
+                    <w:left w:val="none" w:sz="0" w:space="0" w:color="auto"/>
+                    <w:bottom w:val="none" w:sz="0" w:space="0" w:color="auto"/>
+                    <w:right w:val="none" w:sz="0" w:space="0" w:color="auto"/>
+                  </w:tcBorders>
+                </w:tcPr>
+                <w:p>
+                  <w:pPr>
+                    <w:spacing w:before="20" w:after="20"/>
+                  </w:pPr>
+                  <w:r>
+                    <w:rPr>
+                      <w:rFonts w:ascii="Calibri" w:hAnsi="Calibri"/>
+                      <w:sz w:val="24"/>
+                      <w:szCs w:val="24"/>
+                      <w:b/>
+                      <w:color w:val="64748B"/>
+                    </w:rPr>
+                    <w:t xml:space="preserve">Description</w:t>
+                  </w:r>
+                </w:p>
+              </w:tc>
+            </w:tr>
+            <w:tr>
+              <w:tc>
+                <w:tcPr>
+                  <w:tcW w:w="1800" w:type="dxa"/>
+                  <w:tcBorders>
+                    <w:top w:val="none" w:sz="0" w:space="0" w:color="auto"/>
+                    <w:left w:val="none" w:sz="0" w:space="0" w:color="auto"/>
+                    <w:bottom w:val="none" w:sz="0" w:space="0" w:color="auto"/>
+                    <w:right w:val="none" w:sz="0" w:space="0" w:color="auto"/>
+                  </w:tcBorders>
+                </w:tcPr>
+                <w:p>
+                  <w:pPr>
+                    <w:spacing w:before="0" w:after="0" w:line="1" w:lineRule="exact"/>
+                  </w:pPr>
+                  <w:r>
+                    <w:rPr>
+                      <w:rFonts w:ascii="Calibri" w:hAnsi="Calibri"/>
+                      <w:sz w:val="2"/>
+                      <w:szCs w:val="2"/>
+                      <w:color w:val="FFFFFF"/>
+                    </w:rPr>
+                    <w:t xml:space="preserve">{%tr for ev in case.event_items %}</w:t>
+                  </w:r>
+                </w:p>
+              </w:tc>
+              <w:tc>
+                <w:tcPr>
+                  <w:tcW w:w="3240" w:type="dxa"/>
+                  <w:tcBorders>
+                    <w:top w:val="none" w:sz="0" w:space="0" w:color="auto"/>
+                    <w:left w:val="none" w:sz="0" w:space="0" w:color="auto"/>
+                    <w:bottom w:val="none" w:sz="0" w:space="0" w:color="auto"/>
+                    <w:right w:val="none" w:sz="0" w:space="0" w:color="auto"/>
+                  </w:tcBorders>
+                </w:tcPr>
+                <w:p>
+                  <w:pPr>
+                    <w:spacing w:before="0" w:after="0" w:line="1" w:lineRule="exact"/>
+                  </w:pPr>
+                  <w:r>
+                    <w:rPr>
+                      <w:rFonts w:ascii="Calibri" w:hAnsi="Calibri"/>
+                      <w:sz w:val="2"/>
+                      <w:szCs w:val="2"/>
+                      <w:color w:val="FFFFFF"/>
+                    </w:rPr>
+                    <w:t xml:space="preserve"/>
+                  </w:r>
+                </w:p>
+              </w:tc>
+            </w:tr>
+            <w:tr>
+              <w:tc>
+                <w:tcPr>
+                  <w:tcW w:w="1800" w:type="dxa"/>
+                  <w:tcBorders>
+                    <w:top w:val="none" w:sz="0" w:space="0" w:color="auto"/>
+                    <w:left w:val="none" w:sz="0" w:space="0" w:color="auto"/>
+                    <w:bottom w:val="none" w:sz="0" w:space="0" w:color="auto"/>
+                    <w:right w:val="none" w:sz="0" w:space="0" w:color="auto"/>
+                  </w:tcBorders>
+                </w:tcPr>
+                <w:p>
+                  <w:pPr>
+                    <w:spacing w:before="0" w:after="0"/>
+                  </w:pPr>
+                  <w:r>
+                    <w:rPr>
+                      <w:rFonts w:ascii="Calibri" w:hAnsi="Calibri"/>
+                      <w:sz w:val="2"/>
+                      <w:szCs w:val="2"/>
+                      <w:color w:val="FFFFFF"/>
+                    </w:rPr>
+                    <w:t xml:space="preserve">{% cellbg ev.bg %}</w:t>
+                  </w:r>
+                  <w:r>
+                    <w:rPr>
+                      <w:rFonts w:ascii="Calibri" w:hAnsi="Calibri"/>
+                      <w:sz w:val="24"/>
+                      <w:szCs w:val="24"/>
+                      <w:color w:val="0F172A"/>
+                    </w:rPr>
+                    <w:t xml:space="preserve">{{r ev.date_rt }}</w:t>
+                  </w:r>
+                </w:p>
+              </w:tc>
+              <w:tc>
+                <w:tcPr>
+                  <w:tcW w:w="3240" w:type="dxa"/>
+                  <w:tcBorders>
+                    <w:top w:val="none" w:sz="0" w:space="0" w:color="auto"/>
+                    <w:left w:val="none" w:sz="0" w:space="0" w:color="auto"/>
+                    <w:bottom w:val="none" w:sz="0" w:space="0" w:color="auto"/>
+                    <w:right w:val="none" w:sz="0" w:space="0" w:color="auto"/>
+                  </w:tcBorders>
+                </w:tcPr>
+                <w:p>
+                  <w:pPr>
+                    <w:spacing w:before="0" w:after="0"/>
+                  </w:pPr>
+                  <w:r>
+                    <w:rPr>
+                      <w:rFonts w:ascii="Calibri" w:hAnsi="Calibri"/>
+                      <w:sz w:val="2"/>
+                      <w:szCs w:val="2"/>
+                      <w:color w:val="FFFFFF"/>
+                    </w:rPr>
+                    <w:t xml:space="preserve">{% cellbg ev.bg %}</w:t>
+                  </w:r>
+                  <w:r>
+                    <w:rPr>
+                      <w:rFonts w:ascii="Calibri" w:hAnsi="Calibri"/>
+                      <w:sz w:val="24"/>
+                      <w:szCs w:val="24"/>
+                      <w:color w:val="0F172A"/>
+                    </w:rPr>
+                    <w:t xml:space="preserve">{{r ev.desc_rt }}</w:t>
+                  </w:r>
+                </w:p>
+              </w:tc>
+            </w:tr>
+            <w:tr>
+              <w:tc>
+                <w:tcPr>
+                  <w:tcW w:w="1800" w:type="dxa"/>
+                  <w:tcBorders>
+                    <w:top w:val="none" w:sz="0" w:space="0" w:color="auto"/>
+                    <w:left w:val="none" w:sz="0" w:space="0" w:color="auto"/>
+                    <w:bottom w:val="none" w:sz="0" w:space="0" w:color="auto"/>
+                    <w:right w:val="none" w:sz="0" w:space="0" w:color="auto"/>
+                  </w:tcBorders>
+                </w:tcPr>
+                <w:p>
+                  <w:pPr>
+                    <w:spacing w:before="0" w:after="0" w:line="1" w:lineRule="exact"/>
+                  </w:pPr>
+                  <w:r>
+                    <w:rPr>
+                      <w:rFonts w:ascii="Calibri" w:hAnsi="Calibri"/>
+                      <w:sz w:val="2"/>
+                      <w:szCs w:val="2"/>
+                      <w:color w:val="FFFFFF"/>
+                    </w:rPr>
+                    <w:t xml:space="preserve">{%tr endfor %}</w:t>
+                  </w:r>
+                </w:p>
+              </w:tc>
+              <w:tc>
+                <w:tcPr>
+                  <w:tcW w:w="3240" w:type="dxa"/>
+                  <w:tcBorders>
+                    <w:top w:val="none" w:sz="0" w:space="0" w:color="auto"/>
+                    <w:left w:val="none" w:sz="0" w:space="0" w:color="auto"/>
+                    <w:bottom w:val="none" w:sz="0" w:space="0" w:color="auto"/>
+                    <w:right w:val="none" w:sz="0" w:space="0" w:color="auto"/>
+                  </w:tcBorders>
+                </w:tcPr>
+                <w:p>
+                  <w:pPr>
+                    <w:spacing w:before="0" w:after="0" w:line="1" w:lineRule="exact"/>
+                  </w:pPr>
+                  <w:r>
+                    <w:rPr>
+                      <w:rFonts w:ascii="Calibri" w:hAnsi="Calibri"/>
+                      <w:sz w:val="2"/>
+                      <w:szCs w:val="2"/>
+                      <w:color w:val="FFFFFF"/>
+                    </w:rPr>
+                    <w:t xml:space="preserve"/>
+                  </w:r>
+                </w:p>
+              </w:tc>
+            </w:tr>
+          </w:tbl>
           <w:p>
             <w:pPr>
               <w:spacing w:before="0" w:after="0"/>
             </w:pPr>
-            <w:r>
-              <w:rPr>
-                <w:rFonts w:ascii="Calibri" w:hAnsi="Calibri"/>
-                <w:b/>
-                <w:color w:val="0F172A"/>
-                <w:sz w:val="16"/>
-              </w:rPr>
-              <w:t>Events</w:t>
-            </w:r>
           </w:p>
         </w:tc>
         <w:tc>
           <w:tcPr>
-            <w:tcW w:type="dxa" w:w="2074"/>
-            <w:shd w:fill="FFFFFF"/>
-            <w:tcW w:w="144" w:type="dxa"/>
-            <w:tcMar>
-              <w:top w:w="0" w:type="dxa"/>
-              <w:bottom w:w="0" w:type="dxa"/>
-              <w:start w:w="0" w:type="dxa"/>
-              <w:end w:w="0" w:type="dxa"/>
-            </w:tcMar>
+            <w:tcW w:w="200" w:type="dxa"/>
+            <w:tcBorders>
+              <w:top w:val="none" w:sz="0" w:space="0" w:color="auto"/>
+              <w:left w:val="none" w:sz="0" w:space="0" w:color="auto"/>
+              <w:bottom w:val="none" w:sz="0" w:space="0" w:color="auto"/>
+              <w:right w:val="none" w:sz="0" w:space="0" w:color="auto"/>
+            </w:tcBorders>
           </w:tcPr>
           <w:p>
             <w:pPr>
@@ -1087,418 +1352,319 @@
         </w:tc>
         <w:tc>
           <w:tcPr>
-            <w:tcW w:type="dxa" w:w="4148"/>
-            <w:gridSpan w:val="2"/>
-            <w:shd w:fill="F8FAFC"/>
-            <w:tcMar>
-              <w:top w:w="20" w:type="dxa"/>
-              <w:bottom w:w="20" w:type="dxa"/>
-              <w:start w:w="55" w:type="dxa"/>
-              <w:end w:w="55" w:type="dxa"/>
-            </w:tcMar>
+            <w:tcW w:w="5040" w:type="dxa"/>
             <w:tcBorders>
-              <w:bottom w:val="single" w:sz="4" w:color="CBD5E1" w:space="0"/>
+              <w:top w:val="none" w:sz="0" w:space="0" w:color="auto"/>
+              <w:left w:val="none" w:sz="0" w:space="0" w:color="auto"/>
+              <w:bottom w:val="none" w:sz="0" w:space="0" w:color="auto"/>
+              <w:right w:val="none" w:sz="0" w:space="0" w:color="auto"/>
             </w:tcBorders>
           </w:tcPr>
           <w:p>
             <w:pPr>
-              <w:spacing w:before="0" w:after="0"/>
+              <w:spacing w:before="0" w:after="0" w:line="1" w:lineRule="exact"/>
             </w:pPr>
             <w:r>
               <w:rPr>
                 <w:rFonts w:ascii="Calibri" w:hAnsi="Calibri"/>
-                <w:b/>
-                <w:color w:val="0F172A"/>
-                <w:sz w:val="16"/>
+                <w:sz w:val="2"/>
+                <w:szCs w:val="2"/>
+                <w:color w:val="FFFFFF"/>
               </w:rPr>
-              <w:t>Tasks</w:t>
+              <w:t xml:space="preserve">{% if case.has_tasks %}</w:t>
             </w:r>
           </w:p>
-        </w:tc>
-      </w:tr>
-      <w:tr>
-        <w:tc>
-          <w:tcPr>
-            <w:tcW w:type="dxa" w:w="2074"/>
-            <w:tcMar>
-              <w:top w:w="14" w:type="dxa"/>
-              <w:bottom w:w="14" w:type="dxa"/>
-              <w:start w:w="55" w:type="dxa"/>
-              <w:end w:w="55" w:type="dxa"/>
-            </w:tcMar>
-            <w:tcW w:w="1728" w:type="dxa"/>
-          </w:tcPr>
+          <w:tbl>
+            <w:tblPr>
+              <w:tblLayout w:type="fixed"/>
+              <w:tblW w:w="5040" w:type="dxa"/>
+              <w:tblBorders>
+                <w:top w:val="none" w:sz="0" w:space="0" w:color="auto"/>
+                <w:left w:val="none" w:sz="0" w:space="0" w:color="auto"/>
+                <w:bottom w:val="none" w:sz="0" w:space="0" w:color="auto"/>
+                <w:right w:val="none" w:sz="0" w:space="0" w:color="auto"/>
+                <w:insideH w:val="none" w:sz="0" w:space="0" w:color="auto"/>
+                <w:insideV w:val="none" w:sz="0" w:space="0" w:color="auto"/>
+              </w:tblBorders>
+              <w:tblCellMar>
+                <w:top w:w="28" w:type="dxa"/>
+                <w:bottom w:w="28" w:type="dxa"/>
+                <w:start w:w="58" w:type="dxa"/>
+                <w:end w:w="58" w:type="dxa"/>
+              </w:tblCellMar>
+            </w:tblPr>
+            <w:tblGrid>
+              <w:gridCol w:w="1800"/>
+              <w:gridCol w:w="3240"/>
+            </w:tblGrid>
+            <w:tr>
+              <w:tc>
+                <w:tcPr>
+                  <w:tcW w:w="5040" w:type="dxa"/>
+                  <w:gridSpan w:val="2"/>
+                  <w:shd w:val="clear" w:color="auto" w:fill="1E293B"/>
+                </w:tcPr>
+                <w:p>
+                  <w:pPr>
+                    <w:spacing w:before="30" w:after="30"/>
+                  </w:pPr>
+                  <w:r>
+                    <w:rPr>
+                      <w:rFonts w:ascii="Calibri" w:hAnsi="Calibri"/>
+                      <w:sz w:val="24"/>
+                      <w:szCs w:val="24"/>
+                      <w:b/>
+                      <w:color w:val="FFFFFF"/>
+                    </w:rPr>
+                    <w:t xml:space="preserve">Tasks</w:t>
+                  </w:r>
+                </w:p>
+              </w:tc>
+            </w:tr>
+            <w:tr>
+              <w:tc>
+                <w:tcPr>
+                  <w:tcW w:w="1800" w:type="dxa"/>
+                  <w:shd w:val="clear" w:color="auto" w:fill="F1F5F9"/>
+                  <w:tcBorders>
+                    <w:top w:val="none" w:sz="0" w:space="0" w:color="auto"/>
+                    <w:left w:val="none" w:sz="0" w:space="0" w:color="auto"/>
+                    <w:bottom w:val="none" w:sz="0" w:space="0" w:color="auto"/>
+                    <w:right w:val="none" w:sz="0" w:space="0" w:color="auto"/>
+                  </w:tcBorders>
+                </w:tcPr>
+                <w:p>
+                  <w:pPr>
+                    <w:spacing w:before="20" w:after="20"/>
+                  </w:pPr>
+                  <w:r>
+                    <w:rPr>
+                      <w:rFonts w:ascii="Calibri" w:hAnsi="Calibri"/>
+                      <w:sz w:val="24"/>
+                      <w:szCs w:val="24"/>
+                      <w:b/>
+                      <w:color w:val="64748B"/>
+                    </w:rPr>
+                    <w:t xml:space="preserve">Due</w:t>
+                  </w:r>
+                </w:p>
+              </w:tc>
+              <w:tc>
+                <w:tcPr>
+                  <w:tcW w:w="3240" w:type="dxa"/>
+                  <w:shd w:val="clear" w:color="auto" w:fill="F1F5F9"/>
+                  <w:tcBorders>
+                    <w:top w:val="none" w:sz="0" w:space="0" w:color="auto"/>
+                    <w:left w:val="none" w:sz="0" w:space="0" w:color="auto"/>
+                    <w:bottom w:val="none" w:sz="0" w:space="0" w:color="auto"/>
+                    <w:right w:val="none" w:sz="0" w:space="0" w:color="auto"/>
+                  </w:tcBorders>
+                </w:tcPr>
+                <w:p>
+                  <w:pPr>
+                    <w:spacing w:before="20" w:after="20"/>
+                  </w:pPr>
+                  <w:r>
+                    <w:rPr>
+                      <w:rFonts w:ascii="Calibri" w:hAnsi="Calibri"/>
+                      <w:sz w:val="24"/>
+                      <w:szCs w:val="24"/>
+                      <w:b/>
+                      <w:color w:val="64748B"/>
+                    </w:rPr>
+                    <w:t xml:space="preserve">Description</w:t>
+                  </w:r>
+                </w:p>
+              </w:tc>
+            </w:tr>
+            <w:tr>
+              <w:tc>
+                <w:tcPr>
+                  <w:tcW w:w="1800" w:type="dxa"/>
+                  <w:tcBorders>
+                    <w:top w:val="none" w:sz="0" w:space="0" w:color="auto"/>
+                    <w:left w:val="none" w:sz="0" w:space="0" w:color="auto"/>
+                    <w:bottom w:val="none" w:sz="0" w:space="0" w:color="auto"/>
+                    <w:right w:val="none" w:sz="0" w:space="0" w:color="auto"/>
+                  </w:tcBorders>
+                </w:tcPr>
+                <w:p>
+                  <w:pPr>
+                    <w:spacing w:before="0" w:after="0" w:line="1" w:lineRule="exact"/>
+                  </w:pPr>
+                  <w:r>
+                    <w:rPr>
+                      <w:rFonts w:ascii="Calibri" w:hAnsi="Calibri"/>
+                      <w:sz w:val="2"/>
+                      <w:szCs w:val="2"/>
+                      <w:color w:val="FFFFFF"/>
+                    </w:rPr>
+                    <w:t xml:space="preserve">{%tr for tk in case.task_items %}</w:t>
+                  </w:r>
+                </w:p>
+              </w:tc>
+              <w:tc>
+                <w:tcPr>
+                  <w:tcW w:w="3240" w:type="dxa"/>
+                  <w:tcBorders>
+                    <w:top w:val="none" w:sz="0" w:space="0" w:color="auto"/>
+                    <w:left w:val="none" w:sz="0" w:space="0" w:color="auto"/>
+                    <w:bottom w:val="none" w:sz="0" w:space="0" w:color="auto"/>
+                    <w:right w:val="none" w:sz="0" w:space="0" w:color="auto"/>
+                  </w:tcBorders>
+                </w:tcPr>
+                <w:p>
+                  <w:pPr>
+                    <w:spacing w:before="0" w:after="0" w:line="1" w:lineRule="exact"/>
+                  </w:pPr>
+                  <w:r>
+                    <w:rPr>
+                      <w:rFonts w:ascii="Calibri" w:hAnsi="Calibri"/>
+                      <w:sz w:val="2"/>
+                      <w:szCs w:val="2"/>
+                      <w:color w:val="FFFFFF"/>
+                    </w:rPr>
+                    <w:t xml:space="preserve"/>
+                  </w:r>
+                </w:p>
+              </w:tc>
+            </w:tr>
+            <w:tr>
+              <w:tc>
+                <w:tcPr>
+                  <w:tcW w:w="1800" w:type="dxa"/>
+                  <w:tcBorders>
+                    <w:top w:val="none" w:sz="0" w:space="0" w:color="auto"/>
+                    <w:left w:val="none" w:sz="0" w:space="0" w:color="auto"/>
+                    <w:bottom w:val="none" w:sz="0" w:space="0" w:color="auto"/>
+                    <w:right w:val="none" w:sz="0" w:space="0" w:color="auto"/>
+                  </w:tcBorders>
+                </w:tcPr>
+                <w:p>
+                  <w:pPr>
+                    <w:spacing w:before="0" w:after="0"/>
+                  </w:pPr>
+                  <w:r>
+                    <w:rPr>
+                      <w:rFonts w:ascii="Calibri" w:hAnsi="Calibri"/>
+                      <w:sz w:val="2"/>
+                      <w:szCs w:val="2"/>
+                      <w:color w:val="FFFFFF"/>
+                    </w:rPr>
+                    <w:t xml:space="preserve">{% cellbg tk.bg %}</w:t>
+                  </w:r>
+                  <w:r>
+                    <w:rPr>
+                      <w:rFonts w:ascii="Calibri" w:hAnsi="Calibri"/>
+                      <w:sz w:val="24"/>
+                      <w:szCs w:val="24"/>
+                      <w:color w:val="0F172A"/>
+                    </w:rPr>
+                    <w:t xml:space="preserve">{{r tk.date_rt }}</w:t>
+                  </w:r>
+                </w:p>
+              </w:tc>
+              <w:tc>
+                <w:tcPr>
+                  <w:tcW w:w="3240" w:type="dxa"/>
+                  <w:tcBorders>
+                    <w:top w:val="none" w:sz="0" w:space="0" w:color="auto"/>
+                    <w:left w:val="none" w:sz="0" w:space="0" w:color="auto"/>
+                    <w:bottom w:val="none" w:sz="0" w:space="0" w:color="auto"/>
+                    <w:right w:val="none" w:sz="0" w:space="0" w:color="auto"/>
+                  </w:tcBorders>
+                </w:tcPr>
+                <w:p>
+                  <w:pPr>
+                    <w:spacing w:before="0" w:after="0"/>
+                  </w:pPr>
+                  <w:r>
+                    <w:rPr>
+                      <w:rFonts w:ascii="Calibri" w:hAnsi="Calibri"/>
+                      <w:sz w:val="2"/>
+                      <w:szCs w:val="2"/>
+                      <w:color w:val="FFFFFF"/>
+                    </w:rPr>
+                    <w:t xml:space="preserve">{% cellbg tk.bg %}</w:t>
+                  </w:r>
+                  <w:r>
+                    <w:rPr>
+                      <w:rFonts w:ascii="Calibri" w:hAnsi="Calibri"/>
+                      <w:sz w:val="24"/>
+                      <w:szCs w:val="24"/>
+                      <w:color w:val="0F172A"/>
+                    </w:rPr>
+                    <w:t xml:space="preserve">{{r tk.desc_rt }}</w:t>
+                  </w:r>
+                </w:p>
+              </w:tc>
+            </w:tr>
+            <w:tr>
+              <w:tc>
+                <w:tcPr>
+                  <w:tcW w:w="1800" w:type="dxa"/>
+                  <w:tcBorders>
+                    <w:top w:val="none" w:sz="0" w:space="0" w:color="auto"/>
+                    <w:left w:val="none" w:sz="0" w:space="0" w:color="auto"/>
+                    <w:bottom w:val="none" w:sz="0" w:space="0" w:color="auto"/>
+                    <w:right w:val="none" w:sz="0" w:space="0" w:color="auto"/>
+                  </w:tcBorders>
+                </w:tcPr>
+                <w:p>
+                  <w:pPr>
+                    <w:spacing w:before="0" w:after="0" w:line="1" w:lineRule="exact"/>
+                  </w:pPr>
+                  <w:r>
+                    <w:rPr>
+                      <w:rFonts w:ascii="Calibri" w:hAnsi="Calibri"/>
+                      <w:sz w:val="2"/>
+                      <w:szCs w:val="2"/>
+                      <w:color w:val="FFFFFF"/>
+                    </w:rPr>
+                    <w:t xml:space="preserve">{%tr endfor %}</w:t>
+                  </w:r>
+                </w:p>
+              </w:tc>
+              <w:tc>
+                <w:tcPr>
+                  <w:tcW w:w="3240" w:type="dxa"/>
+                  <w:tcBorders>
+                    <w:top w:val="none" w:sz="0" w:space="0" w:color="auto"/>
+                    <w:left w:val="none" w:sz="0" w:space="0" w:color="auto"/>
+                    <w:bottom w:val="none" w:sz="0" w:space="0" w:color="auto"/>
+                    <w:right w:val="none" w:sz="0" w:space="0" w:color="auto"/>
+                  </w:tcBorders>
+                </w:tcPr>
+                <w:p>
+                  <w:pPr>
+                    <w:spacing w:before="0" w:after="0" w:line="1" w:lineRule="exact"/>
+                  </w:pPr>
+                  <w:r>
+                    <w:rPr>
+                      <w:rFonts w:ascii="Calibri" w:hAnsi="Calibri"/>
+                      <w:sz w:val="2"/>
+                      <w:szCs w:val="2"/>
+                      <w:color w:val="FFFFFF"/>
+                    </w:rPr>
+                    <w:t xml:space="preserve"/>
+                  </w:r>
+                </w:p>
+              </w:tc>
+            </w:tr>
+          </w:tbl>
           <w:p>
             <w:pPr>
-              <w:spacing w:before="0" w:after="0"/>
+              <w:spacing w:before="0" w:after="0" w:line="1" w:lineRule="exact"/>
             </w:pPr>
             <w:r>
               <w:rPr>
                 <w:rFonts w:ascii="Calibri" w:hAnsi="Calibri"/>
-                <w:color w:val="94A3B8"/>
-                <w:sz w:val="12"/>
+                <w:sz w:val="2"/>
+                <w:szCs w:val="2"/>
+                <w:color w:val="FFFFFF"/>
               </w:rPr>
-              <w:t>Date</w:t>
+              <w:t xml:space="preserve">{% endif %}</w:t>
             </w:r>
-          </w:p>
-        </w:tc>
-        <w:tc>
-          <w:tcPr>
-            <w:tcW w:type="dxa" w:w="2074"/>
-            <w:tcMar>
-              <w:top w:w="14" w:type="dxa"/>
-              <w:bottom w:w="14" w:type="dxa"/>
-              <w:start w:w="55" w:type="dxa"/>
-              <w:end w:w="55" w:type="dxa"/>
-            </w:tcMar>
-            <w:tcW w:w="3384" w:type="dxa"/>
-          </w:tcPr>
-          <w:p>
-            <w:pPr>
-              <w:spacing w:before="0" w:after="0"/>
-            </w:pPr>
-            <w:r>
-              <w:rPr>
-                <w:rFonts w:ascii="Calibri" w:hAnsi="Calibri"/>
-                <w:color w:val="94A3B8"/>
-                <w:sz w:val="12"/>
-              </w:rPr>
-              <w:t>Description</w:t>
-            </w:r>
-          </w:p>
-        </w:tc>
-        <w:tc>
-          <w:tcPr>
-            <w:tcW w:type="dxa" w:w="2074"/>
-            <w:shd w:fill="FFFFFF"/>
-            <w:tcW w:w="144" w:type="dxa"/>
-            <w:tcMar>
-              <w:top w:w="0" w:type="dxa"/>
-              <w:bottom w:w="0" w:type="dxa"/>
-              <w:start w:w="0" w:type="dxa"/>
-              <w:end w:w="0" w:type="dxa"/>
-            </w:tcMar>
-          </w:tcPr>
-          <w:p>
-            <w:pPr>
-              <w:spacing w:before="0" w:after="0"/>
-            </w:pPr>
-          </w:p>
-        </w:tc>
-        <w:tc>
-          <w:tcPr>
-            <w:tcW w:type="dxa" w:w="2074"/>
-            <w:tcMar>
-              <w:top w:w="14" w:type="dxa"/>
-              <w:bottom w:w="14" w:type="dxa"/>
-              <w:start w:w="55" w:type="dxa"/>
-              <w:end w:w="55" w:type="dxa"/>
-            </w:tcMar>
-            <w:tcW w:w="1440" w:type="dxa"/>
-          </w:tcPr>
-          <w:p>
-            <w:pPr>
-              <w:spacing w:before="0" w:after="0"/>
-            </w:pPr>
-            <w:r>
-              <w:rPr>
-                <w:rFonts w:ascii="Calibri" w:hAnsi="Calibri"/>
-                <w:color w:val="94A3B8"/>
-                <w:sz w:val="12"/>
-              </w:rPr>
-              <w:t>Due</w:t>
-            </w:r>
-          </w:p>
-        </w:tc>
-        <w:tc>
-          <w:tcPr>
-            <w:tcW w:type="dxa" w:w="2074"/>
-            <w:tcMar>
-              <w:top w:w="14" w:type="dxa"/>
-              <w:bottom w:w="14" w:type="dxa"/>
-              <w:start w:w="55" w:type="dxa"/>
-              <w:end w:w="55" w:type="dxa"/>
-            </w:tcMar>
-            <w:tcW w:w="3671" w:type="dxa"/>
-          </w:tcPr>
-          <w:p>
-            <w:pPr>
-              <w:spacing w:before="0" w:after="0"/>
-            </w:pPr>
-            <w:r>
-              <w:rPr>
-                <w:rFonts w:ascii="Calibri" w:hAnsi="Calibri"/>
-                <w:color w:val="94A3B8"/>
-                <w:sz w:val="12"/>
-              </w:rPr>
-              <w:t>Description</w:t>
-            </w:r>
-          </w:p>
-        </w:tc>
-      </w:tr>
-      <w:tr>
-        <w:tc>
-          <w:tcPr>
-            <w:tcW w:type="dxa" w:w="2074"/>
-          </w:tcPr>
-          <w:p>
-            <w:pPr>
-              <w:spacing w:before="0" w:after="0"/>
-            </w:pPr>
-            <w:r>
-              <w:rPr>
-                <w:rFonts w:ascii="Calibri" w:hAnsi="Calibri"/>
-                <w:sz w:val="16"/>
-              </w:rPr>
-              <w:t>{%tr for item in case.timeline %}</w:t>
-            </w:r>
-          </w:p>
-        </w:tc>
-        <w:tc>
-          <w:tcPr>
-            <w:tcW w:type="dxa" w:w="2074"/>
-          </w:tcPr>
-          <w:p>
-            <w:pPr>
-              <w:spacing w:before="0" w:after="0"/>
-            </w:pPr>
-          </w:p>
-        </w:tc>
-        <w:tc>
-          <w:tcPr>
-            <w:tcW w:type="dxa" w:w="2074"/>
-          </w:tcPr>
-          <w:p>
-            <w:pPr>
-              <w:spacing w:before="0" w:after="0"/>
-            </w:pPr>
-          </w:p>
-        </w:tc>
-        <w:tc>
-          <w:tcPr>
-            <w:tcW w:type="dxa" w:w="2074"/>
-          </w:tcPr>
-          <w:p>
-            <w:pPr>
-              <w:spacing w:before="0" w:after="0"/>
-            </w:pPr>
-          </w:p>
-        </w:tc>
-        <w:tc>
-          <w:tcPr>
-            <w:tcW w:type="dxa" w:w="2074"/>
-          </w:tcPr>
-          <w:p>
-            <w:pPr>
-              <w:spacing w:before="0" w:after="0"/>
-            </w:pPr>
-          </w:p>
-        </w:tc>
-      </w:tr>
-      <w:tr>
-        <w:tc>
-          <w:tcPr>
-            <w:tcW w:type="dxa" w:w="2074"/>
-            <w:tcW w:w="1728" w:type="dxa"/>
-            <w:tcMar>
-              <w:top w:w="12" w:type="dxa"/>
-              <w:bottom w:w="12" w:type="dxa"/>
-              <w:start w:w="50" w:type="dxa"/>
-              <w:end w:w="50" w:type="dxa"/>
-            </w:tcMar>
-          </w:tcPr>
-          <w:p>
-            <w:pPr>
-              <w:spacing w:before="0" w:after="0"/>
-            </w:pPr>
-            <w:r>
-              <w:rPr>
-                <w:rFonts w:ascii="Calibri" w:hAnsi="Calibri"/>
-                <w:color w:val="FFFFFF"/>
-                <w:sz w:val="2"/>
-              </w:rPr>
-              <w:t>{% cellbg item.ev_bg %}</w:t>
-            </w:r>
-            <w:r>
-              <w:rPr>
-                <w:rFonts w:ascii="Calibri" w:hAnsi="Calibri"/>
-                <w:sz w:val="16"/>
-              </w:rPr>
-              <w:t>{{r item.ev_date }}</w:t>
-            </w:r>
-          </w:p>
-        </w:tc>
-        <w:tc>
-          <w:tcPr>
-            <w:tcW w:type="dxa" w:w="2074"/>
-            <w:tcW w:w="3384" w:type="dxa"/>
-            <w:tcMar>
-              <w:top w:w="12" w:type="dxa"/>
-              <w:bottom w:w="12" w:type="dxa"/>
-              <w:start w:w="50" w:type="dxa"/>
-              <w:end w:w="50" w:type="dxa"/>
-            </w:tcMar>
-          </w:tcPr>
-          <w:p>
-            <w:pPr>
-              <w:spacing w:before="0" w:after="0"/>
-            </w:pPr>
-            <w:r>
-              <w:rPr>
-                <w:rFonts w:ascii="Calibri" w:hAnsi="Calibri"/>
-                <w:color w:val="FFFFFF"/>
-                <w:sz w:val="2"/>
-              </w:rPr>
-              <w:t>{% cellbg item.ev_bg %}</w:t>
-            </w:r>
-            <w:r>
-              <w:rPr>
-                <w:rFonts w:ascii="Calibri" w:hAnsi="Calibri"/>
-                <w:sz w:val="16"/>
-              </w:rPr>
-              <w:t>{{r item.ev_desc }}</w:t>
-            </w:r>
-          </w:p>
-        </w:tc>
-        <w:tc>
-          <w:tcPr>
-            <w:tcW w:type="dxa" w:w="2074"/>
-            <w:tcW w:w="144" w:type="dxa"/>
-            <w:tcMar>
-              <w:top w:w="0" w:type="dxa"/>
-              <w:bottom w:w="0" w:type="dxa"/>
-              <w:start w:w="0" w:type="dxa"/>
-              <w:end w:w="0" w:type="dxa"/>
-            </w:tcMar>
-            <w:shd w:fill="FFFFFF"/>
-          </w:tcPr>
-          <w:p>
-            <w:pPr>
-              <w:spacing w:before="0" w:after="0"/>
-            </w:pPr>
-          </w:p>
-        </w:tc>
-        <w:tc>
-          <w:tcPr>
-            <w:tcW w:type="dxa" w:w="2074"/>
-            <w:tcW w:w="1440" w:type="dxa"/>
-            <w:tcMar>
-              <w:top w:w="12" w:type="dxa"/>
-              <w:bottom w:w="12" w:type="dxa"/>
-              <w:start w:w="50" w:type="dxa"/>
-              <w:end w:w="50" w:type="dxa"/>
-            </w:tcMar>
-          </w:tcPr>
-          <w:p>
-            <w:pPr>
-              <w:spacing w:before="0" w:after="0"/>
-            </w:pPr>
-            <w:r>
-              <w:rPr>
-                <w:rFonts w:ascii="Calibri" w:hAnsi="Calibri"/>
-                <w:color w:val="FFFFFF"/>
-                <w:sz w:val="2"/>
-              </w:rPr>
-              <w:t>{% cellbg item.tk_bg %}</w:t>
-            </w:r>
-            <w:r>
-              <w:rPr>
-                <w:rFonts w:ascii="Calibri" w:hAnsi="Calibri"/>
-                <w:sz w:val="16"/>
-              </w:rPr>
-              <w:t>{{r item.tk_date }}</w:t>
-            </w:r>
-          </w:p>
-        </w:tc>
-        <w:tc>
-          <w:tcPr>
-            <w:tcW w:type="dxa" w:w="2074"/>
-            <w:tcW w:w="3671" w:type="dxa"/>
-            <w:tcMar>
-              <w:top w:w="12" w:type="dxa"/>
-              <w:bottom w:w="12" w:type="dxa"/>
-              <w:start w:w="50" w:type="dxa"/>
-              <w:end w:w="50" w:type="dxa"/>
-            </w:tcMar>
-          </w:tcPr>
-          <w:p>
-            <w:pPr>
-              <w:spacing w:before="0" w:after="0"/>
-            </w:pPr>
-            <w:r>
-              <w:rPr>
-                <w:rFonts w:ascii="Calibri" w:hAnsi="Calibri"/>
-                <w:color w:val="FFFFFF"/>
-                <w:sz w:val="2"/>
-              </w:rPr>
-              <w:t>{% cellbg item.tk_bg %}</w:t>
-            </w:r>
-            <w:r>
-              <w:rPr>
-                <w:rFonts w:ascii="Calibri" w:hAnsi="Calibri"/>
-                <w:sz w:val="16"/>
-              </w:rPr>
-              <w:t>{{r item.tk_desc }}</w:t>
-            </w:r>
-          </w:p>
-        </w:tc>
-      </w:tr>
-      <w:tr>
-        <w:tc>
-          <w:tcPr>
-            <w:tcW w:type="dxa" w:w="2074"/>
-          </w:tcPr>
-          <w:p>
-            <w:pPr>
-              <w:spacing w:before="0" w:after="0"/>
-            </w:pPr>
-            <w:r>
-              <w:rPr>
-                <w:rFonts w:ascii="Calibri" w:hAnsi="Calibri"/>
-                <w:sz w:val="16"/>
-              </w:rPr>
-              <w:t>{%tr endfor %}</w:t>
-            </w:r>
-          </w:p>
-        </w:tc>
-        <w:tc>
-          <w:tcPr>
-            <w:tcW w:type="dxa" w:w="2074"/>
-          </w:tcPr>
-          <w:p>
-            <w:pPr>
-              <w:spacing w:before="0" w:after="0"/>
-            </w:pPr>
-          </w:p>
-        </w:tc>
-        <w:tc>
-          <w:tcPr>
-            <w:tcW w:type="dxa" w:w="2074"/>
-          </w:tcPr>
-          <w:p>
-            <w:pPr>
-              <w:spacing w:before="0" w:after="0"/>
-            </w:pPr>
-          </w:p>
-        </w:tc>
-        <w:tc>
-          <w:tcPr>
-            <w:tcW w:type="dxa" w:w="2074"/>
-          </w:tcPr>
-          <w:p>
-            <w:pPr>
-              <w:spacing w:before="0" w:after="0"/>
-            </w:pPr>
-          </w:p>
-        </w:tc>
-        <w:tc>
-          <w:tcPr>
-            <w:tcW w:type="dxa" w:w="2074"/>
-          </w:tcPr>
-          <w:p>
-            <w:pPr>
-              <w:spacing w:before="0" w:after="0"/>
-            </w:pPr>
           </w:p>
         </w:tc>
       </w:tr>
@@ -1510,10 +1676,11 @@
       <w:r>
         <w:rPr>
           <w:rFonts w:ascii="Calibri" w:hAnsi="Calibri"/>
+          <w:sz w:val="2"/>
+          <w:szCs w:val="2"/>
           <w:color w:val="FFFFFF"/>
-          <w:sz w:val="2"/>
         </w:rPr>
-        <w:t>{% endif %}</w:t>
+        <w:t xml:space="preserve">{% endif %}</w:t>
       </w:r>
     </w:p>
     <w:p>
@@ -1524,7 +1691,7 @@
         <w:rPr>
           <w:rFonts w:ascii="Calibri" w:hAnsi="Calibri"/>
           <w:color w:val="FFFFFF"/>
-          <w:sz w:val="2"/>
+          <w:sz w:val="24"/>
         </w:rPr>
         <w:t>{% if case.notes %}</w:t>
       </w:r>
@@ -1541,7 +1708,7 @@
           <w:rFonts w:ascii="Calibri" w:hAnsi="Calibri"/>
           <w:b/>
           <w:color w:val="0F172A"/>
-          <w:sz w:val="18"/>
+          <w:sz w:val="24"/>
         </w:rPr>
         <w:t>Notes</w:t>
       </w:r>
@@ -1554,7 +1721,7 @@
         <w:rPr>
           <w:rFonts w:ascii="Calibri" w:hAnsi="Calibri"/>
           <w:color w:val="FFFFFF"/>
-          <w:sz w:val="2"/>
+          <w:sz w:val="24"/>
         </w:rPr>
         <w:t>{% for note in case.notes %}</w:t>
       </w:r>
@@ -1568,7 +1735,7 @@
           <w:rFonts w:ascii="Calibri" w:hAnsi="Calibri"/>
           <w:b/>
           <w:color w:val="94A3B8"/>
-          <w:sz w:val="14"/>
+          <w:sz w:val="24"/>
         </w:rPr>
         <w:t>{{ note.date }}</w:t>
       </w:r>
@@ -1584,7 +1751,7 @@
         <w:rPr>
           <w:rFonts w:ascii="Calibri" w:hAnsi="Calibri"/>
           <w:color w:val="475569"/>
-          <w:sz w:val="16"/>
+          <w:sz w:val="24"/>
         </w:rPr>
         <w:t>{{ note.content }}</w:t>
       </w:r>
@@ -1597,7 +1764,7 @@
         <w:rPr>
           <w:rFonts w:ascii="Calibri" w:hAnsi="Calibri"/>
           <w:color w:val="FFFFFF"/>
-          <w:sz w:val="2"/>
+          <w:sz w:val="24"/>
         </w:rPr>
         <w:t>{% endfor %}</w:t>
       </w:r>
@@ -1610,7 +1777,7 @@
         <w:rPr>
           <w:rFonts w:ascii="Calibri" w:hAnsi="Calibri"/>
           <w:color w:val="FFFFFF"/>
-          <w:sz w:val="2"/>
+          <w:sz w:val="24"/>
         </w:rPr>
         <w:t>{% endif %}</w:t>
       </w:r>
@@ -1623,7 +1790,7 @@
         <w:rPr>
           <w:rFonts w:ascii="Calibri" w:hAnsi="Calibri"/>
           <w:color w:val="FFFFFF"/>
-          <w:sz w:val="2"/>
+          <w:sz w:val="24"/>
         </w:rPr>
         <w:t>{% endfor %}</w:t>
       </w:r>
@@ -1636,7 +1803,7 @@
         <w:rPr>
           <w:rFonts w:ascii="Calibri" w:hAnsi="Calibri"/>
           <w:color w:val="FFFFFF"/>
-          <w:sz w:val="2"/>
+          <w:sz w:val="24"/>
         </w:rPr>
         <w:t>{% endfor %}</w:t>
       </w:r>
@@ -1644,6 +1811,8 @@
     <w:sectPr>
       <w:headerReference w:type="default" r:id="rId9"/>
       <w:footerReference w:type="default" r:id="rId10"/>
+      <w:headerReference w:type="first" r:id="rId11"/>
+      <w:footerReference w:type="first" r:id="rId12"/>
       <w:pgSz w:w="12240" w:h="15840"/>
       <w:pgMar w:top="864" w:right="936" w:bottom="720" w:left="936" w:header="720" w:footer="720" w:gutter="0"/>
       <w:cols w:space="720"/>
@@ -1664,7 +1833,7 @@
       <w:rPr>
         <w:rFonts w:ascii="Calibri" w:hAnsi="Calibri"/>
         <w:color w:val="94A3B8"/>
-        <w:sz w:val="14"/>
+        <w:sz w:val="24"/>
       </w:rPr>
       <w:fldChar w:fldCharType="begin"/>
       <w:instrText xml:space="preserve"> PAGE </w:instrText>
@@ -1674,6 +1843,16 @@
 </w:ftr>
 </file>
 
+<file path=word/footer2.xml><?xml version="1.0" encoding="utf-8"?>
+<w:ftr xmlns:m="http://schemas.openxmlformats.org/officeDocument/2006/math" xmlns:mc="http://schemas.openxmlformats.org/markup-compatibility/2006" xmlns:mo="http://schemas.microsoft.com/office/mac/office/2008/main" xmlns:mv="urn:schemas-microsoft-com:mac:vml" xmlns:o="urn:schemas-microsoft-com:office:office" xmlns:r="http://schemas.openxmlformats.org/officeDocument/2006/relationships" xmlns:v="urn:schemas-microsoft-com:vml" xmlns:w10="urn:schemas-microsoft-com:office:word" xmlns:w14="http://schemas.microsoft.com/office/word/2010/wordml" xmlns:w="http://schemas.openxmlformats.org/wordprocessingml/2006/main" xmlns:wne="http://schemas.microsoft.com/office/word/2006/wordml" xmlns:wp14="http://schemas.microsoft.com/office/word/2010/wordprocessingDrawing" xmlns:wp="http://schemas.openxmlformats.org/drawingml/2006/wordprocessingDrawing" xmlns:wpc="http://schemas.microsoft.com/office/word/2010/wordprocessingCanvas" xmlns:wpg="http://schemas.microsoft.com/office/word/2010/wordprocessingGroup" xmlns:wpi="http://schemas.microsoft.com/office/word/2010/wordprocessingInk" xmlns:wps="http://schemas.microsoft.com/office/word/2010/wordprocessingShape" mc:Ignorable="w14 wp14">
+  <w:p>
+    <w:pPr>
+      <w:pStyle w:val="Footer"/>
+    </w:pPr>
+  </w:p>
+</w:ftr>
+</file>
+
 <file path=word/header1.xml><?xml version="1.0" encoding="utf-8"?>
 <w:hdr xmlns:m="http://schemas.openxmlformats.org/officeDocument/2006/math" xmlns:mc="http://schemas.openxmlformats.org/markup-compatibility/2006" xmlns:mo="http://schemas.microsoft.com/office/mac/office/2008/main" xmlns:mv="urn:schemas-microsoft-com:mac:vml" xmlns:o="urn:schemas-microsoft-com:office:office" xmlns:r="http://schemas.openxmlformats.org/officeDocument/2006/relationships" xmlns:v="urn:schemas-microsoft-com:vml" xmlns:w10="urn:schemas-microsoft-com:office:word" xmlns:w14="http://schemas.microsoft.com/office/word/2010/wordml" xmlns:w="http://schemas.openxmlformats.org/wordprocessingml/2006/main" xmlns:wne="http://schemas.microsoft.com/office/word/2006/wordml" xmlns:wp14="http://schemas.microsoft.com/office/word/2010/wordprocessingDrawing" xmlns:wp="http://schemas.openxmlformats.org/drawingml/2006/wordprocessingDrawing" xmlns:wpc="http://schemas.microsoft.com/office/word/2010/wordprocessingCanvas" xmlns:wpg="http://schemas.microsoft.com/office/word/2010/wordprocessingGroup" xmlns:wpi="http://schemas.microsoft.com/office/word/2010/wordprocessingInk" xmlns:wps="http://schemas.microsoft.com/office/word/2010/wordprocessingShape" mc:Ignorable="w14 wp14">
   <w:p>
@@ -1686,7 +1865,7 @@
         <w:rFonts w:ascii="Calibri" w:hAnsi="Calibri"/>
         <w:b/>
         <w:color w:val="475569"/>
-        <w:sz w:val="15"/>
+        <w:sz w:val="24"/>
       </w:rPr>
       <w:t>{{ attorney_name }}</w:t>
     </w:r>
@@ -1694,7 +1873,7 @@
       <w:rPr>
         <w:rFonts w:ascii="Calibri" w:hAnsi="Calibri"/>
         <w:color w:val="94A3B8"/>
-        <w:sz w:val="15"/>
+        <w:sz w:val="24"/>
       </w:rPr>
       <w:t xml:space="preserve">  |  </w:t>
     </w:r>
@@ -1702,10 +1881,20 @@
       <w:rPr>
         <w:rFonts w:ascii="Calibri" w:hAnsi="Calibri"/>
         <w:color w:val="94A3B8"/>
-        <w:sz w:val="15"/>
+        <w:sz w:val="24"/>
       </w:rPr>
       <w:t>{{ creation_date }}</w:t>
     </w:r>
+  </w:p>
+</w:hdr>
+</file>
+
+<file path=word/header2.xml><?xml version="1.0" encoding="utf-8"?>
+<w:hdr xmlns:m="http://schemas.openxmlformats.org/officeDocument/2006/math" xmlns:mc="http://schemas.openxmlformats.org/markup-compatibility/2006" xmlns:mo="http://schemas.microsoft.com/office/mac/office/2008/main" xmlns:mv="urn:schemas-microsoft-com:mac:vml" xmlns:o="urn:schemas-microsoft-com:office:office" xmlns:r="http://schemas.openxmlformats.org/officeDocument/2006/relationships" xmlns:v="urn:schemas-microsoft-com:vml" xmlns:w10="urn:schemas-microsoft-com:office:word" xmlns:w14="http://schemas.microsoft.com/office/word/2010/wordml" xmlns:w="http://schemas.openxmlformats.org/wordprocessingml/2006/main" xmlns:wne="http://schemas.microsoft.com/office/word/2006/wordml" xmlns:wp14="http://schemas.microsoft.com/office/word/2010/wordprocessingDrawing" xmlns:wp="http://schemas.openxmlformats.org/drawingml/2006/wordprocessingDrawing" xmlns:wpc="http://schemas.microsoft.com/office/word/2010/wordprocessingCanvas" xmlns:wpg="http://schemas.microsoft.com/office/word/2010/wordprocessingGroup" xmlns:wpi="http://schemas.microsoft.com/office/word/2010/wordprocessingInk" xmlns:wps="http://schemas.microsoft.com/office/word/2010/wordprocessingShape" mc:Ignorable="w14 wp14">
+  <w:p>
+    <w:pPr>
+      <w:pStyle w:val="Header"/>
+    </w:pPr>
   </w:p>
 </w:hdr>
 </file>

</xml_diff>

<commit_message>
refactor: simplify case report — cover page, events, tasks, notes
- Cover page: replace table with simple paragraph list (arrow + case name + details)
- Title: "LASTNAME – Case List" derived from attorney name
- Phase headers: colored paragraphs, indented toward center
- Case names: truncated to 60 chars with "..."
- Events: DOI styled as past event with star, starred events use star + bold (no star icon removed), time on own line in italics
- Tasks: single-column checklist with ☐ checkboxes, no dates
- Events table widened, tasks table narrowed
- Notes: removed blue left border
- Removed Date/Description sub-header rows from both tables

Co-Authored-By: Claude Opus 4.6 <noreply@anthropic.com>
</commit_message>
<xml_diff>
--- a/templates/exports/case_report_template.docx
+++ b/templates/exports/case_report_template.docx
@@ -18,7 +18,7 @@
           <w:color w:val="0F172A"/>
           <w:sz w:val="52"/>
         </w:rPr>
-        <w:t>Active Case Portfolio</w:t>
+        <w:t>{{ title }}</w:t>
       </w:r>
     </w:p>
     <w:p>
@@ -36,26 +36,11 @@
       <w:r>
         <w:rPr>
           <w:rFonts w:ascii="Calibri" w:hAnsi="Calibri"/>
+          <w:sz w:val="24"/>
+          <w:szCs w:val="24"/>
           <w:color w:val="0F172A"/>
-          <w:sz w:val="24"/>
         </w:rPr>
-        <w:t>{{ attorney_name }}</w:t>
-      </w:r>
-      <w:r>
-        <w:rPr>
-          <w:rFonts w:ascii="Calibri" w:hAnsi="Calibri"/>
-          <w:color w:val="94A3B8"/>
-          <w:sz w:val="24"/>
-        </w:rPr>
-        <w:t xml:space="preserve">  |  </w:t>
-      </w:r>
-      <w:r>
-        <w:rPr>
-          <w:rFonts w:ascii="Calibri" w:hAnsi="Calibri"/>
-          <w:color w:val="475569"/>
-          <w:sz w:val="24"/>
-        </w:rPr>
-        <w:t>{{ creation_date }}</w:t>
+        <w:t xml:space="preserve">{{ creation_date }}</w:t>
       </w:r>
     </w:p>
     <w:p>
@@ -71,574 +56,92 @@
         <w:t>{{ case_count }} active matters</w:t>
       </w:r>
     </w:p>
-    <w:tbl>
-      <w:tblPr>
-        <w:tblW w:type="auto" w:w="0"/>
-        <w:jc w:val="center"/>
-        <w:tblLayout w:type="autofit"/>
-        <w:tblLook w:firstColumn="1" w:firstRow="1" w:lastColumn="0" w:lastRow="0" w:noHBand="0" w:noVBand="1" w:val="04A0"/>
-        <w:tblBorders>
-          <w:top w:val="single" w:sz="2" w:color="E2E8F0" w:space="0"/>
-          <w:left w:val="single" w:sz="2" w:color="E2E8F0" w:space="0"/>
-          <w:bottom w:val="single" w:sz="2" w:color="E2E8F0" w:space="0"/>
-          <w:right w:val="single" w:sz="2" w:color="E2E8F0" w:space="0"/>
-          <w:insideH w:val="single" w:sz="2" w:color="E2E8F0" w:space="0"/>
-          <w:insideV w:val="single" w:sz="2" w:color="E2E8F0" w:space="0"/>
-        </w:tblBorders>
-      </w:tblPr>
-      <w:tblGrid>
-        <w:gridCol w:w="2074"/>
-        <w:gridCol w:w="2074"/>
-        <w:gridCol w:w="2074"/>
-        <w:gridCol w:w="2074"/>
-        <w:gridCol w:w="2074"/>
-      </w:tblGrid>
-      <w:tr>
-        <w:tc>
-          <w:tcPr>
-            <w:tcW w:type="dxa" w:w="2074"/>
-            <w:shd w:fill="F8FAFC"/>
-            <w:tcMar>
-              <w:top w:w="28" w:type="dxa"/>
-              <w:bottom w:w="28" w:type="dxa"/>
-              <w:start w:w="55" w:type="dxa"/>
-              <w:end w:w="55" w:type="dxa"/>
-            </w:tcMar>
-            <w:tcW w:w="2880" w:type="dxa"/>
-            <w:tcBorders>
-              <w:bottom w:val="single" w:sz="4" w:color="CBD5E1" w:space="0"/>
-            </w:tcBorders>
-          </w:tcPr>
-          <w:p>
-            <w:pPr>
-              <w:spacing w:before="0" w:after="0"/>
-            </w:pPr>
-            <w:r>
-              <w:rPr>
-                <w:rFonts w:ascii="Calibri" w:hAnsi="Calibri"/>
-                <w:b/>
-                <w:color w:val="475569"/>
-                <w:sz w:val="24"/>
-              </w:rPr>
-              <w:t>Case</w:t>
-            </w:r>
-          </w:p>
-        </w:tc>
-        <w:tc>
-          <w:tcPr>
-            <w:tcW w:type="dxa" w:w="2074"/>
-            <w:shd w:fill="F8FAFC"/>
-            <w:tcMar>
-              <w:top w:w="28" w:type="dxa"/>
-              <w:bottom w:w="28" w:type="dxa"/>
-              <w:start w:w="55" w:type="dxa"/>
-              <w:end w:w="55" w:type="dxa"/>
-            </w:tcMar>
-            <w:tcW w:w="1728" w:type="dxa"/>
-            <w:tcBorders>
-              <w:bottom w:val="single" w:sz="4" w:color="CBD5E1" w:space="0"/>
-            </w:tcBorders>
-          </w:tcPr>
-          <w:p>
-            <w:pPr>
-              <w:spacing w:before="0" w:after="0"/>
-            </w:pPr>
-            <w:r>
-              <w:rPr>
-                <w:rFonts w:ascii="Calibri" w:hAnsi="Calibri"/>
-                <w:b/>
-                <w:color w:val="475569"/>
-                <w:sz w:val="24"/>
-              </w:rPr>
-              <w:t>Case No.</w:t>
-            </w:r>
-          </w:p>
-        </w:tc>
-        <w:tc>
-          <w:tcPr>
-            <w:tcW w:type="dxa" w:w="2074"/>
-            <w:shd w:fill="F8FAFC"/>
-            <w:tcMar>
-              <w:top w:w="28" w:type="dxa"/>
-              <w:bottom w:w="28" w:type="dxa"/>
-              <w:start w:w="55" w:type="dxa"/>
-              <w:end w:w="55" w:type="dxa"/>
-            </w:tcMar>
-            <w:tcW w:w="1584" w:type="dxa"/>
-            <w:tcBorders>
-              <w:bottom w:val="single" w:sz="4" w:color="CBD5E1" w:space="0"/>
-            </w:tcBorders>
-          </w:tcPr>
-          <w:p>
-            <w:pPr>
-              <w:spacing w:before="0" w:after="0"/>
-            </w:pPr>
-            <w:r>
-              <w:rPr>
-                <w:rFonts w:ascii="Calibri" w:hAnsi="Calibri"/>
-                <w:b/>
-                <w:color w:val="475569"/>
-                <w:sz w:val="24"/>
-              </w:rPr>
-              <w:t>Judge</w:t>
-            </w:r>
-          </w:p>
-        </w:tc>
-        <w:tc>
-          <w:tcPr>
-            <w:tcW w:type="dxa" w:w="2074"/>
-            <w:shd w:fill="F8FAFC"/>
-            <w:tcMar>
-              <w:top w:w="28" w:type="dxa"/>
-              <w:bottom w:w="28" w:type="dxa"/>
-              <w:start w:w="55" w:type="dxa"/>
-              <w:end w:w="55" w:type="dxa"/>
-            </w:tcMar>
-            <w:tcW w:w="2015" w:type="dxa"/>
-            <w:tcBorders>
-              <w:bottom w:val="single" w:sz="4" w:color="CBD5E1" w:space="0"/>
-            </w:tcBorders>
-          </w:tcPr>
-          <w:p>
-            <w:pPr>
-              <w:spacing w:before="0" w:after="0"/>
-            </w:pPr>
-            <w:r>
-              <w:rPr>
-                <w:rFonts w:ascii="Calibri" w:hAnsi="Calibri"/>
-                <w:b/>
-                <w:color w:val="475569"/>
-                <w:sz w:val="24"/>
-              </w:rPr>
-              <w:t>Clients</w:t>
-            </w:r>
-          </w:p>
-        </w:tc>
-        <w:tc>
-          <w:tcPr>
-            <w:tcW w:type="dxa" w:w="2074"/>
-            <w:shd w:fill="F8FAFC"/>
-            <w:tcMar>
-              <w:top w:w="28" w:type="dxa"/>
-              <w:bottom w:w="28" w:type="dxa"/>
-              <w:start w:w="55" w:type="dxa"/>
-              <w:end w:w="55" w:type="dxa"/>
-            </w:tcMar>
-            <w:tcW w:w="1296" w:type="dxa"/>
-            <w:tcBorders>
-              <w:bottom w:val="single" w:sz="4" w:color="CBD5E1" w:space="0"/>
-            </w:tcBorders>
-          </w:tcPr>
-          <w:p>
-            <w:pPr>
-              <w:spacing w:before="0" w:after="0"/>
-            </w:pPr>
-            <w:r>
-              <w:rPr>
-                <w:rFonts w:ascii="Calibri" w:hAnsi="Calibri"/>
-                <w:b/>
-                <w:color w:val="475569"/>
-                <w:sz w:val="24"/>
-              </w:rPr>
-              <w:t>DOI</w:t>
-            </w:r>
-          </w:p>
-        </w:tc>
-      </w:tr>
-      <w:tr>
-        <w:tc>
-          <w:tcPr>
-            <w:tcW w:type="dxa" w:w="2074"/>
-          </w:tcPr>
-          <w:p>
-            <w:pPr>
-              <w:spacing w:before="0" w:after="0"/>
-            </w:pPr>
-            <w:r>
-              <w:rPr>
-                <w:rFonts w:ascii="Calibri" w:hAnsi="Calibri"/>
-                <w:sz w:val="24"/>
-              </w:rPr>
-              <w:t>{%tr for phase in phases %}</w:t>
-            </w:r>
-          </w:p>
-        </w:tc>
-        <w:tc>
-          <w:tcPr>
-            <w:tcW w:type="dxa" w:w="2074"/>
-          </w:tcPr>
-          <w:p>
-            <w:pPr>
-              <w:spacing w:before="0" w:after="0"/>
-            </w:pPr>
-          </w:p>
-        </w:tc>
-        <w:tc>
-          <w:tcPr>
-            <w:tcW w:type="dxa" w:w="2074"/>
-          </w:tcPr>
-          <w:p>
-            <w:pPr>
-              <w:spacing w:before="0" w:after="0"/>
-            </w:pPr>
-          </w:p>
-        </w:tc>
-        <w:tc>
-          <w:tcPr>
-            <w:tcW w:type="dxa" w:w="2074"/>
-          </w:tcPr>
-          <w:p>
-            <w:pPr>
-              <w:spacing w:before="0" w:after="0"/>
-            </w:pPr>
-          </w:p>
-        </w:tc>
-        <w:tc>
-          <w:tcPr>
-            <w:tcW w:type="dxa" w:w="2074"/>
-          </w:tcPr>
-          <w:p>
-            <w:pPr>
-              <w:spacing w:before="0" w:after="0"/>
-            </w:pPr>
-          </w:p>
-        </w:tc>
-      </w:tr>
-      <w:tr>
-        <w:tc>
-          <w:tcPr>
-            <w:tcW w:type="dxa" w:w="10370"/>
-            <w:gridSpan w:val="5"/>
-            <w:tcMar>
-              <w:top w:w="30" w:type="dxa"/>
-              <w:bottom w:w="30" w:type="dxa"/>
-              <w:start w:w="55" w:type="dxa"/>
-              <w:end w:w="55" w:type="dxa"/>
-            </w:tcMar>
-          </w:tcPr>
-          <w:p>
-            <w:pPr>
-              <w:spacing w:before="0" w:after="0"/>
-            </w:pPr>
-            <w:r>
-              <w:rPr>
-                <w:rFonts w:ascii="Calibri" w:hAnsi="Calibri"/>
-                <w:color w:val="FFFFFF"/>
-                <w:sz w:val="24"/>
-              </w:rPr>
-              <w:t>{% cellbg phase.bg %}</w:t>
-            </w:r>
-            <w:r>
-              <w:rPr>
-                <w:rFonts w:ascii="Calibri" w:hAnsi="Calibri"/>
-                <w:sz w:val="24"/>
-              </w:rPr>
-              <w:t>{{r phase.header_rt }}</w:t>
-            </w:r>
-          </w:p>
-        </w:tc>
-      </w:tr>
-      <w:tr>
-        <w:tc>
-          <w:tcPr>
-            <w:tcW w:type="dxa" w:w="2074"/>
-          </w:tcPr>
-          <w:p>
-            <w:pPr>
-              <w:spacing w:before="0" w:after="0"/>
-            </w:pPr>
-            <w:r>
-              <w:rPr>
-                <w:rFonts w:ascii="Calibri" w:hAnsi="Calibri"/>
-                <w:sz w:val="24"/>
-              </w:rPr>
-              <w:t>{%tr for case in phase.cases %}</w:t>
-            </w:r>
-          </w:p>
-        </w:tc>
-        <w:tc>
-          <w:tcPr>
-            <w:tcW w:type="dxa" w:w="2074"/>
-          </w:tcPr>
-          <w:p>
-            <w:pPr>
-              <w:spacing w:before="0" w:after="0"/>
-            </w:pPr>
-          </w:p>
-        </w:tc>
-        <w:tc>
-          <w:tcPr>
-            <w:tcW w:type="dxa" w:w="2074"/>
-          </w:tcPr>
-          <w:p>
-            <w:pPr>
-              <w:spacing w:before="0" w:after="0"/>
-            </w:pPr>
-          </w:p>
-        </w:tc>
-        <w:tc>
-          <w:tcPr>
-            <w:tcW w:type="dxa" w:w="2074"/>
-          </w:tcPr>
-          <w:p>
-            <w:pPr>
-              <w:spacing w:before="0" w:after="0"/>
-            </w:pPr>
-          </w:p>
-        </w:tc>
-        <w:tc>
-          <w:tcPr>
-            <w:tcW w:type="dxa" w:w="2074"/>
-          </w:tcPr>
-          <w:p>
-            <w:pPr>
-              <w:spacing w:before="0" w:after="0"/>
-            </w:pPr>
-          </w:p>
-        </w:tc>
-      </w:tr>
-      <w:tr>
-        <w:tc>
-          <w:tcPr>
-            <w:tcW w:type="dxa" w:w="2074"/>
-            <w:tcMar>
-              <w:top w:w="25" w:type="dxa"/>
-              <w:bottom w:w="25" w:type="dxa"/>
-              <w:start w:w="55" w:type="dxa"/>
-              <w:end w:w="55" w:type="dxa"/>
-            </w:tcMar>
-            <w:tcW w:w="2880" w:type="dxa"/>
-          </w:tcPr>
-          <w:p>
-            <w:pPr>
-              <w:spacing w:before="0" w:after="0"/>
-            </w:pPr>
-            <w:r>
-              <w:rPr>
-                <w:rFonts w:ascii="Calibri" w:hAnsi="Calibri"/>
-                <w:b/>
-                <w:sz w:val="24"/>
-              </w:rPr>
-              <w:t>{{ case.short_name }}</w:t>
-            </w:r>
-          </w:p>
-        </w:tc>
-        <w:tc>
-          <w:tcPr>
-            <w:tcW w:type="dxa" w:w="2074"/>
-            <w:tcMar>
-              <w:top w:w="25" w:type="dxa"/>
-              <w:bottom w:w="25" w:type="dxa"/>
-              <w:start w:w="55" w:type="dxa"/>
-              <w:end w:w="55" w:type="dxa"/>
-            </w:tcMar>
-            <w:tcW w:w="1728" w:type="dxa"/>
-          </w:tcPr>
-          <w:p>
-            <w:pPr>
-              <w:spacing w:before="0" w:after="0"/>
-            </w:pPr>
-            <w:r>
-              <w:rPr>
-                <w:rFonts w:ascii="Consolas" w:hAnsi="Consolas"/>
-                <w:sz w:val="24"/>
-              </w:rPr>
-              <w:t>{{ case.case_number }}</w:t>
-            </w:r>
-          </w:p>
-        </w:tc>
-        <w:tc>
-          <w:tcPr>
-            <w:tcW w:type="dxa" w:w="2074"/>
-            <w:tcMar>
-              <w:top w:w="25" w:type="dxa"/>
-              <w:bottom w:w="25" w:type="dxa"/>
-              <w:start w:w="55" w:type="dxa"/>
-              <w:end w:w="55" w:type="dxa"/>
-            </w:tcMar>
-            <w:tcW w:w="1584" w:type="dxa"/>
-          </w:tcPr>
-          <w:p>
-            <w:pPr>
-              <w:spacing w:before="0" w:after="0"/>
-            </w:pPr>
-            <w:r>
-              <w:rPr>
-                <w:rFonts w:ascii="Calibri" w:hAnsi="Calibri"/>
-                <w:sz w:val="24"/>
-              </w:rPr>
-              <w:t>{{ case.judge }}</w:t>
-            </w:r>
-          </w:p>
-        </w:tc>
-        <w:tc>
-          <w:tcPr>
-            <w:tcW w:type="dxa" w:w="2074"/>
-            <w:tcMar>
-              <w:top w:w="25" w:type="dxa"/>
-              <w:bottom w:w="25" w:type="dxa"/>
-              <w:start w:w="55" w:type="dxa"/>
-              <w:end w:w="55" w:type="dxa"/>
-            </w:tcMar>
-            <w:tcW w:w="2015" w:type="dxa"/>
-          </w:tcPr>
-          <w:p>
-            <w:pPr>
-              <w:spacing w:before="0" w:after="0"/>
-            </w:pPr>
-            <w:r>
-              <w:rPr>
-                <w:rFonts w:ascii="Calibri" w:hAnsi="Calibri"/>
-                <w:sz w:val="24"/>
-              </w:rPr>
-              <w:t>{{ case.clients }}</w:t>
-            </w:r>
-          </w:p>
-        </w:tc>
-        <w:tc>
-          <w:tcPr>
-            <w:tcW w:type="dxa" w:w="2074"/>
-            <w:tcMar>
-              <w:top w:w="25" w:type="dxa"/>
-              <w:bottom w:w="25" w:type="dxa"/>
-              <w:start w:w="55" w:type="dxa"/>
-              <w:end w:w="55" w:type="dxa"/>
-            </w:tcMar>
-            <w:tcW w:w="1296" w:type="dxa"/>
-          </w:tcPr>
-          <w:p>
-            <w:pPr>
-              <w:spacing w:before="0" w:after="0"/>
-            </w:pPr>
-            <w:r>
-              <w:rPr>
-                <w:rFonts w:ascii="Calibri" w:hAnsi="Calibri"/>
-                <w:sz w:val="24"/>
-              </w:rPr>
-              <w:t>{{ case.doi }}</w:t>
-            </w:r>
-          </w:p>
-        </w:tc>
-      </w:tr>
-      <w:tr>
-        <w:tc>
-          <w:tcPr>
-            <w:tcW w:type="dxa" w:w="2074"/>
-          </w:tcPr>
-          <w:p>
-            <w:pPr>
-              <w:spacing w:before="0" w:after="0"/>
-            </w:pPr>
-            <w:r>
-              <w:rPr>
-                <w:rFonts w:ascii="Calibri" w:hAnsi="Calibri"/>
-                <w:sz w:val="24"/>
-              </w:rPr>
-              <w:t>{%tr endfor %}</w:t>
-            </w:r>
-          </w:p>
-        </w:tc>
-        <w:tc>
-          <w:tcPr>
-            <w:tcW w:type="dxa" w:w="2074"/>
-          </w:tcPr>
-          <w:p>
-            <w:pPr>
-              <w:spacing w:before="0" w:after="0"/>
-            </w:pPr>
-          </w:p>
-        </w:tc>
-        <w:tc>
-          <w:tcPr>
-            <w:tcW w:type="dxa" w:w="2074"/>
-          </w:tcPr>
-          <w:p>
-            <w:pPr>
-              <w:spacing w:before="0" w:after="0"/>
-            </w:pPr>
-          </w:p>
-        </w:tc>
-        <w:tc>
-          <w:tcPr>
-            <w:tcW w:type="dxa" w:w="2074"/>
-          </w:tcPr>
-          <w:p>
-            <w:pPr>
-              <w:spacing w:before="0" w:after="0"/>
-            </w:pPr>
-          </w:p>
-        </w:tc>
-        <w:tc>
-          <w:tcPr>
-            <w:tcW w:type="dxa" w:w="2074"/>
-          </w:tcPr>
-          <w:p>
-            <w:pPr>
-              <w:spacing w:before="0" w:after="0"/>
-            </w:pPr>
-          </w:p>
-        </w:tc>
-      </w:tr>
-      <w:tr>
-        <w:tc>
-          <w:tcPr>
-            <w:tcW w:type="dxa" w:w="2074"/>
-          </w:tcPr>
-          <w:p>
-            <w:pPr>
-              <w:spacing w:before="0" w:after="0"/>
-            </w:pPr>
-            <w:r>
-              <w:rPr>
-                <w:rFonts w:ascii="Calibri" w:hAnsi="Calibri"/>
-                <w:sz w:val="24"/>
-              </w:rPr>
-              <w:t>{%tr endfor %}</w:t>
-            </w:r>
-          </w:p>
-        </w:tc>
-        <w:tc>
-          <w:tcPr>
-            <w:tcW w:type="dxa" w:w="2074"/>
-          </w:tcPr>
-          <w:p>
-            <w:pPr>
-              <w:spacing w:before="0" w:after="0"/>
-            </w:pPr>
-          </w:p>
-        </w:tc>
-        <w:tc>
-          <w:tcPr>
-            <w:tcW w:type="dxa" w:w="2074"/>
-          </w:tcPr>
-          <w:p>
-            <w:pPr>
-              <w:spacing w:before="0" w:after="0"/>
-            </w:pPr>
-          </w:p>
-        </w:tc>
-        <w:tc>
-          <w:tcPr>
-            <w:tcW w:type="dxa" w:w="2074"/>
-          </w:tcPr>
-          <w:p>
-            <w:pPr>
-              <w:spacing w:before="0" w:after="0"/>
-            </w:pPr>
-          </w:p>
-        </w:tc>
-        <w:tc>
-          <w:tcPr>
-            <w:tcW w:type="dxa" w:w="2074"/>
-          </w:tcPr>
-          <w:p>
-            <w:pPr>
-              <w:spacing w:before="0" w:after="0"/>
-            </w:pPr>
-          </w:p>
-        </w:tc>
-      </w:tr>
-    </w:tbl>
+    <w:p>
+      <w:pPr>
+        <w:spacing w:before="0" w:after="0" w:line="1" w:lineRule="exact"/>
+      </w:pPr>
+      <w:r>
+        <w:rPr>
+          <w:rFonts w:ascii="Calibri" w:hAnsi="Calibri"/>
+          <w:sz w:val="2"/>
+          <w:szCs w:val="2"/>
+          <w:color w:val="FFFFFF"/>
+        </w:rPr>
+        <w:t xml:space="preserve">{% for phase in phases %}</w:t>
+      </w:r>
+    </w:p>
+    <w:p>
+      <w:pPr>
+        <w:spacing w:before="100" w:after="0"/>
+        <w:ind w:left="2160"/>
+      </w:pPr>
+      <w:r>
+        <w:rPr>
+          <w:rFonts w:ascii="Calibri" w:hAnsi="Calibri"/>
+          <w:sz w:val="28"/>
+          <w:szCs w:val="28"/>
+          <w:color w:val="0F172A"/>
+        </w:rPr>
+        <w:t xml:space="preserve">{{r phase.header_rt }}</w:t>
+      </w:r>
+    </w:p>
+    <w:p>
+      <w:pPr>
+        <w:spacing w:before="0" w:after="0" w:line="1" w:lineRule="exact"/>
+      </w:pPr>
+      <w:r>
+        <w:rPr>
+          <w:rFonts w:ascii="Calibri" w:hAnsi="Calibri"/>
+          <w:sz w:val="2"/>
+          <w:szCs w:val="2"/>
+          <w:color w:val="FFFFFF"/>
+        </w:rPr>
+        <w:t xml:space="preserve">{% for case in phase.cases %}</w:t>
+      </w:r>
+    </w:p>
+    <w:p>
+      <w:pPr>
+        <w:spacing w:before="0" w:after="0" w:line="280" w:lineRule="exact"/>
+        <w:ind w:left="2520"/>
+      </w:pPr>
+      <w:r>
+        <w:rPr>
+          <w:rFonts w:ascii="Calibri" w:hAnsi="Calibri"/>
+          <w:sz w:val="24"/>
+          <w:szCs w:val="24"/>
+          <w:color w:val="0F172A"/>
+        </w:rPr>
+        <w:t xml:space="preserve">{{r case.summary_line_rt }}</w:t>
+      </w:r>
+    </w:p>
+    <w:p>
+      <w:pPr>
+        <w:spacing w:before="0" w:after="0" w:line="1" w:lineRule="exact"/>
+      </w:pPr>
+      <w:r>
+        <w:rPr>
+          <w:rFonts w:ascii="Calibri" w:hAnsi="Calibri"/>
+          <w:sz w:val="2"/>
+          <w:szCs w:val="2"/>
+          <w:color w:val="FFFFFF"/>
+        </w:rPr>
+        <w:t xml:space="preserve">{% endfor %}</w:t>
+      </w:r>
+    </w:p>
+    <w:p>
+      <w:pPr>
+        <w:spacing w:before="0" w:after="0" w:line="1" w:lineRule="exact"/>
+      </w:pPr>
+      <w:r>
+        <w:rPr>
+          <w:rFonts w:ascii="Calibri" w:hAnsi="Calibri"/>
+          <w:sz w:val="2"/>
+          <w:szCs w:val="2"/>
+          <w:color w:val="FFFFFF"/>
+        </w:rPr>
+        <w:t xml:space="preserve">{% endfor %}</w:t>
+      </w:r>
+    </w:p>
     <w:p>
       <w:pPr>
         <w:spacing w:before="0" w:after="0" w:line="1" w:lineRule="exact"/>
@@ -1018,7 +521,7 @@
     <w:tbl>
       <w:tblPr>
         <w:tblLayout w:type="fixed"/>
-        <w:tblW w:w="10280" w:type="dxa"/>
+        <w:tblW w:w="10364" w:type="dxa"/>
         <w:tblBorders>
           <w:top w:val="none" w:sz="0" w:space="0" w:color="auto"/>
           <w:left w:val="none" w:sz="0" w:space="0" w:color="auto"/>
@@ -1035,14 +538,14 @@
         </w:tblCellMar>
       </w:tblPr>
       <w:tblGrid>
-        <w:gridCol w:w="5040"/>
+        <w:gridCol w:w="6400"/>
         <w:gridCol w:w="200"/>
-        <w:gridCol w:w="5040"/>
+        <w:gridCol w:w="3764"/>
       </w:tblGrid>
       <w:tr>
         <w:tc>
           <w:tcPr>
-            <w:tcW w:w="5040" w:type="dxa"/>
+            <w:tcW w:w="6400" w:type="dxa"/>
             <w:tcBorders>
               <w:top w:val="none" w:sz="0" w:space="0" w:color="auto"/>
               <w:left w:val="none" w:sz="0" w:space="0" w:color="auto"/>
@@ -1053,7 +556,7 @@
           <w:tbl>
             <w:tblPr>
               <w:tblLayout w:type="fixed"/>
-              <w:tblW w:w="5040" w:type="dxa"/>
+              <w:tblW w:w="6400" w:type="dxa"/>
               <w:tblBorders>
                 <w:top w:val="none" w:sz="0" w:space="0" w:color="auto"/>
                 <w:left w:val="none" w:sz="0" w:space="0" w:color="auto"/>
@@ -1071,7 +574,7 @@
             </w:tblPr>
             <w:tblGrid>
               <w:gridCol w:w="1800"/>
-              <w:gridCol w:w="3240"/>
+              <w:gridCol w:w="4600"/>
             </w:tblGrid>
             <w:tr>
               <w:tc>
@@ -1093,62 +596,6 @@
                       <w:color w:val="FFFFFF"/>
                     </w:rPr>
                     <w:t xml:space="preserve">Events</w:t>
-                  </w:r>
-                </w:p>
-              </w:tc>
-            </w:tr>
-            <w:tr>
-              <w:tc>
-                <w:tcPr>
-                  <w:tcW w:w="1800" w:type="dxa"/>
-                  <w:shd w:val="clear" w:color="auto" w:fill="F1F5F9"/>
-                  <w:tcBorders>
-                    <w:top w:val="none" w:sz="0" w:space="0" w:color="auto"/>
-                    <w:left w:val="none" w:sz="0" w:space="0" w:color="auto"/>
-                    <w:bottom w:val="none" w:sz="0" w:space="0" w:color="auto"/>
-                    <w:right w:val="none" w:sz="0" w:space="0" w:color="auto"/>
-                  </w:tcBorders>
-                </w:tcPr>
-                <w:p>
-                  <w:pPr>
-                    <w:spacing w:before="20" w:after="20"/>
-                  </w:pPr>
-                  <w:r>
-                    <w:rPr>
-                      <w:rFonts w:ascii="Calibri" w:hAnsi="Calibri"/>
-                      <w:sz w:val="24"/>
-                      <w:szCs w:val="24"/>
-                      <w:b/>
-                      <w:color w:val="64748B"/>
-                    </w:rPr>
-                    <w:t xml:space="preserve">Date</w:t>
-                  </w:r>
-                </w:p>
-              </w:tc>
-              <w:tc>
-                <w:tcPr>
-                  <w:tcW w:w="3240" w:type="dxa"/>
-                  <w:shd w:val="clear" w:color="auto" w:fill="F1F5F9"/>
-                  <w:tcBorders>
-                    <w:top w:val="none" w:sz="0" w:space="0" w:color="auto"/>
-                    <w:left w:val="none" w:sz="0" w:space="0" w:color="auto"/>
-                    <w:bottom w:val="none" w:sz="0" w:space="0" w:color="auto"/>
-                    <w:right w:val="none" w:sz="0" w:space="0" w:color="auto"/>
-                  </w:tcBorders>
-                </w:tcPr>
-                <w:p>
-                  <w:pPr>
-                    <w:spacing w:before="20" w:after="20"/>
-                  </w:pPr>
-                  <w:r>
-                    <w:rPr>
-                      <w:rFonts w:ascii="Calibri" w:hAnsi="Calibri"/>
-                      <w:sz w:val="24"/>
-                      <w:szCs w:val="24"/>
-                      <w:b/>
-                      <w:color w:val="64748B"/>
-                    </w:rPr>
-                    <w:t xml:space="preserve">Description</w:t>
                   </w:r>
                 </w:p>
               </w:tc>
@@ -1181,7 +628,7 @@
               </w:tc>
               <w:tc>
                 <w:tcPr>
-                  <w:tcW w:w="3240" w:type="dxa"/>
+                  <w:tcW w:w="4600" w:type="dxa"/>
                   <w:tcBorders>
                     <w:top w:val="none" w:sz="0" w:space="0" w:color="auto"/>
                     <w:left w:val="none" w:sz="0" w:space="0" w:color="auto"/>
@@ -1242,7 +689,7 @@
               </w:tc>
               <w:tc>
                 <w:tcPr>
-                  <w:tcW w:w="3240" w:type="dxa"/>
+                  <w:tcW w:w="4600" w:type="dxa"/>
                   <w:tcBorders>
                     <w:top w:val="none" w:sz="0" w:space="0" w:color="auto"/>
                     <w:left w:val="none" w:sz="0" w:space="0" w:color="auto"/>
@@ -1303,7 +750,7 @@
               </w:tc>
               <w:tc>
                 <w:tcPr>
-                  <w:tcW w:w="3240" w:type="dxa"/>
+                  <w:tcW w:w="4600" w:type="dxa"/>
                   <w:tcBorders>
                     <w:top w:val="none" w:sz="0" w:space="0" w:color="auto"/>
                     <w:left w:val="none" w:sz="0" w:space="0" w:color="auto"/>
@@ -1352,7 +799,7 @@
         </w:tc>
         <w:tc>
           <w:tcPr>
-            <w:tcW w:w="5040" w:type="dxa"/>
+            <w:tcW w:w="3764" w:type="dxa"/>
             <w:tcBorders>
               <w:top w:val="none" w:sz="0" w:space="0" w:color="auto"/>
               <w:left w:val="none" w:sz="0" w:space="0" w:color="auto"/>
@@ -1377,7 +824,7 @@
           <w:tbl>
             <w:tblPr>
               <w:tblLayout w:type="fixed"/>
-              <w:tblW w:w="5040" w:type="dxa"/>
+              <w:tblW w:w="3764" w:type="dxa"/>
               <w:tblBorders>
                 <w:top w:val="none" w:sz="0" w:space="0" w:color="auto"/>
                 <w:left w:val="none" w:sz="0" w:space="0" w:color="auto"/>
@@ -1394,15 +841,19 @@
               </w:tblCellMar>
             </w:tblPr>
             <w:tblGrid>
-              <w:gridCol w:w="1800"/>
-              <w:gridCol w:w="3240"/>
+              <w:gridCol w:w="3764"/>
             </w:tblGrid>
             <w:tr>
               <w:tc>
                 <w:tcPr>
-                  <w:tcW w:w="5040" w:type="dxa"/>
-                  <w:gridSpan w:val="2"/>
+                  <w:tcW w:w="3764" w:type="dxa"/>
                   <w:shd w:val="clear" w:color="auto" w:fill="1E293B"/>
+                  <w:tcBorders>
+                    <w:top w:val="none" w:sz="0" w:space="0" w:color="auto"/>
+                    <w:left w:val="none" w:sz="0" w:space="0" w:color="auto"/>
+                    <w:bottom w:val="none" w:sz="0" w:space="0" w:color="auto"/>
+                    <w:right w:val="none" w:sz="0" w:space="0" w:color="auto"/>
+                  </w:tcBorders>
                 </w:tcPr>
                 <w:p>
                   <w:pPr>
@@ -1424,115 +875,7 @@
             <w:tr>
               <w:tc>
                 <w:tcPr>
-                  <w:tcW w:w="1800" w:type="dxa"/>
-                  <w:shd w:val="clear" w:color="auto" w:fill="F1F5F9"/>
-                  <w:tcBorders>
-                    <w:top w:val="none" w:sz="0" w:space="0" w:color="auto"/>
-                    <w:left w:val="none" w:sz="0" w:space="0" w:color="auto"/>
-                    <w:bottom w:val="none" w:sz="0" w:space="0" w:color="auto"/>
-                    <w:right w:val="none" w:sz="0" w:space="0" w:color="auto"/>
-                  </w:tcBorders>
-                </w:tcPr>
-                <w:p>
-                  <w:pPr>
-                    <w:spacing w:before="20" w:after="20"/>
-                  </w:pPr>
-                  <w:r>
-                    <w:rPr>
-                      <w:rFonts w:ascii="Calibri" w:hAnsi="Calibri"/>
-                      <w:sz w:val="24"/>
-                      <w:szCs w:val="24"/>
-                      <w:b/>
-                      <w:color w:val="64748B"/>
-                    </w:rPr>
-                    <w:t xml:space="preserve">Due</w:t>
-                  </w:r>
-                </w:p>
-              </w:tc>
-              <w:tc>
-                <w:tcPr>
-                  <w:tcW w:w="3240" w:type="dxa"/>
-                  <w:shd w:val="clear" w:color="auto" w:fill="F1F5F9"/>
-                  <w:tcBorders>
-                    <w:top w:val="none" w:sz="0" w:space="0" w:color="auto"/>
-                    <w:left w:val="none" w:sz="0" w:space="0" w:color="auto"/>
-                    <w:bottom w:val="none" w:sz="0" w:space="0" w:color="auto"/>
-                    <w:right w:val="none" w:sz="0" w:space="0" w:color="auto"/>
-                  </w:tcBorders>
-                </w:tcPr>
-                <w:p>
-                  <w:pPr>
-                    <w:spacing w:before="20" w:after="20"/>
-                  </w:pPr>
-                  <w:r>
-                    <w:rPr>
-                      <w:rFonts w:ascii="Calibri" w:hAnsi="Calibri"/>
-                      <w:sz w:val="24"/>
-                      <w:szCs w:val="24"/>
-                      <w:b/>
-                      <w:color w:val="64748B"/>
-                    </w:rPr>
-                    <w:t xml:space="preserve">Description</w:t>
-                  </w:r>
-                </w:p>
-              </w:tc>
-            </w:tr>
-            <w:tr>
-              <w:tc>
-                <w:tcPr>
-                  <w:tcW w:w="1800" w:type="dxa"/>
-                  <w:tcBorders>
-                    <w:top w:val="none" w:sz="0" w:space="0" w:color="auto"/>
-                    <w:left w:val="none" w:sz="0" w:space="0" w:color="auto"/>
-                    <w:bottom w:val="none" w:sz="0" w:space="0" w:color="auto"/>
-                    <w:right w:val="none" w:sz="0" w:space="0" w:color="auto"/>
-                  </w:tcBorders>
-                </w:tcPr>
-                <w:p>
-                  <w:pPr>
-                    <w:spacing w:before="0" w:after="0" w:line="1" w:lineRule="exact"/>
-                  </w:pPr>
-                  <w:r>
-                    <w:rPr>
-                      <w:rFonts w:ascii="Calibri" w:hAnsi="Calibri"/>
-                      <w:sz w:val="2"/>
-                      <w:szCs w:val="2"/>
-                      <w:color w:val="FFFFFF"/>
-                    </w:rPr>
-                    <w:t xml:space="preserve">{%tr for tk in case.task_items %}</w:t>
-                  </w:r>
-                </w:p>
-              </w:tc>
-              <w:tc>
-                <w:tcPr>
-                  <w:tcW w:w="3240" w:type="dxa"/>
-                  <w:tcBorders>
-                    <w:top w:val="none" w:sz="0" w:space="0" w:color="auto"/>
-                    <w:left w:val="none" w:sz="0" w:space="0" w:color="auto"/>
-                    <w:bottom w:val="none" w:sz="0" w:space="0" w:color="auto"/>
-                    <w:right w:val="none" w:sz="0" w:space="0" w:color="auto"/>
-                  </w:tcBorders>
-                </w:tcPr>
-                <w:p>
-                  <w:pPr>
-                    <w:spacing w:before="0" w:after="0" w:line="1" w:lineRule="exact"/>
-                  </w:pPr>
-                  <w:r>
-                    <w:rPr>
-                      <w:rFonts w:ascii="Calibri" w:hAnsi="Calibri"/>
-                      <w:sz w:val="2"/>
-                      <w:szCs w:val="2"/>
-                      <w:color w:val="FFFFFF"/>
-                    </w:rPr>
-                    <w:t xml:space="preserve"/>
-                  </w:r>
-                </w:p>
-              </w:tc>
-            </w:tr>
-            <w:tr>
-              <w:tc>
-                <w:tcPr>
-                  <w:tcW w:w="1800" w:type="dxa"/>
+                  <w:tcW w:w="3764" w:type="dxa"/>
                   <w:tcBorders>
                     <w:top w:val="none" w:sz="0" w:space="0" w:color="auto"/>
                     <w:left w:val="none" w:sz="0" w:space="0" w:color="auto"/>
@@ -1551,22 +894,15 @@
                       <w:szCs w:val="2"/>
                       <w:color w:val="FFFFFF"/>
                     </w:rPr>
-                    <w:t xml:space="preserve">{% cellbg tk.bg %}</w:t>
-                  </w:r>
-                  <w:r>
-                    <w:rPr>
-                      <w:rFonts w:ascii="Calibri" w:hAnsi="Calibri"/>
-                      <w:sz w:val="24"/>
-                      <w:szCs w:val="24"/>
-                      <w:color w:val="0F172A"/>
-                    </w:rPr>
-                    <w:t xml:space="preserve">{{r tk.date_rt }}</w:t>
+                    <w:t xml:space="preserve">{%tr for tk in case.task_items %}</w:t>
                   </w:r>
                 </w:p>
               </w:tc>
+            </w:tr>
+            <w:tr>
               <w:tc>
                 <w:tcPr>
-                  <w:tcW w:w="3240" w:type="dxa"/>
+                  <w:tcW w:w="3764" w:type="dxa"/>
                   <w:tcBorders>
                     <w:top w:val="none" w:sz="0" w:space="0" w:color="auto"/>
                     <w:left w:val="none" w:sz="0" w:space="0" w:color="auto"/>
@@ -1602,7 +938,7 @@
             <w:tr>
               <w:tc>
                 <w:tcPr>
-                  <w:tcW w:w="1800" w:type="dxa"/>
+                  <w:tcW w:w="3764" w:type="dxa"/>
                   <w:tcBorders>
                     <w:top w:val="none" w:sz="0" w:space="0" w:color="auto"/>
                     <w:left w:val="none" w:sz="0" w:space="0" w:color="auto"/>
@@ -1612,7 +948,7 @@
                 </w:tcPr>
                 <w:p>
                   <w:pPr>
-                    <w:spacing w:before="0" w:after="0" w:line="1" w:lineRule="exact"/>
+                    <w:spacing w:before="0" w:after="0"/>
                   </w:pPr>
                   <w:r>
                     <w:rPr>
@@ -1622,31 +958,6 @@
                       <w:color w:val="FFFFFF"/>
                     </w:rPr>
                     <w:t xml:space="preserve">{%tr endfor %}</w:t>
-                  </w:r>
-                </w:p>
-              </w:tc>
-              <w:tc>
-                <w:tcPr>
-                  <w:tcW w:w="3240" w:type="dxa"/>
-                  <w:tcBorders>
-                    <w:top w:val="none" w:sz="0" w:space="0" w:color="auto"/>
-                    <w:left w:val="none" w:sz="0" w:space="0" w:color="auto"/>
-                    <w:bottom w:val="none" w:sz="0" w:space="0" w:color="auto"/>
-                    <w:right w:val="none" w:sz="0" w:space="0" w:color="auto"/>
-                  </w:tcBorders>
-                </w:tcPr>
-                <w:p>
-                  <w:pPr>
-                    <w:spacing w:before="0" w:after="0" w:line="1" w:lineRule="exact"/>
-                  </w:pPr>
-                  <w:r>
-                    <w:rPr>
-                      <w:rFonts w:ascii="Calibri" w:hAnsi="Calibri"/>
-                      <w:sz w:val="2"/>
-                      <w:szCs w:val="2"/>
-                      <w:color w:val="FFFFFF"/>
-                    </w:rPr>
-                    <w:t xml:space="preserve"/>
                   </w:r>
                 </w:p>
               </w:tc>
@@ -1743,9 +1054,6 @@
     <w:p>
       <w:pPr>
         <w:spacing w:before="0" w:after="40"/>
-        <w:pBorders>
-          <w:left w:val="single" w:sz="10" w:color="3B82F6" w:space="6"/>
-        </w:pBorders>
       </w:pPr>
       <w:r>
         <w:rPr>

</xml_diff>

<commit_message>
fix: move DOCX attorney/date from header to centered footer
Co-Authored-By: Claude Opus 4.6 <noreply@anthropic.com>
</commit_message>
<xml_diff>
--- a/templates/exports/case_report_template.docx
+++ b/templates/exports/case_report_template.docx
@@ -1135,16 +1135,87 @@
   <w:p>
     <w:pPr>
       <w:pStyle w:val="Footer"/>
-      <w:jc w:val="right"/>
-    </w:pPr>
+      <w:jc w:val="center"/>
+    </w:pPr>
+    <w:r>
+      <w:rPr>
+        <w:rFonts w:ascii="Calibri" w:hAnsi="Calibri"/>
+        <w:b/>
+        <w:color w:val="475569"/>
+        <w:sz w:val="20"/>
+      </w:rPr>
+      <w:t>{{ attorney_name }}</w:t>
+    </w:r>
+    <w:r>
+      <w:rPr>
+        <w:rFonts w:ascii="Calibri" w:hAnsi="Calibri"/>
+        <w:color w:val="CBD5E1"/>
+        <w:sz w:val="20"/>
+      </w:rPr>
+      <w:t xml:space="preserve">  |  </w:t>
+    </w:r>
     <w:r>
       <w:rPr>
         <w:rFonts w:ascii="Calibri" w:hAnsi="Calibri"/>
         <w:color w:val="94A3B8"/>
-        <w:sz w:val="24"/>
+        <w:sz w:val="20"/>
+      </w:rPr>
+      <w:t>{{ creation_date }}</w:t>
+    </w:r>
+    <w:r>
+      <w:rPr>
+        <w:rFonts w:ascii="Calibri" w:hAnsi="Calibri"/>
+        <w:color w:val="CBD5E1"/>
+        <w:sz w:val="20"/>
+      </w:rPr>
+      <w:t xml:space="preserve">    ·    </w:t>
+    </w:r>
+    <w:r>
+      <w:rPr>
+        <w:rFonts w:ascii="Calibri" w:hAnsi="Calibri"/>
+        <w:color w:val="94A3B8"/>
+        <w:sz w:val="20"/>
+      </w:rPr>
+      <w:t xml:space="preserve">Page </w:t>
+    </w:r>
+    <w:r>
+      <w:rPr>
+        <w:rFonts w:ascii="Calibri" w:hAnsi="Calibri"/>
+        <w:color w:val="94A3B8"/>
+        <w:sz w:val="20"/>
       </w:rPr>
       <w:fldChar w:fldCharType="begin"/>
+    </w:r>
+    <w:r>
+      <w:rPr>
+        <w:rFonts w:ascii="Calibri" w:hAnsi="Calibri"/>
+        <w:color w:val="94A3B8"/>
+        <w:sz w:val="20"/>
+      </w:rPr>
       <w:instrText xml:space="preserve"> PAGE </w:instrText>
+    </w:r>
+    <w:r>
+      <w:rPr>
+        <w:rFonts w:ascii="Calibri" w:hAnsi="Calibri"/>
+        <w:color w:val="94A3B8"/>
+        <w:sz w:val="20"/>
+      </w:rPr>
+      <w:fldChar w:fldCharType="separate"/>
+    </w:r>
+    <w:r>
+      <w:rPr>
+        <w:rFonts w:ascii="Calibri" w:hAnsi="Calibri"/>
+        <w:color w:val="94A3B8"/>
+        <w:sz w:val="20"/>
+      </w:rPr>
+      <w:t>1</w:t>
+    </w:r>
+    <w:r>
+      <w:rPr>
+        <w:rFonts w:ascii="Calibri" w:hAnsi="Calibri"/>
+        <w:color w:val="94A3B8"/>
+        <w:sz w:val="20"/>
+      </w:rPr>
       <w:fldChar w:fldCharType="end"/>
     </w:r>
   </w:p>
@@ -1166,33 +1237,7 @@
   <w:p>
     <w:pPr>
       <w:pStyle w:val="Header"/>
-      <w:jc w:val="right"/>
-    </w:pPr>
-    <w:r>
-      <w:rPr>
-        <w:rFonts w:ascii="Calibri" w:hAnsi="Calibri"/>
-        <w:b/>
-        <w:color w:val="475569"/>
-        <w:sz w:val="24"/>
-      </w:rPr>
-      <w:t>{{ attorney_name }}</w:t>
-    </w:r>
-    <w:r>
-      <w:rPr>
-        <w:rFonts w:ascii="Calibri" w:hAnsi="Calibri"/>
-        <w:color w:val="94A3B8"/>
-        <w:sz w:val="24"/>
-      </w:rPr>
-      <w:t xml:space="preserve">  |  </w:t>
-    </w:r>
-    <w:r>
-      <w:rPr>
-        <w:rFonts w:ascii="Calibri" w:hAnsi="Calibri"/>
-        <w:color w:val="94A3B8"/>
-        <w:sz w:val="24"/>
-      </w:rPr>
-      <w:t>{{ creation_date }}</w:t>
-    </w:r>
+    </w:pPr>
   </w:p>
 </w:hdr>
 </file>

</xml_diff>

<commit_message>
fix: overhaul DOCX case report — counsel, notes, jurisdiction, clients
- Fix jurisdiction lookup to handle nested format from export route
- Fix notes: use case.notes text field instead of old notes table records
- Fix clients: filter by role_category instead of role name
- Add notes column to export query; rename old notes table to note_records
- Replace single counsel line with grouped role badges (tag + names)
- Move other proceedings below main case info line
- Remove DOI from detail line
- Skip past events unless starred
- Add task status symbols (☐ pending, ◑ active/partial/review, ✗ blocked)
- Update DOCX template: counsel loop, notes string, other_proceedings placement
- Apply same jurisdiction and client fixes to PDF generator

Co-Authored-By: Claude Opus 4.6 <noreply@anthropic.com>
</commit_message>
<xml_diff>
--- a/templates/exports/case_report_template.docx
+++ b/templates/exports/case_report_template.docx
@@ -341,6 +341,44 @@
           <w:color w:val="FFFFFF"/>
           <w:sz w:val="24"/>
         </w:rPr>
+        <w:t>{% if case.has_other_proceedings %}</w:t>
+      </w:r>
+    </w:p>
+    <w:p>
+      <w:pPr>
+        <w:spacing w:before="0" w:after="0"/>
+      </w:pPr>
+      <w:r>
+        <w:rPr>
+          <w:rFonts w:ascii="Calibri" w:hAnsi="Calibri"/>
+          <w:sz w:val="24"/>
+        </w:rPr>
+        <w:t>{{r case.other_proceedings_rt }}</w:t>
+      </w:r>
+    </w:p>
+    <w:p>
+      <w:pPr>
+        <w:spacing w:before="0" w:after="0" w:line="1" w:lineRule="exact"/>
+      </w:pPr>
+      <w:r>
+        <w:rPr>
+          <w:rFonts w:ascii="Calibri" w:hAnsi="Calibri"/>
+          <w:color w:val="FFFFFF"/>
+          <w:sz w:val="24"/>
+        </w:rPr>
+        <w:t>{% endif %}</w:t>
+      </w:r>
+    </w:p>
+    <w:p>
+      <w:pPr>
+        <w:spacing w:before="0" w:after="0" w:line="1" w:lineRule="exact"/>
+      </w:pPr>
+      <w:r>
+        <w:rPr>
+          <w:rFonts w:ascii="Calibri" w:hAnsi="Calibri"/>
+          <w:color w:val="FFFFFF"/>
+          <w:sz w:val="24"/>
+        </w:rPr>
         <w:t>{% if case.has_detail %}</w:t>
       </w:r>
     </w:p>
@@ -384,14 +422,40 @@
     </w:p>
     <w:p>
       <w:pPr>
-        <w:spacing w:before="0" w:after="0"/>
+        <w:spacing w:before="0" w:after="0" w:line="1" w:lineRule="exact"/>
+      </w:pPr>
+      <w:r>
+        <w:rPr>
+          <w:rFonts w:ascii="Calibri" w:hAnsi="Calibri"/>
+          <w:color w:val="FFFFFF"/>
+          <w:sz w:val="24"/>
+        </w:rPr>
+        <w:t>{% for ci in case.counsel_items %}</w:t>
+      </w:r>
+    </w:p>
+    <w:p>
+      <w:pPr>
+        <w:spacing w:before="40" w:after="40"/>
       </w:pPr>
       <w:r>
         <w:rPr>
           <w:rFonts w:ascii="Calibri" w:hAnsi="Calibri"/>
           <w:sz w:val="24"/>
         </w:rPr>
-        <w:t>{{r case.counsel_rt }}</w:t>
+        <w:t>{{r ci.rt }}</w:t>
+      </w:r>
+    </w:p>
+    <w:p>
+      <w:pPr>
+        <w:spacing w:before="0" w:after="0" w:line="1" w:lineRule="exact"/>
+      </w:pPr>
+      <w:r>
+        <w:rPr>
+          <w:rFonts w:ascii="Calibri" w:hAnsi="Calibri"/>
+          <w:color w:val="FFFFFF"/>
+          <w:sz w:val="24"/>
+        </w:rPr>
+        <w:t>{% endfor %}</w:t>
       </w:r>
     </w:p>
     <w:p>
@@ -436,54 +500,6 @@
           <w:sz w:val="24"/>
         </w:rPr>
         <w:t>{{ case.summary }}</w:t>
-      </w:r>
-    </w:p>
-    <w:p>
-      <w:pPr>
-        <w:spacing w:before="0" w:after="0" w:line="1" w:lineRule="exact"/>
-      </w:pPr>
-      <w:r>
-        <w:rPr>
-          <w:rFonts w:ascii="Calibri" w:hAnsi="Calibri"/>
-          <w:color w:val="FFFFFF"/>
-          <w:sz w:val="24"/>
-        </w:rPr>
-        <w:t>{% endif %}</w:t>
-      </w:r>
-    </w:p>
-    <w:p>
-      <w:pPr>
-        <w:spacing w:before="0" w:after="0" w:line="1" w:lineRule="exact"/>
-      </w:pPr>
-      <w:r>
-        <w:rPr>
-          <w:rFonts w:ascii="Calibri" w:hAnsi="Calibri"/>
-          <w:color w:val="FFFFFF"/>
-          <w:sz w:val="24"/>
-        </w:rPr>
-        <w:t>{% if case.other_proceedings %}</w:t>
-      </w:r>
-    </w:p>
-    <w:p>
-      <w:pPr>
-        <w:spacing w:before="20" w:after="20"/>
-      </w:pPr>
-      <w:r>
-        <w:rPr>
-          <w:rFonts w:ascii="Calibri" w:hAnsi="Calibri"/>
-          <w:b/>
-          <w:color w:val="0F172A"/>
-          <w:sz w:val="24"/>
-        </w:rPr>
-        <w:t xml:space="preserve">Other Proceedings: </w:t>
-      </w:r>
-      <w:r>
-        <w:rPr>
-          <w:rFonts w:ascii="Consolas" w:hAnsi="Consolas"/>
-          <w:color w:val="475569"/>
-          <w:sz w:val="24"/>
-        </w:rPr>
-        <w:t>{{ case.other_proceedings }}</w:t>
       </w:r>
     </w:p>
     <w:p>
@@ -1034,7 +1050,7 @@
           <w:color w:val="FFFFFF"/>
           <w:sz w:val="24"/>
         </w:rPr>
-        <w:t>{% for note in case.notes %}</w:t>
+        <w:t/>
       </w:r>
     </w:p>
     <w:p>
@@ -1048,7 +1064,7 @@
           <w:color w:val="94A3B8"/>
           <w:sz w:val="24"/>
         </w:rPr>
-        <w:t>{{ note.date }}</w:t>
+        <w:t/>
       </w:r>
     </w:p>
     <w:p>
@@ -1061,7 +1077,7 @@
           <w:color w:val="475569"/>
           <w:sz w:val="24"/>
         </w:rPr>
-        <w:t>{{ note.content }}</w:t>
+        <w:t>{{ case.notes }}</w:t>
       </w:r>
     </w:p>
     <w:p>
@@ -1074,7 +1090,7 @@
           <w:color w:val="FFFFFF"/>
           <w:sz w:val="24"/>
         </w:rPr>
-        <w:t>{% endfor %}</w:t>
+        <w:t/>
       </w:r>
     </w:p>
     <w:p>

</xml_diff>